<commit_message>
Add: aggiunti i test cases specification
</commit_message>
<xml_diff>
--- a/Workspace/Testing/Test plan/TestPlan_EWMS.docx
+++ b/Workspace/Testing/Test plan/TestPlan_EWMS.docx
@@ -143,7 +143,6 @@
           <w:lang w:val="en-GB"/>
         </w:rPr>
         <w:br/>
-        <w:t>Versi</w:t>
       </w:r>
       <w:proofErr w:type="spellStart"/>
       <w:r>
@@ -153,7 +152,7 @@
           <w:sz w:val="36"/>
           <w:lang w:val="en-GB"/>
         </w:rPr>
-        <w:t>one</w:t>
+        <w:t>Versione</w:t>
       </w:r>
       <w:proofErr w:type="spellEnd"/>
       <w:r>
@@ -1823,31 +1822,16 @@
       </w:pPr>
     </w:p>
     <w:p>
-      <w:r>
-        <w:fldChar w:fldCharType="begin"/>
-      </w:r>
-      <w:r>
-        <w:instrText xml:space="preserve"> TOC \o "1-3" \h \z \u </w:instrText>
-      </w:r>
-      <w:r>
-        <w:fldChar w:fldCharType="separate"/>
-      </w:r>
-      <w:r>
-        <w:rPr>
-          <w:b/>
-          <w:bCs/>
-          <w:noProof/>
-        </w:rPr>
-        <w:t>Nessuna voce di sommario trovata.</w:t>
-      </w:r>
-      <w:r>
-        <w:rPr>
-          <w:b/>
-          <w:bCs/>
-          <w:noProof/>
-        </w:rPr>
-        <w:fldChar w:fldCharType="end"/>
-      </w:r>
+      <w:fldSimple w:instr=" TOC \o &quot;1-3&quot; \h \z \u ">
+        <w:r>
+          <w:rPr>
+            <w:b/>
+            <w:bCs/>
+            <w:noProof/>
+          </w:rPr>
+          <w:t>Nessuna voce di sommario trovata.</w:t>
+        </w:r>
+      </w:fldSimple>
     </w:p>
     <w:p>
       <w:pPr>
@@ -2244,13 +2228,8 @@
             <w:pPr>
               <w:spacing w:after="160" w:line="259" w:lineRule="auto"/>
             </w:pPr>
-            <w:proofErr w:type="spellStart"/>
-            <w:r>
-              <w:t>Null</w:t>
-            </w:r>
-            <w:proofErr w:type="spellEnd"/>
-            <w:r>
-              <w:t xml:space="preserve"> o vuoto</w:t>
+            <w:r>
+              <w:t>Null o vuoto</w:t>
             </w:r>
           </w:p>
         </w:tc>
@@ -2387,13 +2366,8 @@
             <w:pPr>
               <w:spacing w:after="160" w:line="259" w:lineRule="auto"/>
             </w:pPr>
-            <w:proofErr w:type="spellStart"/>
-            <w:r>
-              <w:t>Null</w:t>
-            </w:r>
-            <w:proofErr w:type="spellEnd"/>
-            <w:r>
-              <w:t xml:space="preserve"> o vuota</w:t>
+            <w:r>
+              <w:t>Null o vuota</w:t>
             </w:r>
           </w:p>
         </w:tc>
@@ -3011,7 +2985,6 @@
             <w:pPr>
               <w:spacing w:after="160" w:line="259" w:lineRule="auto"/>
             </w:pPr>
-            <w:proofErr w:type="spellStart"/>
             <w:r>
               <w:rPr>
                 <w:b/>
@@ -3019,7 +2992,6 @@
               </w:rPr>
               <w:t>Null</w:t>
             </w:r>
-            <w:proofErr w:type="spellEnd"/>
           </w:p>
         </w:tc>
         <w:tc>
@@ -3102,7 +3074,6 @@
             <w:pPr>
               <w:spacing w:after="160" w:line="259" w:lineRule="auto"/>
             </w:pPr>
-            <w:proofErr w:type="spellStart"/>
             <w:r>
               <w:rPr>
                 <w:b/>
@@ -3110,7 +3081,6 @@
               </w:rPr>
               <w:t>Null</w:t>
             </w:r>
-            <w:proofErr w:type="spellEnd"/>
           </w:p>
         </w:tc>
         <w:tc>
@@ -3344,13 +3314,8 @@
           </w:p>
           <w:p/>
           <w:p>
-            <w:proofErr w:type="spellStart"/>
-            <w:r>
-              <w:t>Null</w:t>
-            </w:r>
-            <w:proofErr w:type="spellEnd"/>
-            <w:r>
-              <w:t xml:space="preserve"> o vuota</w:t>
+            <w:r>
+              <w:t>Null o vuota</w:t>
             </w:r>
           </w:p>
         </w:tc>
@@ -3432,13 +3397,8 @@
           </w:p>
           <w:p/>
           <w:p>
-            <w:proofErr w:type="spellStart"/>
-            <w:r>
-              <w:t>Null</w:t>
-            </w:r>
-            <w:proofErr w:type="spellEnd"/>
-            <w:r>
-              <w:t xml:space="preserve"> o vuota</w:t>
+            <w:r>
+              <w:t>Null o vuota</w:t>
             </w:r>
           </w:p>
         </w:tc>
@@ -6751,13 +6711,8 @@
           </w:p>
           <w:p/>
           <w:p>
-            <w:proofErr w:type="spellStart"/>
-            <w:r>
-              <w:t>Null</w:t>
-            </w:r>
-            <w:proofErr w:type="spellEnd"/>
-            <w:r>
-              <w:t xml:space="preserve"> o vuota</w:t>
+            <w:r>
+              <w:t>Null o vuota</w:t>
             </w:r>
           </w:p>
         </w:tc>
@@ -7485,7 +7440,6 @@
             <w:pPr>
               <w:spacing w:after="160" w:line="259" w:lineRule="auto"/>
             </w:pPr>
-            <w:proofErr w:type="spellStart"/>
             <w:r>
               <w:rPr>
                 <w:b/>
@@ -7493,7 +7447,6 @@
               </w:rPr>
               <w:t>Null</w:t>
             </w:r>
-            <w:proofErr w:type="spellEnd"/>
           </w:p>
         </w:tc>
         <w:tc>
@@ -8342,10 +8295,7 @@
           <w:p>
             <w:proofErr w:type="gramStart"/>
             <w:r>
-              <w:t>E</w:t>
-            </w:r>
-            <w:r>
-              <w:t>mail</w:t>
+              <w:t>Email</w:t>
             </w:r>
             <w:proofErr w:type="gramEnd"/>
           </w:p>
@@ -8371,10 +8321,7 @@
           </w:tcPr>
           <w:p>
             <w:r>
-              <w:t xml:space="preserve">Data di </w:t>
-            </w:r>
-            <w:r>
-              <w:t>nascita</w:t>
+              <w:t>Data di nascita</w:t>
             </w:r>
           </w:p>
         </w:tc>
@@ -8384,8 +8331,61 @@
           </w:tcPr>
           <w:p>
             <w:r>
-              <w:t>^\d{4}-(0[1-9]|1[0-2])-(0[1-9]|[12][0-9]|3[01])$</w:t>
-            </w:r>
+              <w:t>^\</w:t>
+            </w:r>
+            <w:proofErr w:type="gramStart"/>
+            <w:r>
+              <w:t>d{4}-(</w:t>
+            </w:r>
+            <w:proofErr w:type="gramEnd"/>
+            <w:r>
+              <w:t>0[1-</w:t>
+            </w:r>
+            <w:proofErr w:type="gramStart"/>
+            <w:r>
+              <w:t>9]|</w:t>
+            </w:r>
+            <w:proofErr w:type="gramEnd"/>
+            <w:r>
+              <w:t>1[0-2</w:t>
+            </w:r>
+            <w:proofErr w:type="gramStart"/>
+            <w:r>
+              <w:t>])-(</w:t>
+            </w:r>
+            <w:proofErr w:type="gramEnd"/>
+            <w:r>
+              <w:t>0[1-</w:t>
+            </w:r>
+            <w:proofErr w:type="gramStart"/>
+            <w:r>
+              <w:t>9]|</w:t>
+            </w:r>
+            <w:proofErr w:type="gramEnd"/>
+            <w:r>
+              <w:t>[</w:t>
+            </w:r>
+            <w:proofErr w:type="gramStart"/>
+            <w:r>
+              <w:t>12][</w:t>
+            </w:r>
+            <w:proofErr w:type="gramEnd"/>
+            <w:r>
+              <w:t>0-</w:t>
+            </w:r>
+            <w:proofErr w:type="gramStart"/>
+            <w:r>
+              <w:t>9]|</w:t>
+            </w:r>
+            <w:proofErr w:type="gramEnd"/>
+            <w:r>
+              <w:t>3[01</w:t>
+            </w:r>
+            <w:proofErr w:type="gramStart"/>
+            <w:r>
+              <w:t>])$</w:t>
+            </w:r>
+            <w:proofErr w:type="gramEnd"/>
             <w:r>
               <w:t xml:space="preserve"> (formatto YYYY-MM-DD)</w:t>
             </w:r>
@@ -9378,7 +9378,13 @@
             </w:r>
             <w:proofErr w:type="spellEnd"/>
             <w:r>
-              <w:t xml:space="preserve">: "Il formato e-mail non valido" </w:t>
+              <w:t xml:space="preserve">: "Il formato e-mail non </w:t>
+            </w:r>
+            <w:r>
+              <w:t xml:space="preserve">è </w:t>
+            </w:r>
+            <w:r>
+              <w:t xml:space="preserve">valido" </w:t>
             </w:r>
           </w:p>
         </w:tc>
@@ -9483,13 +9489,7 @@
               <w:spacing w:after="160" w:line="259" w:lineRule="auto"/>
             </w:pPr>
             <w:r>
-              <w:t>G</w:t>
-            </w:r>
-            <w:r>
-              <w:t>enerat</w:t>
-            </w:r>
-            <w:r>
-              <w:t>a</w:t>
+              <w:t>Vuota</w:t>
             </w:r>
           </w:p>
         </w:tc>
@@ -11699,6 +11699,7 @@
   <w:style w:type="character" w:default="1" w:styleId="Carpredefinitoparagrafo">
     <w:name w:val="Default Paragraph Font"/>
     <w:uiPriority w:val="1"/>
+    <w:semiHidden/>
     <w:unhideWhenUsed/>
   </w:style>
   <w:style w:type="table" w:default="1" w:styleId="Tabellanormale">

</xml_diff>

<commit_message>
add: aggiunto il file TestPlan_EWMS nella cartella Deliverables
</commit_message>
<xml_diff>
--- a/Workspace/Testing/Test plan/TestPlan_EWMS.docx
+++ b/Workspace/Testing/Test plan/TestPlan_EWMS.docx
@@ -143,26 +143,7 @@
           <w:lang w:val="en-GB"/>
         </w:rPr>
         <w:br/>
-      </w:r>
-      <w:proofErr w:type="spellStart"/>
-      <w:r>
-        <w:rPr>
-          <w:rFonts w:ascii="Arial" w:hAnsi="Arial"/>
-          <w:b/>
-          <w:sz w:val="36"/>
-          <w:lang w:val="en-GB"/>
-        </w:rPr>
-        <w:t>Versione</w:t>
-      </w:r>
-      <w:proofErr w:type="spellEnd"/>
-      <w:r>
-        <w:rPr>
-          <w:rFonts w:ascii="Arial" w:hAnsi="Arial"/>
-          <w:b/>
-          <w:sz w:val="36"/>
-          <w:lang w:val="en-GB"/>
-        </w:rPr>
-        <w:t xml:space="preserve"> </w:t>
+        <w:t xml:space="preserve">Versione </w:t>
       </w:r>
       <w:r>
         <w:rPr>
@@ -1032,23 +1013,13 @@
           <w:sz w:val="32"/>
         </w:rPr>
       </w:pPr>
-      <w:proofErr w:type="spellStart"/>
       <w:r>
         <w:rPr>
           <w:rFonts w:cs="Times New Roman"/>
           <w:b/>
           <w:sz w:val="32"/>
         </w:rPr>
-        <w:t>Revision</w:t>
-      </w:r>
-      <w:proofErr w:type="spellEnd"/>
-      <w:r>
-        <w:rPr>
-          <w:rFonts w:cs="Times New Roman"/>
-          <w:b/>
-          <w:sz w:val="32"/>
-        </w:rPr>
-        <w:t xml:space="preserve"> History</w:t>
+        <w:t>Revision History</w:t>
       </w:r>
       <w:r>
         <w:rPr>
@@ -1362,16 +1333,8 @@
               <w:rPr>
                 <w:sz w:val="20"/>
               </w:rPr>
-              <w:t xml:space="preserve">Sono stati aggiunti tutti i punti previsti, si prevede l’aggiunta di nuovi test </w:t>
-            </w:r>
-            <w:proofErr w:type="spellStart"/>
-            <w:r>
-              <w:rPr>
-                <w:sz w:val="20"/>
-              </w:rPr>
-              <w:t>cases</w:t>
-            </w:r>
-            <w:proofErr w:type="spellEnd"/>
+              <w:t>Sono stati aggiunti tutti i punti previsti, si prevede l’aggiunta di nuovi test cases</w:t>
+            </w:r>
           </w:p>
         </w:tc>
         <w:tc>
@@ -3148,39 +3111,7 @@
         <w:t>Questo documento ha l’obiettivo di definire la strategia di testing e le specifiche di validazione per la piattaforma Easy Work Management System (E.W.M.S.).</w:t>
       </w:r>
       <w:r>
-        <w:t xml:space="preserve"> In questo documento saranno presentate le strategie per il testing per il sistema. Saranno esplorate le tecniche che </w:t>
-      </w:r>
-      <w:proofErr w:type="gramStart"/>
-      <w:r>
-        <w:t>il team</w:t>
-      </w:r>
-      <w:proofErr w:type="gramEnd"/>
-      <w:r>
-        <w:t xml:space="preserve"> applicherà per effettuare </w:t>
-      </w:r>
-      <w:proofErr w:type="spellStart"/>
-      <w:r>
-        <w:t>unit</w:t>
-      </w:r>
-      <w:proofErr w:type="spellEnd"/>
-      <w:r>
-        <w:t xml:space="preserve"> testing, </w:t>
-      </w:r>
-      <w:proofErr w:type="spellStart"/>
-      <w:r>
-        <w:t>integration</w:t>
-      </w:r>
-      <w:proofErr w:type="spellEnd"/>
-      <w:r>
-        <w:t xml:space="preserve"> testing e system testing. In particolare, saranno elencati i test </w:t>
-      </w:r>
-      <w:proofErr w:type="spellStart"/>
-      <w:r>
-        <w:t>cases</w:t>
-      </w:r>
-      <w:proofErr w:type="spellEnd"/>
-      <w:r>
-        <w:t xml:space="preserve"> per le funzionalità critiche del sistema.</w:t>
+        <w:t xml:space="preserve"> In questo documento saranno presentate le strategie per il testing per il sistema. Saranno esplorate le tecniche che il team applicherà per effettuare unit testing, integration testing e system testing. In particolare, saranno elencati i test cases per le funzionalità critiche del sistema.</w:t>
       </w:r>
     </w:p>
     <w:p>
@@ -3216,31 +3147,13 @@
           <w:numId w:val="9"/>
         </w:numPr>
       </w:pPr>
-      <w:proofErr w:type="spellStart"/>
       <w:r>
         <w:rPr>
           <w:b/>
           <w:bCs/>
         </w:rPr>
-        <w:t>Requirement</w:t>
-      </w:r>
-      <w:proofErr w:type="spellEnd"/>
-      <w:r>
-        <w:rPr>
-          <w:b/>
-          <w:bCs/>
-        </w:rPr>
-        <w:t xml:space="preserve"> Analysis </w:t>
-      </w:r>
-      <w:proofErr w:type="spellStart"/>
-      <w:r>
-        <w:rPr>
-          <w:b/>
-          <w:bCs/>
-        </w:rPr>
-        <w:t>Document</w:t>
-      </w:r>
-      <w:proofErr w:type="spellEnd"/>
+        <w:t>Requirement Analysis Document</w:t>
+      </w:r>
       <w:r>
         <w:t>: tale relazione si f</w:t>
       </w:r>
@@ -3264,17 +3177,8 @@
           <w:b/>
           <w:bCs/>
         </w:rPr>
-        <w:t xml:space="preserve">System Design </w:t>
-      </w:r>
-      <w:proofErr w:type="spellStart"/>
-      <w:r>
-        <w:rPr>
-          <w:b/>
-          <w:bCs/>
-        </w:rPr>
-        <w:t>Document</w:t>
-      </w:r>
-      <w:proofErr w:type="spellEnd"/>
+        <w:t>System Design Document</w:t>
+      </w:r>
       <w:r>
         <w:t>: tale relazione si fonda sulla suddivisione in sottosistemi del sistema EWMS, grazie a questo documento è stato possibile individuare correttamente i sottosistemi che partecipano ai test case descritti in questo documento.</w:t>
       </w:r>
@@ -3295,17 +3199,8 @@
           <w:b/>
           <w:bCs/>
         </w:rPr>
-        <w:t xml:space="preserve">Object Design </w:t>
-      </w:r>
-      <w:proofErr w:type="spellStart"/>
-      <w:r>
-        <w:rPr>
-          <w:b/>
-          <w:bCs/>
-        </w:rPr>
-        <w:t>Document</w:t>
-      </w:r>
-      <w:proofErr w:type="spellEnd"/>
+        <w:t>Object Design Document</w:t>
+      </w:r>
       <w:r>
         <w:t>: tale relazione è</w:t>
       </w:r>
@@ -3326,56 +3221,19 @@
       </w:pPr>
       <w:bookmarkStart w:id="2" w:name="_Toc217148113"/>
       <w:r>
-        <w:t xml:space="preserve">System </w:t>
-      </w:r>
-      <w:proofErr w:type="spellStart"/>
-      <w:r>
-        <w:t>overview</w:t>
+        <w:t>System overview</w:t>
       </w:r>
       <w:bookmarkEnd w:id="2"/>
-      <w:proofErr w:type="spellEnd"/>
     </w:p>
     <w:p>
       <w:r>
         <w:t xml:space="preserve">L’applicazione E.W.M.S. è </w:t>
       </w:r>
       <w:r>
-        <w:t xml:space="preserve">una web </w:t>
-      </w:r>
-      <w:proofErr w:type="spellStart"/>
-      <w:r>
-        <w:t>application</w:t>
-      </w:r>
-      <w:proofErr w:type="spellEnd"/>
-      <w:r>
-        <w:t xml:space="preserve"> </w:t>
-      </w:r>
-      <w:r>
-        <w:t xml:space="preserve">basata su una </w:t>
-      </w:r>
-      <w:proofErr w:type="spellStart"/>
-      <w:r>
-        <w:t>three-tier</w:t>
-      </w:r>
-      <w:proofErr w:type="spellEnd"/>
-      <w:r>
-        <w:t xml:space="preserve"> </w:t>
-      </w:r>
-      <w:proofErr w:type="spellStart"/>
-      <w:r>
-        <w:t>architecture</w:t>
-      </w:r>
-      <w:proofErr w:type="spellEnd"/>
-      <w:r>
-        <w:t xml:space="preserve">, come descritto nel System Design </w:t>
-      </w:r>
-      <w:proofErr w:type="spellStart"/>
-      <w:r>
-        <w:t>Document</w:t>
-      </w:r>
-      <w:proofErr w:type="spellEnd"/>
-      <w:r>
-        <w:t>. Questa struttura consente una netta separazione delle responsabilità, facilitando la decomposizione gerarchica necessaria per il testing modulare:</w:t>
+        <w:t xml:space="preserve">una web application </w:t>
+      </w:r>
+      <w:r>
+        <w:t>basata su una three-tier architecture, come descritto nel System Design Document. Questa struttura consente una netta separazione delle responsabilità, facilitando la decomposizione gerarchica necessaria per il testing modulare:</w:t>
       </w:r>
     </w:p>
     <w:p>
@@ -3412,15 +3270,7 @@
         <w:t>Application</w:t>
       </w:r>
       <w:r>
-        <w:t xml:space="preserve"> Layer: Rappresenta il nucleo dell’applicazione dove risiede la business </w:t>
-      </w:r>
-      <w:proofErr w:type="spellStart"/>
-      <w:r>
-        <w:t>logic</w:t>
-      </w:r>
-      <w:proofErr w:type="spellEnd"/>
-      <w:r>
-        <w:t>. In questo livello, i vari service elaborano le richieste e applicano i vincoli definiti nel RAD.</w:t>
+        <w:t xml:space="preserve"> Layer: Rappresenta il nucleo dell’applicazione dove risiede la business logic. In questo livello, i vari service elaborano le richieste e applicano i vincoli definiti nel RAD.</w:t>
       </w:r>
     </w:p>
     <w:p>
@@ -3432,15 +3282,7 @@
       </w:pPr>
       <w:r>
         <w:lastRenderedPageBreak/>
-        <w:t xml:space="preserve">Data Layer: Responsabile della </w:t>
-      </w:r>
-      <w:proofErr w:type="spellStart"/>
-      <w:r>
-        <w:t>persistence</w:t>
-      </w:r>
-      <w:proofErr w:type="spellEnd"/>
-      <w:r>
-        <w:t xml:space="preserve"> dei dati, interagisce con il database relazionale. Utilizza il pattern DAO (Data Access Object) per garantire l'integrità delle informazioni durante i processi di lettura e scrittura.</w:t>
+        <w:t>Data Layer: Responsabile della persistence dei dati, interagisce con il database relazionale. Utilizza il pattern DAO (Data Access Object) per garantire l'integrità delle informazioni durante i processi di lettura e scrittura.</w:t>
       </w:r>
     </w:p>
     <w:p>
@@ -3467,79 +3309,7 @@
     <w:p/>
     <w:p>
       <w:r>
-        <w:t xml:space="preserve">In questa sezione viene riportata l’applicazione sistematica del metodo </w:t>
-      </w:r>
-      <w:proofErr w:type="spellStart"/>
-      <w:r>
-        <w:t>category</w:t>
-      </w:r>
-      <w:proofErr w:type="spellEnd"/>
-      <w:r>
-        <w:t xml:space="preserve"> </w:t>
-      </w:r>
-      <w:proofErr w:type="spellStart"/>
-      <w:r>
-        <w:t>partition</w:t>
-      </w:r>
-      <w:proofErr w:type="spellEnd"/>
-      <w:r>
-        <w:t xml:space="preserve"> per le principali funzionalità del sistema E.W.M.S., identificate come critiche nel </w:t>
-      </w:r>
-      <w:proofErr w:type="spellStart"/>
-      <w:r>
-        <w:t>Requirement</w:t>
-      </w:r>
-      <w:proofErr w:type="spellEnd"/>
-      <w:r>
-        <w:t xml:space="preserve"> Analysis </w:t>
-      </w:r>
-      <w:proofErr w:type="spellStart"/>
-      <w:r>
-        <w:t>Document</w:t>
-      </w:r>
-      <w:proofErr w:type="spellEnd"/>
-      <w:r>
-        <w:t xml:space="preserve">. L'obiettivo è trasformare i </w:t>
-      </w:r>
-      <w:proofErr w:type="spellStart"/>
-      <w:r>
-        <w:t>functional</w:t>
-      </w:r>
-      <w:proofErr w:type="spellEnd"/>
-      <w:r>
-        <w:t xml:space="preserve"> </w:t>
-      </w:r>
-      <w:proofErr w:type="spellStart"/>
-      <w:r>
-        <w:t>requirements</w:t>
-      </w:r>
-      <w:proofErr w:type="spellEnd"/>
-      <w:r>
-        <w:t xml:space="preserve"> in una serie di test frames che garantiscano una copertura esaustiva degli scenari di utilizzo, dei casi di </w:t>
-      </w:r>
-      <w:proofErr w:type="spellStart"/>
-      <w:r>
-        <w:t>error</w:t>
-      </w:r>
-      <w:proofErr w:type="spellEnd"/>
-      <w:r>
-        <w:t xml:space="preserve"> e dei </w:t>
-      </w:r>
-      <w:proofErr w:type="spellStart"/>
-      <w:r>
-        <w:t>boundary</w:t>
-      </w:r>
-      <w:proofErr w:type="spellEnd"/>
-      <w:r>
-        <w:t xml:space="preserve"> </w:t>
-      </w:r>
-      <w:proofErr w:type="spellStart"/>
-      <w:r>
-        <w:t>values</w:t>
-      </w:r>
-      <w:proofErr w:type="spellEnd"/>
-      <w:r>
-        <w:t>.</w:t>
+        <w:t>In questa sezione viene riportata l’applicazione sistematica del metodo category partition per le principali funzionalità del sistema E.W.M.S., identificate come critiche nel Requirement Analysis Document. L'obiettivo è trasformare i functional requirements in una serie di test frames che garantiscano una copertura esaustiva degli scenari di utilizzo, dei casi di error e dei boundary values.</w:t>
       </w:r>
       <w:r>
         <w:t xml:space="preserve"> Le funzionalità che sono state scelte per avere un testing più approfondito sono:</w:t>
@@ -3609,23 +3379,7 @@
     <w:p/>
     <w:p>
       <w:r>
-        <w:t xml:space="preserve">Il sistema presenta diverse altre funzionalità, le quali però hanno un’interazione leggera con gli attori del sistema o hanno un funzionamento molto simile alle funzionalità testate, la loro fase di testing quindi si condurrà principalmente all’interno di </w:t>
-      </w:r>
-      <w:proofErr w:type="spellStart"/>
-      <w:r>
-        <w:t>unit</w:t>
-      </w:r>
-      <w:proofErr w:type="spellEnd"/>
-      <w:r>
-        <w:t xml:space="preserve"> e </w:t>
-      </w:r>
-      <w:proofErr w:type="spellStart"/>
-      <w:r>
-        <w:t>integration</w:t>
-      </w:r>
-      <w:proofErr w:type="spellEnd"/>
-      <w:r>
-        <w:t xml:space="preserve"> testing. </w:t>
+        <w:t xml:space="preserve">Il sistema presenta diverse altre funzionalità, le quali però hanno un’interazione leggera con gli attori del sistema o hanno un funzionamento molto simile alle funzionalità testate, la loro fase di testing quindi si condurrà principalmente all’interno di unit e integration testing. </w:t>
       </w:r>
     </w:p>
     <w:p/>
@@ -3647,64 +3401,19 @@
       <w:bookmarkStart w:id="4" w:name="_Toc217148115"/>
       <w:r>
         <w:lastRenderedPageBreak/>
-        <w:t>Pass/</w:t>
-      </w:r>
-      <w:proofErr w:type="spellStart"/>
-      <w:r>
-        <w:t>Fail</w:t>
-      </w:r>
-      <w:proofErr w:type="spellEnd"/>
-      <w:r>
-        <w:t xml:space="preserve"> </w:t>
-      </w:r>
-      <w:proofErr w:type="spellStart"/>
-      <w:r>
-        <w:t>criteria</w:t>
+        <w:t>Pass/Fail criteria</w:t>
       </w:r>
       <w:bookmarkEnd w:id="4"/>
-      <w:proofErr w:type="spellEnd"/>
     </w:p>
     <w:p>
       <w:r>
-        <w:t xml:space="preserve">In questa sezione vengono definiti i criteri oggettivi per determinare l’esito delle attività di testing condotte sul sistema </w:t>
-      </w:r>
-      <w:proofErr w:type="gramStart"/>
-      <w:r>
-        <w:t>E.W.M.S</w:t>
+        <w:t>In questa sezione vengono definiti i criteri oggettivi per determinare l’esito delle attività di testing condotte sul sistema E.W.M.S</w:t>
       </w:r>
       <w:r>
         <w:t>.</w:t>
       </w:r>
       <w:r>
-        <w:t>.</w:t>
-      </w:r>
-      <w:proofErr w:type="gramEnd"/>
-      <w:r>
-        <w:t xml:space="preserve"> La valutazione si basa sulla coerenza tra il comportamento osservato dell'applicazione e le specifiche tecniche formalizzate nel </w:t>
-      </w:r>
-      <w:proofErr w:type="spellStart"/>
-      <w:r>
-        <w:t>Requirement</w:t>
-      </w:r>
-      <w:proofErr w:type="spellEnd"/>
-      <w:r>
-        <w:t xml:space="preserve"> Analysis </w:t>
-      </w:r>
-      <w:proofErr w:type="spellStart"/>
-      <w:r>
-        <w:t>Document</w:t>
-      </w:r>
-      <w:proofErr w:type="spellEnd"/>
-      <w:r>
-        <w:t xml:space="preserve"> e nell'Object Design </w:t>
-      </w:r>
-      <w:proofErr w:type="spellStart"/>
-      <w:r>
-        <w:t>Document</w:t>
-      </w:r>
-      <w:proofErr w:type="spellEnd"/>
-      <w:r>
-        <w:t>.</w:t>
+        <w:t>. La valutazione si basa sulla coerenza tra il comportamento osservato dell'applicazione e le specifiche tecniche formalizzate nel Requirement Analysis Document e nell'Object Design Document.</w:t>
       </w:r>
     </w:p>
     <w:p>
@@ -3762,26 +3471,13 @@
         <w:t>Integrità della Logica</w:t>
       </w:r>
       <w:r>
-        <w:t xml:space="preserve">: L’output prodotto </w:t>
-      </w:r>
-      <w:proofErr w:type="spellStart"/>
-      <w:r>
-        <w:t>dal</w:t>
+        <w:t>: L’output prodotto dal</w:t>
       </w:r>
       <w:r>
         <w:t>l’application</w:t>
       </w:r>
-      <w:proofErr w:type="spellEnd"/>
-      <w:r>
-        <w:t xml:space="preserve"> </w:t>
-      </w:r>
-      <w:proofErr w:type="spellStart"/>
-      <w:r>
-        <w:t>layer</w:t>
-      </w:r>
-      <w:proofErr w:type="spellEnd"/>
-      <w:r>
-        <w:t xml:space="preserve"> corrisponde esattamente ai risultati attesi definiti ne</w:t>
+      <w:r>
+        <w:t xml:space="preserve"> layer corrisponde esattamente ai risultati attesi definiti ne</w:t>
       </w:r>
       <w:r>
         <w:t>ll’oracolo del caso di test</w:t>
@@ -3812,15 +3508,7 @@
         <w:t>(</w:t>
       </w:r>
       <w:r>
-        <w:t xml:space="preserve">Ad esempio, la creazione di un task deve generare un nuovo record e il relativo </w:t>
-      </w:r>
-      <w:proofErr w:type="spellStart"/>
-      <w:r>
-        <w:t>path</w:t>
-      </w:r>
-      <w:proofErr w:type="spellEnd"/>
-      <w:r>
-        <w:t xml:space="preserve"> dell'allegato</w:t>
+        <w:t>Ad esempio, la creazione di un task deve generare un nuovo record e il relativo path dell'allegato</w:t>
       </w:r>
       <w:r>
         <w:t xml:space="preserve"> se presente)</w:t>
@@ -3845,15 +3533,7 @@
         <w:t>Feedback dell'Interfaccia</w:t>
       </w:r>
       <w:r>
-        <w:t xml:space="preserve">: La web </w:t>
-      </w:r>
-      <w:proofErr w:type="spellStart"/>
-      <w:r>
-        <w:t>interface</w:t>
-      </w:r>
-      <w:proofErr w:type="spellEnd"/>
-      <w:r>
-        <w:t xml:space="preserve"> mostra il messaggio di conferma o di errore previsto.</w:t>
+        <w:t>: La web interface mostra il messaggio di conferma o di errore previsto.</w:t>
       </w:r>
     </w:p>
     <w:p>
@@ -3933,23 +3613,7 @@
         <w:t>Mancata Validazione</w:t>
       </w:r>
       <w:r>
-        <w:t xml:space="preserve">: Il sistema accetta dati di input che violano i vincoli di </w:t>
-      </w:r>
-      <w:proofErr w:type="spellStart"/>
-      <w:r>
-        <w:t>boundary</w:t>
-      </w:r>
-      <w:proofErr w:type="spellEnd"/>
-      <w:r>
-        <w:t xml:space="preserve"> </w:t>
-      </w:r>
-      <w:proofErr w:type="spellStart"/>
-      <w:r>
-        <w:t>values</w:t>
-      </w:r>
-      <w:proofErr w:type="spellEnd"/>
-      <w:r>
-        <w:t xml:space="preserve"> (es. accettazione di una password troppo corta o di una data di scadenza passata).</w:t>
+        <w:t>: Il sistema accetta dati di input che violano i vincoli di boundary values (es. accettazione di una password troppo corta o di una data di scadenza passata).</w:t>
       </w:r>
       <w:r>
         <w:br/>
@@ -3971,23 +3635,7 @@
         <w:t>Inconsistenza dei Dati</w:t>
       </w:r>
       <w:r>
-        <w:t xml:space="preserve">: L'operazione non viene riportata correttamente nel </w:t>
-      </w:r>
-      <w:proofErr w:type="spellStart"/>
-      <w:r>
-        <w:t>persistence</w:t>
-      </w:r>
-      <w:proofErr w:type="spellEnd"/>
-      <w:r>
-        <w:t xml:space="preserve"> </w:t>
-      </w:r>
-      <w:proofErr w:type="spellStart"/>
-      <w:r>
-        <w:t>layer</w:t>
-      </w:r>
-      <w:proofErr w:type="spellEnd"/>
-      <w:r>
-        <w:t xml:space="preserve"> (es. dati mancanti o errati nel database nonostante un messaggio di successo).</w:t>
+        <w:t>: L'operazione non viene riportata correttamente nel persistence layer (es. dati mancanti o errati nel database nonostante un messaggio di successo).</w:t>
       </w:r>
       <w:r>
         <w:br/>
@@ -4009,31 +3657,7 @@
         <w:t>Eccezioni non Gestite</w:t>
       </w:r>
       <w:r>
-        <w:t xml:space="preserve">: L'esecuzione del test solleva una </w:t>
-      </w:r>
-      <w:proofErr w:type="spellStart"/>
-      <w:r>
-        <w:t>exception</w:t>
-      </w:r>
-      <w:proofErr w:type="spellEnd"/>
-      <w:r>
-        <w:t xml:space="preserve"> non intercettata (es. </w:t>
-      </w:r>
-      <w:proofErr w:type="spellStart"/>
-      <w:r>
-        <w:t>NullPointerException</w:t>
-      </w:r>
-      <w:proofErr w:type="spellEnd"/>
-      <w:r>
-        <w:t xml:space="preserve"> o </w:t>
-      </w:r>
-      <w:proofErr w:type="spellStart"/>
-      <w:r>
-        <w:t>SQLException</w:t>
-      </w:r>
-      <w:proofErr w:type="spellEnd"/>
-      <w:r>
-        <w:t>) che causa l'interruzione del processo o la visualizzazione di una pagina di errore generica non formattata.</w:t>
+        <w:t>: L'esecuzione del test solleva una exception non intercettata (es. NullPointerException o SQLException) che causa l'interruzione del processo o la visualizzazione di una pagina di errore generica non formattata.</w:t>
       </w:r>
     </w:p>
     <w:p/>
@@ -4064,15 +3688,7 @@
         <w:t xml:space="preserve"> della fase di testing viene misurata in base a quanti test hanno effettivamente </w:t>
       </w:r>
       <w:r>
-        <w:t xml:space="preserve">provocato delle </w:t>
-      </w:r>
-      <w:proofErr w:type="spellStart"/>
-      <w:r>
-        <w:t>failure</w:t>
-      </w:r>
-      <w:proofErr w:type="spellEnd"/>
-      <w:r>
-        <w:t xml:space="preserve"> all’interno del sistema. Per un testing di successo si prevede che la maggior parte dei test case falliscano alla fine di individuare tutte i possibili difetti che inevitabilmente saranno presenti durante lo sviluppo del sistema.</w:t>
+        <w:t>provocato delle failure all’interno del sistema. Per un testing di successo si prevede che la maggior parte dei test case falliscano alla fine di individuare tutte i possibili difetti che inevitabilmente saranno presenti durante lo sviluppo del sistema.</w:t>
       </w:r>
     </w:p>
     <w:p/>
@@ -4111,21 +3727,8 @@
     <w:p/>
     <w:p>
       <w:r>
-        <w:t xml:space="preserve">L'obiettivo dello </w:t>
-      </w:r>
-      <w:proofErr w:type="spellStart"/>
-      <w:r>
-        <w:t>unit</w:t>
-      </w:r>
-      <w:proofErr w:type="spellEnd"/>
-      <w:r>
-        <w:t xml:space="preserve"> testing è verificare la correttezza logica dei singoli componenti del sistema in modo isolato. Per E.W.M.S., questo livello di testing si focalizza sulle classi definite nell'Object Design </w:t>
-      </w:r>
-      <w:proofErr w:type="spellStart"/>
-      <w:r>
-        <w:t>Document</w:t>
-      </w:r>
-      <w:proofErr w:type="spellEnd"/>
+        <w:t>L'obiettivo dello unit testing è verificare la correttezza logica dei singoli componenti del sistema in modo isolato. Per E.W.M.S., questo livello di testing si focalizza sulle classi definite nell'Object Design Document</w:t>
+      </w:r>
       <w:r>
         <w:t xml:space="preserve"> e si concentrerà sui servizi offerti da ogni singolo sottosistema</w:t>
       </w:r>
@@ -4149,23 +3752,7 @@
         <w:t>Analisi dei contratti</w:t>
       </w:r>
       <w:r>
-        <w:t xml:space="preserve">: Verifica rigorosa delle </w:t>
-      </w:r>
-      <w:proofErr w:type="spellStart"/>
-      <w:r>
-        <w:t>pre-conditions</w:t>
-      </w:r>
-      <w:proofErr w:type="spellEnd"/>
-      <w:r>
-        <w:t xml:space="preserve"> e post-</w:t>
-      </w:r>
-      <w:proofErr w:type="spellStart"/>
-      <w:r>
-        <w:t>conditions</w:t>
-      </w:r>
-      <w:proofErr w:type="spellEnd"/>
-      <w:r>
-        <w:t xml:space="preserve"> specificate nell'ODD.</w:t>
+        <w:t>: Verifica rigorosa delle pre-conditions e post-conditions specificate nell'ODD.</w:t>
       </w:r>
     </w:p>
     <w:p>
@@ -4176,21 +3763,12 @@
           <w:numId w:val="10"/>
         </w:numPr>
       </w:pPr>
-      <w:proofErr w:type="spellStart"/>
       <w:r>
         <w:rPr>
           <w:b/>
           <w:bCs/>
         </w:rPr>
-        <w:t>Boundary</w:t>
-      </w:r>
-      <w:proofErr w:type="spellEnd"/>
-      <w:r>
-        <w:rPr>
-          <w:b/>
-          <w:bCs/>
-        </w:rPr>
-        <w:t xml:space="preserve"> Value Analysis</w:t>
+        <w:t>Boundary Value Analysis</w:t>
       </w:r>
       <w:r>
         <w:t>: Test dei limiti per ogni parametro di input (es. lunghezze stringhe, valori nulli).</w:t>
@@ -4204,7 +3782,6 @@
           <w:numId w:val="10"/>
         </w:numPr>
       </w:pPr>
-      <w:proofErr w:type="spellStart"/>
       <w:r>
         <w:rPr>
           <w:b/>
@@ -4212,33 +3789,8 @@
         </w:rPr>
         <w:t>Mocking</w:t>
       </w:r>
-      <w:proofErr w:type="spellEnd"/>
-      <w:r>
-        <w:t xml:space="preserve">: Utilizzo di </w:t>
-      </w:r>
-      <w:proofErr w:type="spellStart"/>
-      <w:r>
-        <w:t>mock</w:t>
-      </w:r>
-      <w:proofErr w:type="spellEnd"/>
-      <w:r>
-        <w:t xml:space="preserve"> </w:t>
-      </w:r>
-      <w:proofErr w:type="spellStart"/>
-      <w:r>
-        <w:t>objects</w:t>
-      </w:r>
-      <w:proofErr w:type="spellEnd"/>
-      <w:r>
-        <w:t xml:space="preserve"> o </w:t>
-      </w:r>
-      <w:proofErr w:type="spellStart"/>
-      <w:r>
-        <w:t>stubs</w:t>
-      </w:r>
-      <w:proofErr w:type="spellEnd"/>
-      <w:r>
-        <w:t xml:space="preserve"> per isolare l'unità sotto esame dalle dipendenze esterne, come il database o il web container, garantendo che l'errore rilevato appartenga esclusivamente all'unità testata.</w:t>
+      <w:r>
+        <w:t>: Utilizzo di mock objects o stubs per isolare l'unità sotto esame dalle dipendenze esterne, come il database o il web container, garantendo che l'errore rilevato appartenga esclusivamente all'unità testata.</w:t>
       </w:r>
     </w:p>
     <w:p>
@@ -4257,29 +3809,8 @@
     </w:p>
     <w:p/>
     <w:p>
-      <w:proofErr w:type="spellStart"/>
-      <w:r>
-        <w:t>L’integration</w:t>
-      </w:r>
-      <w:proofErr w:type="spellEnd"/>
-      <w:r>
-        <w:t xml:space="preserve"> testing ha l’obiettivo di verificare le interazioni tra i diversi moduli della </w:t>
-      </w:r>
-      <w:proofErr w:type="spellStart"/>
-      <w:r>
-        <w:t>three-tier</w:t>
-      </w:r>
-      <w:proofErr w:type="spellEnd"/>
-      <w:r>
-        <w:t xml:space="preserve"> </w:t>
-      </w:r>
-      <w:proofErr w:type="spellStart"/>
-      <w:r>
-        <w:t>architecture</w:t>
-      </w:r>
-      <w:proofErr w:type="spellEnd"/>
-      <w:r>
-        <w:t>. Per il sistema E.W.M.S., si è deciso di adottare la tecnica del sandwich testing</w:t>
+      <w:r>
+        <w:t>L’integration testing ha l’obiettivo di verificare le interazioni tra i diversi moduli della three-tier architecture. Per il sistema E.W.M.S., si è deciso di adottare la tecnica del sandwich testing</w:t>
       </w:r>
       <w:r>
         <w:t xml:space="preserve">. </w:t>
@@ -4287,21 +3818,11 @@
       <w:r>
         <w:t xml:space="preserve">Questo approccio permette di testare simultaneamente l’applicazione dall’alto verso il basso e dal basso verso l’alto, convergendo verso </w:t>
       </w:r>
-      <w:proofErr w:type="spellStart"/>
-      <w:r>
-        <w:t>l’application</w:t>
-      </w:r>
-      <w:proofErr w:type="spellEnd"/>
-      <w:r>
-        <w:t xml:space="preserve"> </w:t>
-      </w:r>
-      <w:proofErr w:type="spellStart"/>
-      <w:r>
-        <w:t>layer</w:t>
-      </w:r>
-      <w:proofErr w:type="spellEnd"/>
-      <w:r>
-        <w:t xml:space="preserve"> identificato come strato target.</w:t>
+      <w:r>
+        <w:t xml:space="preserve">l’application </w:t>
+      </w:r>
+      <w:r>
+        <w:t>layer identificato come strato target.</w:t>
       </w:r>
     </w:p>
     <w:p>
@@ -4325,23 +3846,7 @@
         <w:t>Strato Superiore</w:t>
       </w:r>
       <w:r>
-        <w:t xml:space="preserve">: Composto dai controller del </w:t>
-      </w:r>
-      <w:proofErr w:type="spellStart"/>
-      <w:r>
-        <w:t>presentation</w:t>
-      </w:r>
-      <w:proofErr w:type="spellEnd"/>
-      <w:r>
-        <w:t xml:space="preserve"> </w:t>
-      </w:r>
-      <w:proofErr w:type="spellStart"/>
-      <w:r>
-        <w:t>layer</w:t>
-      </w:r>
-      <w:proofErr w:type="spellEnd"/>
-      <w:r>
-        <w:t xml:space="preserve"> che gestiscono le interfacce utente.</w:t>
+        <w:t>: Composto dai controller del presentation layer che gestiscono le interfacce utente.</w:t>
       </w:r>
     </w:p>
     <w:p>
@@ -4361,29 +3866,11 @@
       <w:r>
         <w:t xml:space="preserve">: Rappresentato dai componenti del </w:t>
       </w:r>
-      <w:proofErr w:type="spellStart"/>
       <w:r>
         <w:t>application</w:t>
       </w:r>
-      <w:proofErr w:type="spellEnd"/>
-      <w:r>
-        <w:t xml:space="preserve"> </w:t>
-      </w:r>
-      <w:proofErr w:type="spellStart"/>
-      <w:r>
-        <w:t>layer</w:t>
-      </w:r>
-      <w:proofErr w:type="spellEnd"/>
-      <w:r>
-        <w:t xml:space="preserve"> dove risiede la business </w:t>
-      </w:r>
-      <w:proofErr w:type="spellStart"/>
-      <w:r>
-        <w:t>logic</w:t>
-      </w:r>
-      <w:proofErr w:type="spellEnd"/>
-      <w:r>
-        <w:t>.</w:t>
+      <w:r>
+        <w:t xml:space="preserve"> layer dove risiede la business logic.</w:t>
       </w:r>
     </w:p>
     <w:p>
@@ -4401,23 +3888,7 @@
         <w:t>Strato Inferiore</w:t>
       </w:r>
       <w:r>
-        <w:t xml:space="preserve">: Costituito dal </w:t>
-      </w:r>
-      <w:proofErr w:type="spellStart"/>
-      <w:r>
-        <w:t>persistence</w:t>
-      </w:r>
-      <w:proofErr w:type="spellEnd"/>
-      <w:r>
-        <w:t xml:space="preserve"> </w:t>
-      </w:r>
-      <w:proofErr w:type="spellStart"/>
-      <w:r>
-        <w:t>layer</w:t>
-      </w:r>
-      <w:proofErr w:type="spellEnd"/>
-      <w:r>
-        <w:t xml:space="preserve"> (</w:t>
+        <w:t>: Costituito dal persistence layer (</w:t>
       </w:r>
       <w:r>
         <w:rPr>
@@ -4442,39 +3913,7 @@
     <w:p/>
     <w:p>
       <w:r>
-        <w:t xml:space="preserve">Il system testing rappresenta la fase finale di verifica, in cui l'intera applicazione viene testata come un'unica entità per accertarsi che soddisfi i </w:t>
-      </w:r>
-      <w:proofErr w:type="spellStart"/>
-      <w:r>
-        <w:t>functional</w:t>
-      </w:r>
-      <w:proofErr w:type="spellEnd"/>
-      <w:r>
-        <w:t xml:space="preserve"> </w:t>
-      </w:r>
-      <w:proofErr w:type="spellStart"/>
-      <w:r>
-        <w:t>requirements</w:t>
-      </w:r>
-      <w:proofErr w:type="spellEnd"/>
-      <w:r>
-        <w:t xml:space="preserve"> descritti nel </w:t>
-      </w:r>
-      <w:proofErr w:type="spellStart"/>
-      <w:r>
-        <w:t>Requirement</w:t>
-      </w:r>
-      <w:proofErr w:type="spellEnd"/>
-      <w:r>
-        <w:t xml:space="preserve"> Analysis </w:t>
-      </w:r>
-      <w:proofErr w:type="spellStart"/>
-      <w:r>
-        <w:t>Document</w:t>
-      </w:r>
-      <w:proofErr w:type="spellEnd"/>
-      <w:r>
-        <w:t>.</w:t>
+        <w:t>Il system testing rappresenta la fase finale di verifica, in cui l'intera applicazione viene testata come un'unica entità per accertarsi che soddisfi i functional requirements descritti nel Requirement Analysis Document.</w:t>
       </w:r>
     </w:p>
     <w:p>
@@ -4490,39 +3929,16 @@
       <w:r>
         <w:t xml:space="preserve"> La tecnica utilizzata sarà </w:t>
       </w:r>
-      <w:proofErr w:type="spellStart"/>
       <w:r>
         <w:rPr>
           <w:b/>
           <w:bCs/>
         </w:rPr>
-        <w:t>category</w:t>
-      </w:r>
-      <w:proofErr w:type="spellEnd"/>
-      <w:r>
-        <w:rPr>
-          <w:b/>
-          <w:bCs/>
-        </w:rPr>
-        <w:t xml:space="preserve"> </w:t>
-      </w:r>
-      <w:proofErr w:type="spellStart"/>
-      <w:r>
-        <w:rPr>
-          <w:b/>
-          <w:bCs/>
-        </w:rPr>
-        <w:t>partition</w:t>
-      </w:r>
-      <w:proofErr w:type="spellEnd"/>
-      <w:r>
-        <w:t xml:space="preserve">: Applicazione sistematica delle tabelle di partizione generate (es. per il login o la creazione di un task) per coprire tutti gli scenari d'uso nominali e di </w:t>
-      </w:r>
-      <w:proofErr w:type="spellStart"/>
-      <w:r>
-        <w:t>error</w:t>
-      </w:r>
-      <w:proofErr w:type="spellEnd"/>
+        <w:t>category partition</w:t>
+      </w:r>
+      <w:r>
+        <w:t>: Applicazione sistematica delle tabelle di partizione generate (es. per il login o la creazione di un task) per coprire tutti gli scenari d'uso nominali e di error</w:t>
+      </w:r>
       <w:r>
         <w:t xml:space="preserve"> delle funzionalità critiche descritte all’interno di questo documento</w:t>
       </w:r>
@@ -4625,15 +4041,7 @@
         <w:t>Elevato tasso di fallimento</w:t>
       </w:r>
       <w:r>
-        <w:t xml:space="preserve">: Se oltre il 40% dei test frames eseguiti in una specifica sessione produce un esito di </w:t>
-      </w:r>
-      <w:proofErr w:type="spellStart"/>
-      <w:r>
-        <w:t>fail</w:t>
-      </w:r>
-      <w:proofErr w:type="spellEnd"/>
-      <w:r>
-        <w:t>, indicando un'instabilità diffusa della build corrente.</w:t>
+        <w:t>: Se oltre il 40% dei test frames eseguiti in una specifica sessione produce un esito di fail, indicando un'instabilità diffusa della build corrente.</w:t>
       </w:r>
     </w:p>
     <w:p>
@@ -4651,23 +4059,7 @@
         <w:t>Corruzione dei dati</w:t>
       </w:r>
       <w:r>
-        <w:t xml:space="preserve">: Rilevamento di anomalie gravi nel </w:t>
-      </w:r>
-      <w:proofErr w:type="spellStart"/>
-      <w:r>
-        <w:t>persistence</w:t>
-      </w:r>
-      <w:proofErr w:type="spellEnd"/>
-      <w:r>
-        <w:t xml:space="preserve"> </w:t>
-      </w:r>
-      <w:proofErr w:type="spellStart"/>
-      <w:r>
-        <w:t>layer</w:t>
-      </w:r>
-      <w:proofErr w:type="spellEnd"/>
-      <w:r>
-        <w:t xml:space="preserve"> che compromettono l'integrità dei record durante i test di integrazione</w:t>
+        <w:t>: Rilevamento di anomalie gravi nel persistence layer che compromettono l'integrità dei record durante i test di integrazione</w:t>
       </w:r>
       <w:r>
         <w:t xml:space="preserve"> o di sistema</w:t>
@@ -4722,23 +4114,7 @@
         <w:t>Risoluzione delle anomalie</w:t>
       </w:r>
       <w:r>
-        <w:t xml:space="preserve">: </w:t>
-      </w:r>
-      <w:proofErr w:type="gramStart"/>
-      <w:r>
-        <w:t>Il team</w:t>
-      </w:r>
-      <w:proofErr w:type="gramEnd"/>
-      <w:r>
-        <w:t xml:space="preserve"> di sviluppo deve fornire una nuova build in cui il bug che ha causato la sospensione è stato corretto e verificato tramite uno </w:t>
-      </w:r>
-      <w:proofErr w:type="spellStart"/>
-      <w:r>
-        <w:t>unit</w:t>
-      </w:r>
-      <w:proofErr w:type="spellEnd"/>
-      <w:r>
-        <w:t xml:space="preserve"> testing preliminare.</w:t>
+        <w:t>: Il team di sviluppo deve fornire una nuova build in cui il bug che ha causato la sospensione è stato corretto e verificato tramite uno unit testing preliminare.</w:t>
       </w:r>
     </w:p>
     <w:p>
@@ -4774,31 +4150,7 @@
         <w:t>Disponibilità della documentazione</w:t>
       </w:r>
       <w:r>
-        <w:t xml:space="preserve">: Aggiornamento dell'Object Design </w:t>
-      </w:r>
-      <w:proofErr w:type="spellStart"/>
-      <w:r>
-        <w:t>Document</w:t>
-      </w:r>
-      <w:proofErr w:type="spellEnd"/>
-      <w:r>
-        <w:t xml:space="preserve"> o del System Design </w:t>
-      </w:r>
-      <w:proofErr w:type="spellStart"/>
-      <w:r>
-        <w:t>Document</w:t>
-      </w:r>
-      <w:proofErr w:type="spellEnd"/>
-      <w:r>
-        <w:t xml:space="preserve"> qualora la correzione del problema abbia comportato modifiche strutturali alle class </w:t>
-      </w:r>
-      <w:proofErr w:type="spellStart"/>
-      <w:r>
-        <w:t>interfaces</w:t>
-      </w:r>
-      <w:proofErr w:type="spellEnd"/>
-      <w:r>
-        <w:t xml:space="preserve"> o alla logica di service.</w:t>
+        <w:t>: Aggiornamento dell'Object Design Document o del System Design Document qualora la correzione del problema abbia comportato modifiche strutturali alle class interfaces o alla logica di service.</w:t>
       </w:r>
     </w:p>
     <w:p>
@@ -4821,15 +4173,7 @@
         <w:t xml:space="preserve">sistema </w:t>
       </w:r>
       <w:r>
-        <w:t xml:space="preserve">mantenga standard qualitativi elevati, evitando che errori strutturali nello strato della business </w:t>
-      </w:r>
-      <w:proofErr w:type="spellStart"/>
-      <w:r>
-        <w:t>logic</w:t>
-      </w:r>
-      <w:proofErr w:type="spellEnd"/>
-      <w:r>
-        <w:t xml:space="preserve"> </w:t>
+        <w:t xml:space="preserve">mantenga standard qualitativi elevati, evitando che errori strutturali nello strato della business logic </w:t>
       </w:r>
       <w:r>
         <w:t xml:space="preserve">o incongruenze con il modello </w:t>
@@ -4856,31 +4200,7 @@
     </w:p>
     <w:p>
       <w:r>
-        <w:t xml:space="preserve">Per l'esecuzione dei test sul sistema E.W.M.S., verranno adottati strumenti specifici del software engineering per l'ambiente Java, garantendo l'automazione dei processi e la ripetibilità dei test </w:t>
-      </w:r>
-      <w:proofErr w:type="spellStart"/>
-      <w:r>
-        <w:t>cases</w:t>
-      </w:r>
-      <w:proofErr w:type="spellEnd"/>
-      <w:r>
-        <w:t xml:space="preserve">. La scelta degli strumenti è dettata dalla necessità di coprire i tre livelli di testing definiti nella metodologia, supportando la </w:t>
-      </w:r>
-      <w:proofErr w:type="spellStart"/>
-      <w:r>
-        <w:t>three-tier</w:t>
-      </w:r>
-      <w:proofErr w:type="spellEnd"/>
-      <w:r>
-        <w:t xml:space="preserve"> </w:t>
-      </w:r>
-      <w:proofErr w:type="spellStart"/>
-      <w:r>
-        <w:t>architecture</w:t>
-      </w:r>
-      <w:proofErr w:type="spellEnd"/>
-      <w:r>
-        <w:t xml:space="preserve"> del progetto.</w:t>
+        <w:t>Per l'esecuzione dei test sul sistema E.W.M.S., verranno adottati strumenti specifici del software engineering per l'ambiente Java, garantendo l'automazione dei processi e la ripetibilità dei test cases. La scelta degli strumenti è dettata dalla necessità di coprire i tre livelli di testing definiti nella metodologia, supportando la three-tier architecture del progetto.</w:t>
       </w:r>
     </w:p>
     <w:p>
@@ -4893,20 +4213,14 @@
         <w:pStyle w:val="Titolo4"/>
       </w:pPr>
       <w:r>
-        <w:t xml:space="preserve">Strumento per lo Unit Testing: </w:t>
-      </w:r>
-      <w:proofErr w:type="spellStart"/>
-      <w:r>
-        <w:t>JUnit</w:t>
-      </w:r>
-      <w:proofErr w:type="spellEnd"/>
+        <w:t>Strumento per lo Unit Testing: JUnit</w:t>
+      </w:r>
     </w:p>
     <w:p/>
     <w:p>
       <w:r>
         <w:t xml:space="preserve">Per la verifica dei singoli componenti, verrà utilizzato </w:t>
       </w:r>
-      <w:proofErr w:type="spellStart"/>
       <w:r>
         <w:rPr>
           <w:b/>
@@ -4914,7 +4228,6 @@
         </w:rPr>
         <w:t>JUnit</w:t>
       </w:r>
-      <w:proofErr w:type="spellEnd"/>
       <w:r>
         <w:t>.</w:t>
       </w:r>
@@ -4934,31 +4247,7 @@
         <w:t>Motivazione</w:t>
       </w:r>
       <w:r>
-        <w:t xml:space="preserve">: È il framework di testing standard per applicazioni Java. Permette di definire test </w:t>
-      </w:r>
-      <w:proofErr w:type="spellStart"/>
-      <w:r>
-        <w:t>cases</w:t>
-      </w:r>
-      <w:proofErr w:type="spellEnd"/>
-      <w:r>
-        <w:t xml:space="preserve"> atomici, gestire le </w:t>
-      </w:r>
-      <w:proofErr w:type="spellStart"/>
-      <w:r>
-        <w:t>pre-conditions</w:t>
-      </w:r>
-      <w:proofErr w:type="spellEnd"/>
-      <w:r>
-        <w:t xml:space="preserve"> tramite annotazioni come @Before e verificare i risultati attesi utilizzando le </w:t>
-      </w:r>
-      <w:proofErr w:type="spellStart"/>
-      <w:r>
-        <w:t>assertions</w:t>
-      </w:r>
-      <w:proofErr w:type="spellEnd"/>
-      <w:r>
-        <w:t>.</w:t>
+        <w:t>: È il framework di testing standard per applicazioni Java. Permette di definire test cases atomici, gestire le pre-conditions tramite annotazioni come @Before e verificare i risultati attesi utilizzando le assertions.</w:t>
       </w:r>
     </w:p>
     <w:p>
@@ -5009,21 +4298,8 @@
       </w:pPr>
       <w:r>
         <w:lastRenderedPageBreak/>
-        <w:t xml:space="preserve">Strumento per l'Integration Testing: </w:t>
-      </w:r>
-      <w:proofErr w:type="spellStart"/>
-      <w:r>
-        <w:t>Mockito</w:t>
-      </w:r>
-      <w:proofErr w:type="spellEnd"/>
-      <w:r>
-        <w:t xml:space="preserve"> e </w:t>
-      </w:r>
-      <w:proofErr w:type="spellStart"/>
-      <w:r>
-        <w:t>DBUnit</w:t>
-      </w:r>
-      <w:proofErr w:type="spellEnd"/>
+        <w:t>Strumento per l'Integration Testing: Mockito e DBUnit</w:t>
+      </w:r>
     </w:p>
     <w:p>
       <w:r>
@@ -5047,7 +4323,6 @@
           <w:numId w:val="19"/>
         </w:numPr>
       </w:pPr>
-      <w:proofErr w:type="spellStart"/>
       <w:r>
         <w:rPr>
           <w:b/>
@@ -5055,39 +4330,19 @@
         </w:rPr>
         <w:t>Mockito</w:t>
       </w:r>
-      <w:proofErr w:type="spellEnd"/>
       <w:r>
         <w:t xml:space="preserve">: È fondamentale per la creazione di </w:t>
       </w:r>
-      <w:proofErr w:type="spellStart"/>
       <w:r>
         <w:rPr>
           <w:b/>
           <w:bCs/>
         </w:rPr>
-        <w:t>mock</w:t>
-      </w:r>
-      <w:proofErr w:type="spellEnd"/>
-      <w:r>
-        <w:rPr>
-          <w:b/>
-          <w:bCs/>
-        </w:rPr>
-        <w:t xml:space="preserve"> </w:t>
-      </w:r>
-      <w:proofErr w:type="spellStart"/>
-      <w:r>
-        <w:rPr>
-          <w:b/>
-          <w:bCs/>
-        </w:rPr>
-        <w:t>objects</w:t>
-      </w:r>
-      <w:proofErr w:type="spellEnd"/>
+        <w:t>mock objects</w:t>
+      </w:r>
       <w:r>
         <w:t xml:space="preserve"> e </w:t>
       </w:r>
-      <w:proofErr w:type="spellStart"/>
       <w:r>
         <w:rPr>
           <w:b/>
@@ -5095,49 +4350,8 @@
         </w:rPr>
         <w:t>stubs</w:t>
       </w:r>
-      <w:proofErr w:type="spellEnd"/>
-      <w:r>
-        <w:t xml:space="preserve">. Nel nostro approccio, </w:t>
-      </w:r>
-      <w:proofErr w:type="spellStart"/>
-      <w:r>
-        <w:t>Mockito</w:t>
-      </w:r>
-      <w:proofErr w:type="spellEnd"/>
-      <w:r>
-        <w:t xml:space="preserve"> permetterà di isolare lo strato target simulando le risposte del </w:t>
-      </w:r>
-      <w:proofErr w:type="spellStart"/>
-      <w:r>
-        <w:t>persistence</w:t>
-      </w:r>
-      <w:proofErr w:type="spellEnd"/>
-      <w:r>
-        <w:t xml:space="preserve"> </w:t>
-      </w:r>
-      <w:proofErr w:type="spellStart"/>
-      <w:r>
-        <w:t>layer</w:t>
-      </w:r>
-      <w:proofErr w:type="spellEnd"/>
-      <w:r>
-        <w:t xml:space="preserve"> senza dover interrogare il database reale, o simulando le chiamate provenienti dal </w:t>
-      </w:r>
-      <w:proofErr w:type="spellStart"/>
-      <w:r>
-        <w:t>presentation</w:t>
-      </w:r>
-      <w:proofErr w:type="spellEnd"/>
-      <w:r>
-        <w:t xml:space="preserve"> </w:t>
-      </w:r>
-      <w:proofErr w:type="spellStart"/>
-      <w:r>
-        <w:t>layer</w:t>
-      </w:r>
-      <w:proofErr w:type="spellEnd"/>
-      <w:r>
-        <w:t>.</w:t>
+      <w:r>
+        <w:t>. Nel nostro approccio, Mockito permetterà di isolare lo strato target simulando le risposte del persistence layer senza dover interrogare il database reale, o simulando le chiamate provenienti dal presentation layer.</w:t>
       </w:r>
     </w:p>
     <w:p>
@@ -5147,7 +4361,6 @@
           <w:numId w:val="19"/>
         </w:numPr>
       </w:pPr>
-      <w:proofErr w:type="spellStart"/>
       <w:r>
         <w:rPr>
           <w:b/>
@@ -5155,17 +4368,8 @@
         </w:rPr>
         <w:t>DBUnit</w:t>
       </w:r>
-      <w:proofErr w:type="spellEnd"/>
-      <w:r>
-        <w:t xml:space="preserve">: Estensione di </w:t>
-      </w:r>
-      <w:proofErr w:type="spellStart"/>
-      <w:r>
-        <w:t>JUnit</w:t>
-      </w:r>
-      <w:proofErr w:type="spellEnd"/>
-      <w:r>
-        <w:t>, è ideale per l'integrazione con il database. Consente di mettere il database in uno stato noto prima di ogni test (tramite datasets in formato XML), verificando che le operazioni di CRUD eseguite dai DAO producano la persistenza corretta dei dati.</w:t>
+      <w:r>
+        <w:t>: Estensione di JUnit, è ideale per l'integrazione con il database. Consente di mettere il database in uno stato noto prima di ogni test (tramite datasets in formato XML), verificando che le operazioni di CRUD eseguite dai DAO producano la persistenza corretta dei dati.</w:t>
       </w:r>
     </w:p>
     <w:p>
@@ -5181,34 +4385,13 @@
         <w:pStyle w:val="Titolo4"/>
       </w:pPr>
       <w:r>
-        <w:t xml:space="preserve">Strumento per il System Testing: </w:t>
-      </w:r>
-      <w:proofErr w:type="spellStart"/>
-      <w:r>
-        <w:t>Selenium</w:t>
-      </w:r>
-      <w:proofErr w:type="spellEnd"/>
+        <w:t>Strumento per il System Testing: Selenium</w:t>
+      </w:r>
     </w:p>
     <w:p/>
     <w:p>
       <w:r>
-        <w:t xml:space="preserve">Per la validazione end-to-end dell'applicazione, verrà utilizzato </w:t>
-      </w:r>
-      <w:proofErr w:type="spellStart"/>
-      <w:r>
-        <w:t>Selenium</w:t>
-      </w:r>
-      <w:proofErr w:type="spellEnd"/>
-      <w:r>
-        <w:t xml:space="preserve"> </w:t>
-      </w:r>
-      <w:proofErr w:type="spellStart"/>
-      <w:r>
-        <w:t>WebDriver</w:t>
-      </w:r>
-      <w:proofErr w:type="spellEnd"/>
-      <w:r>
-        <w:t>.</w:t>
+        <w:t>Per la validazione end-to-end dell'applicazione, verrà utilizzato Selenium WebDriver.</w:t>
       </w:r>
     </w:p>
     <w:p>
@@ -5226,23 +4409,7 @@
         <w:t>Motivazione</w:t>
       </w:r>
       <w:r>
-        <w:t xml:space="preserve">: Permette di automatizzare le azioni degli utenti sui browser web. È ideale per verificare i flussi descritti nel RAD, interagendo direttamente con il </w:t>
-      </w:r>
-      <w:proofErr w:type="spellStart"/>
-      <w:r>
-        <w:t>presentation</w:t>
-      </w:r>
-      <w:proofErr w:type="spellEnd"/>
-      <w:r>
-        <w:t xml:space="preserve"> </w:t>
-      </w:r>
-      <w:proofErr w:type="spellStart"/>
-      <w:r>
-        <w:t>layer</w:t>
-      </w:r>
-      <w:proofErr w:type="spellEnd"/>
-      <w:r>
-        <w:t>.</w:t>
+        <w:t>: Permette di automatizzare le azioni degli utenti sui browser web. È ideale per verificare i flussi descritti nel RAD, interagendo direttamente con il presentation layer.</w:t>
       </w:r>
     </w:p>
     <w:p>
@@ -5260,23 +4427,7 @@
         <w:t>Utilizzo</w:t>
       </w:r>
       <w:r>
-        <w:t xml:space="preserve">: Verrà impiegato per simulare scenari completi, come il login, la creazione di un task (compreso l'upload di allegati). </w:t>
-      </w:r>
-      <w:proofErr w:type="spellStart"/>
-      <w:r>
-        <w:t>Selenium</w:t>
-      </w:r>
-      <w:proofErr w:type="spellEnd"/>
-      <w:r>
-        <w:t xml:space="preserve"> controllerà che, a fronte di input validi o errati, il DOM della pagina mostri correttamente i messaggi di successo o i messaggi di </w:t>
-      </w:r>
-      <w:proofErr w:type="spellStart"/>
-      <w:r>
-        <w:t>error</w:t>
-      </w:r>
-      <w:proofErr w:type="spellEnd"/>
-      <w:r>
-        <w:t xml:space="preserve"> definiti nei requisiti.</w:t>
+        <w:t>: Verrà impiegato per simulare scenari completi, come il login, la creazione di un task (compreso l'upload di allegati). Selenium controllerà che, a fronte di input validi o errati, il DOM della pagina mostri correttamente i messaggi di successo o i messaggi di error definiti nei requisiti.</w:t>
       </w:r>
     </w:p>
     <w:p>
@@ -5298,15 +4449,7 @@
     <w:p/>
     <w:p>
       <w:r>
-        <w:t xml:space="preserve">Tutti i test saranno integrati all'interno dell'IDE e potranno essere eseguiti tramite strumenti di build </w:t>
-      </w:r>
-      <w:proofErr w:type="spellStart"/>
-      <w:r>
-        <w:t>automation</w:t>
-      </w:r>
-      <w:proofErr w:type="spellEnd"/>
-      <w:r>
-        <w:t xml:space="preserve"> come Maven</w:t>
+        <w:t>Tutti i test saranno integrati all'interno dell'IDE e potranno essere eseguiti tramite strumenti di build automation come Maven</w:t>
       </w:r>
       <w:r>
         <w:t>.</w:t>
@@ -5330,49 +4473,20 @@
       <w:bookmarkStart w:id="8" w:name="_Toc217148119"/>
       <w:r>
         <w:lastRenderedPageBreak/>
-        <w:t xml:space="preserve">Test </w:t>
-      </w:r>
-      <w:proofErr w:type="spellStart"/>
-      <w:r>
-        <w:t>cases</w:t>
+        <w:t>Test cases</w:t>
       </w:r>
       <w:bookmarkEnd w:id="8"/>
-      <w:proofErr w:type="spellEnd"/>
     </w:p>
     <w:p>
       <w:r>
-        <w:t xml:space="preserve">In questa sezione verranno inserite le tabelle del </w:t>
-      </w:r>
-      <w:proofErr w:type="spellStart"/>
-      <w:r>
-        <w:t>Category</w:t>
-      </w:r>
-      <w:proofErr w:type="spellEnd"/>
+        <w:t>In questa sezione verranno inserite le tabelle del Category Partition per le funzionalità selezionate per il testing</w:t>
+      </w:r>
+      <w:r>
+        <w:t>, ogni test case avrà un Test case id (TC_id) e un nome</w:t>
+      </w:r>
       <w:r>
         <w:t xml:space="preserve"> </w:t>
       </w:r>
-      <w:proofErr w:type="spellStart"/>
-      <w:r>
-        <w:t>Partition</w:t>
-      </w:r>
-      <w:proofErr w:type="spellEnd"/>
-      <w:r>
-        <w:t xml:space="preserve"> per le funzionalità selezionate per il testing</w:t>
-      </w:r>
-      <w:r>
-        <w:t>, ogni test case avrà un Test case id (</w:t>
-      </w:r>
-      <w:proofErr w:type="spellStart"/>
-      <w:r>
-        <w:t>TC_id</w:t>
-      </w:r>
-      <w:proofErr w:type="spellEnd"/>
-      <w:r>
-        <w:t>) e un nome</w:t>
-      </w:r>
-      <w:r>
-        <w:t xml:space="preserve"> </w:t>
-      </w:r>
       <w:r>
         <w:t>utilizzat</w:t>
       </w:r>
@@ -5380,13 +4494,8 @@
         <w:t>i</w:t>
       </w:r>
       <w:r>
-        <w:t xml:space="preserve"> per il riferimento nel documento di Test Case </w:t>
-      </w:r>
-      <w:proofErr w:type="spellStart"/>
-      <w:r>
-        <w:t>Specification</w:t>
-      </w:r>
-      <w:proofErr w:type="spellEnd"/>
+        <w:t xml:space="preserve"> per il riferimento nel documento di Test Case Specification</w:t>
+      </w:r>
       <w:r>
         <w:t>.</w:t>
       </w:r>
@@ -5401,14 +4510,12 @@
       <w:r>
         <w:t xml:space="preserve">9.1 </w:t>
       </w:r>
-      <w:proofErr w:type="spellStart"/>
       <w:r>
         <w:t>Test_</w:t>
       </w:r>
       <w:r>
         <w:t>Login</w:t>
       </w:r>
-      <w:proofErr w:type="spellEnd"/>
       <w:r>
         <w:t xml:space="preserve"> </w:t>
       </w:r>
@@ -5449,7 +4556,6 @@
                 <w:bCs/>
               </w:rPr>
             </w:pPr>
-            <w:proofErr w:type="spellStart"/>
             <w:r>
               <w:rPr>
                 <w:b/>
@@ -5457,7 +4563,6 @@
               </w:rPr>
               <w:t>Category</w:t>
             </w:r>
-            <w:proofErr w:type="spellEnd"/>
           </w:p>
         </w:tc>
         <w:tc>
@@ -5518,15 +4623,7 @@
               <w:spacing w:after="160" w:line="259" w:lineRule="auto"/>
             </w:pPr>
             <w:r>
-              <w:t>Username (</w:t>
-            </w:r>
-            <w:proofErr w:type="gramStart"/>
-            <w:r>
-              <w:t>email</w:t>
-            </w:r>
-            <w:proofErr w:type="gramEnd"/>
-            <w:r>
-              <w:t>)</w:t>
+              <w:t>Username (email)</w:t>
             </w:r>
           </w:p>
         </w:tc>
@@ -5539,15 +4636,7 @@
               <w:spacing w:after="160" w:line="259" w:lineRule="auto"/>
             </w:pPr>
             <w:r>
-              <w:t xml:space="preserve">Valido (presente nel </w:t>
-            </w:r>
-            <w:proofErr w:type="spellStart"/>
-            <w:r>
-              <w:t>db</w:t>
-            </w:r>
-            <w:proofErr w:type="spellEnd"/>
-            <w:r>
-              <w:t>)</w:t>
+              <w:t>Valido (presente nel db)</w:t>
             </w:r>
           </w:p>
           <w:p>
@@ -5599,78 +4688,46 @@
               <w:spacing w:after="160" w:line="259" w:lineRule="auto"/>
             </w:pPr>
             <w:r>
-              <w:t>[</w:t>
-            </w:r>
-            <w:proofErr w:type="spellStart"/>
-            <w:r>
-              <w:t>property</w:t>
-            </w:r>
-            <w:proofErr w:type="spellEnd"/>
-            <w:r>
-              <w:t xml:space="preserve"> Valido]</w:t>
-            </w:r>
-          </w:p>
-          <w:p>
-            <w:pPr>
-              <w:spacing w:after="160" w:line="259" w:lineRule="auto"/>
-            </w:pPr>
-          </w:p>
-          <w:p>
-            <w:pPr>
-              <w:spacing w:after="160" w:line="259" w:lineRule="auto"/>
-            </w:pPr>
-            <w:r>
-              <w:t>[</w:t>
-            </w:r>
-            <w:proofErr w:type="spellStart"/>
-            <w:r>
-              <w:t>error</w:t>
-            </w:r>
-            <w:proofErr w:type="spellEnd"/>
-            <w:r>
-              <w:t>]</w:t>
-            </w:r>
-          </w:p>
-          <w:p>
-            <w:pPr>
-              <w:spacing w:after="160" w:line="259" w:lineRule="auto"/>
-            </w:pPr>
-          </w:p>
-          <w:p>
-            <w:pPr>
-              <w:spacing w:after="160" w:line="259" w:lineRule="auto"/>
-            </w:pPr>
-            <w:r>
-              <w:t>[</w:t>
-            </w:r>
-            <w:proofErr w:type="spellStart"/>
-            <w:r>
-              <w:t>error</w:t>
-            </w:r>
-            <w:proofErr w:type="spellEnd"/>
-            <w:r>
-              <w:t>]</w:t>
-            </w:r>
-          </w:p>
-          <w:p>
-            <w:pPr>
-              <w:spacing w:after="160" w:line="259" w:lineRule="auto"/>
-            </w:pPr>
-          </w:p>
-          <w:p>
-            <w:pPr>
-              <w:spacing w:after="160" w:line="259" w:lineRule="auto"/>
-            </w:pPr>
-            <w:r>
-              <w:t>[</w:t>
-            </w:r>
-            <w:proofErr w:type="spellStart"/>
-            <w:r>
-              <w:t>error</w:t>
-            </w:r>
-            <w:proofErr w:type="spellEnd"/>
-            <w:r>
-              <w:t>]</w:t>
+              <w:t>[property Valido]</w:t>
+            </w:r>
+          </w:p>
+          <w:p>
+            <w:pPr>
+              <w:spacing w:after="160" w:line="259" w:lineRule="auto"/>
+            </w:pPr>
+          </w:p>
+          <w:p>
+            <w:pPr>
+              <w:spacing w:after="160" w:line="259" w:lineRule="auto"/>
+            </w:pPr>
+            <w:r>
+              <w:t>[error]</w:t>
+            </w:r>
+          </w:p>
+          <w:p>
+            <w:pPr>
+              <w:spacing w:after="160" w:line="259" w:lineRule="auto"/>
+            </w:pPr>
+          </w:p>
+          <w:p>
+            <w:pPr>
+              <w:spacing w:after="160" w:line="259" w:lineRule="auto"/>
+            </w:pPr>
+            <w:r>
+              <w:t>[error]</w:t>
+            </w:r>
+          </w:p>
+          <w:p>
+            <w:pPr>
+              <w:spacing w:after="160" w:line="259" w:lineRule="auto"/>
+            </w:pPr>
+          </w:p>
+          <w:p>
+            <w:pPr>
+              <w:spacing w:after="160" w:line="259" w:lineRule="auto"/>
+            </w:pPr>
+            <w:r>
+              <w:t>[error]</w:t>
             </w:r>
           </w:p>
         </w:tc>
@@ -5807,33 +4864,11 @@
           <w:lang w:val="en-GB"/>
         </w:rPr>
       </w:pPr>
-      <w:proofErr w:type="spellStart"/>
       <w:r>
         <w:rPr>
           <w:lang w:val="en-GB"/>
         </w:rPr>
-        <w:t>Tabella</w:t>
-      </w:r>
-      <w:proofErr w:type="spellEnd"/>
-      <w:r>
-        <w:rPr>
-          <w:lang w:val="en-GB"/>
-        </w:rPr>
-        <w:t xml:space="preserve"> </w:t>
-      </w:r>
-      <w:proofErr w:type="spellStart"/>
-      <w:r>
-        <w:rPr>
-          <w:lang w:val="en-GB"/>
-        </w:rPr>
-        <w:t>formati</w:t>
-      </w:r>
-      <w:proofErr w:type="spellEnd"/>
-      <w:r>
-        <w:rPr>
-          <w:lang w:val="en-GB"/>
-        </w:rPr>
-        <w:t xml:space="preserve"> </w:t>
+        <w:t xml:space="preserve">Tabella formati </w:t>
       </w:r>
     </w:p>
     <w:p>
@@ -5907,15 +4942,7 @@
               <w:spacing w:after="160" w:line="259" w:lineRule="auto"/>
             </w:pPr>
             <w:r>
-              <w:t>Username (</w:t>
-            </w:r>
-            <w:proofErr w:type="gramStart"/>
-            <w:r>
-              <w:t>email</w:t>
-            </w:r>
-            <w:proofErr w:type="gramEnd"/>
-            <w:r>
-              <w:t>)</w:t>
+              <w:t>Username (email)</w:t>
             </w:r>
           </w:p>
         </w:tc>
@@ -6223,7 +5250,6 @@
             <w:pPr>
               <w:spacing w:after="160" w:line="259" w:lineRule="auto"/>
             </w:pPr>
-            <w:proofErr w:type="spellStart"/>
             <w:r>
               <w:rPr>
                 <w:b/>
@@ -6231,7 +5257,6 @@
               </w:rPr>
               <w:t>Error</w:t>
             </w:r>
-            <w:proofErr w:type="spellEnd"/>
             <w:r>
               <w:t xml:space="preserve">: "Username o password non corrette" </w:t>
             </w:r>
@@ -6294,7 +5319,6 @@
             <w:pPr>
               <w:spacing w:after="160" w:line="259" w:lineRule="auto"/>
             </w:pPr>
-            <w:proofErr w:type="spellStart"/>
             <w:r>
               <w:rPr>
                 <w:b/>
@@ -6302,7 +5326,6 @@
               </w:rPr>
               <w:t>Error</w:t>
             </w:r>
-            <w:proofErr w:type="spellEnd"/>
             <w:r>
               <w:t xml:space="preserve">: "Username o password non corrette" </w:t>
             </w:r>
@@ -6365,7 +5388,6 @@
             <w:pPr>
               <w:spacing w:after="160" w:line="259" w:lineRule="auto"/>
             </w:pPr>
-            <w:proofErr w:type="spellStart"/>
             <w:r>
               <w:rPr>
                 <w:b/>
@@ -6373,7 +5395,6 @@
               </w:rPr>
               <w:t>Error</w:t>
             </w:r>
-            <w:proofErr w:type="spellEnd"/>
             <w:r>
               <w:t xml:space="preserve">: "Il campo e-mail è obbligatorio" </w:t>
             </w:r>
@@ -6436,7 +5457,6 @@
             <w:pPr>
               <w:spacing w:after="160" w:line="259" w:lineRule="auto"/>
             </w:pPr>
-            <w:proofErr w:type="spellStart"/>
             <w:r>
               <w:rPr>
                 <w:b/>
@@ -6444,7 +5464,6 @@
               </w:rPr>
               <w:t>Error</w:t>
             </w:r>
-            <w:proofErr w:type="spellEnd"/>
             <w:r>
               <w:t xml:space="preserve">: "Il campo password è obbligatorio" </w:t>
             </w:r>
@@ -6507,7 +5526,6 @@
             <w:pPr>
               <w:spacing w:after="160" w:line="259" w:lineRule="auto"/>
             </w:pPr>
-            <w:proofErr w:type="spellStart"/>
             <w:r>
               <w:rPr>
                 <w:b/>
@@ -6515,7 +5533,6 @@
               </w:rPr>
               <w:t>Error</w:t>
             </w:r>
-            <w:proofErr w:type="spellEnd"/>
             <w:r>
               <w:t>: "Il formato e-mail non valido"</w:t>
             </w:r>
@@ -6539,7 +5556,6 @@
       <w:r>
         <w:t xml:space="preserve">9.2 </w:t>
       </w:r>
-      <w:proofErr w:type="spellStart"/>
       <w:r>
         <w:t>Test_</w:t>
       </w:r>
@@ -6552,7 +5568,6 @@
       <w:r>
         <w:t>password</w:t>
       </w:r>
-      <w:proofErr w:type="spellEnd"/>
       <w:r>
         <w:t xml:space="preserve"> (TC_2)</w:t>
       </w:r>
@@ -6587,7 +5602,6 @@
                 <w:bCs/>
               </w:rPr>
             </w:pPr>
-            <w:proofErr w:type="spellStart"/>
             <w:r>
               <w:rPr>
                 <w:b/>
@@ -6595,7 +5609,6 @@
               </w:rPr>
               <w:t>Category</w:t>
             </w:r>
-            <w:proofErr w:type="spellEnd"/>
           </w:p>
         </w:tc>
         <w:tc>
@@ -6690,41 +5703,20 @@
             <w:r>
               <w:t>[</w:t>
             </w:r>
-            <w:proofErr w:type="spellStart"/>
-            <w:r>
-              <w:t>property</w:t>
-            </w:r>
-            <w:proofErr w:type="spellEnd"/>
-            <w:r>
-              <w:t xml:space="preserve"> Valido]</w:t>
+            <w:r>
+              <w:t>property Valido]</w:t>
             </w:r>
           </w:p>
           <w:p/>
           <w:p>
             <w:r>
-              <w:t>[</w:t>
-            </w:r>
-            <w:proofErr w:type="spellStart"/>
-            <w:r>
-              <w:t>error</w:t>
-            </w:r>
-            <w:proofErr w:type="spellEnd"/>
-            <w:r>
-              <w:t>]</w:t>
+              <w:t>[error]</w:t>
             </w:r>
           </w:p>
           <w:p/>
           <w:p>
             <w:r>
-              <w:t>[</w:t>
-            </w:r>
-            <w:proofErr w:type="spellStart"/>
-            <w:r>
-              <w:t>error</w:t>
-            </w:r>
-            <w:proofErr w:type="spellEnd"/>
-            <w:r>
-              <w:t>]</w:t>
+              <w:t>[error]</w:t>
             </w:r>
           </w:p>
         </w:tc>
@@ -6771,51 +5763,19 @@
           </w:tcPr>
           <w:p>
             <w:r>
-              <w:t>[</w:t>
-            </w:r>
-            <w:proofErr w:type="spellStart"/>
-            <w:r>
-              <w:t>property</w:t>
-            </w:r>
-            <w:proofErr w:type="spellEnd"/>
-            <w:r>
-              <w:t xml:space="preserve"> </w:t>
-            </w:r>
-            <w:proofErr w:type="spellStart"/>
-            <w:r>
-              <w:t>nuovaValido</w:t>
-            </w:r>
-            <w:proofErr w:type="spellEnd"/>
-            <w:r>
-              <w:t>]</w:t>
+              <w:t>[property nuovaValido]</w:t>
             </w:r>
           </w:p>
           <w:p/>
           <w:p>
             <w:r>
-              <w:t>[</w:t>
-            </w:r>
-            <w:proofErr w:type="spellStart"/>
-            <w:r>
-              <w:t>error</w:t>
-            </w:r>
-            <w:proofErr w:type="spellEnd"/>
-            <w:r>
-              <w:t>]</w:t>
+              <w:t>[error]</w:t>
             </w:r>
           </w:p>
           <w:p/>
           <w:p>
             <w:r>
-              <w:t>[</w:t>
-            </w:r>
-            <w:proofErr w:type="spellStart"/>
-            <w:r>
-              <w:t>error</w:t>
-            </w:r>
-            <w:proofErr w:type="spellEnd"/>
-            <w:r>
-              <w:t>]</w:t>
+              <w:t>[error]</w:t>
             </w:r>
           </w:p>
         </w:tc>
@@ -6856,37 +5816,13 @@
           </w:tcPr>
           <w:p>
             <w:r>
-              <w:t>[</w:t>
-            </w:r>
-            <w:proofErr w:type="spellStart"/>
-            <w:r>
-              <w:t>if</w:t>
-            </w:r>
-            <w:proofErr w:type="spellEnd"/>
-            <w:r>
-              <w:t xml:space="preserve"> </w:t>
-            </w:r>
-            <w:proofErr w:type="spellStart"/>
-            <w:r>
-              <w:t>nuovaValida</w:t>
-            </w:r>
-            <w:proofErr w:type="spellEnd"/>
-            <w:r>
-              <w:t>]</w:t>
+              <w:t>[if nuovaValida]</w:t>
             </w:r>
           </w:p>
           <w:p/>
           <w:p>
             <w:r>
-              <w:t>[</w:t>
-            </w:r>
-            <w:proofErr w:type="spellStart"/>
-            <w:r>
-              <w:t>error</w:t>
-            </w:r>
-            <w:proofErr w:type="spellEnd"/>
-            <w:r>
-              <w:t>]</w:t>
+              <w:t>[error]</w:t>
             </w:r>
           </w:p>
         </w:tc>
@@ -7201,7 +6137,6 @@
             <w:r>
               <w:t xml:space="preserve">: Password aggiornata e </w:t>
             </w:r>
-            <w:proofErr w:type="spellStart"/>
             <w:r>
               <w:rPr>
                 <w:b/>
@@ -7209,7 +6144,6 @@
               </w:rPr>
               <w:t>redirect</w:t>
             </w:r>
-            <w:proofErr w:type="spellEnd"/>
             <w:r>
               <w:t xml:space="preserve"> </w:t>
             </w:r>
@@ -7300,7 +6234,6 @@
             <w:pPr>
               <w:spacing w:after="160" w:line="259" w:lineRule="auto"/>
             </w:pPr>
-            <w:proofErr w:type="spellStart"/>
             <w:r>
               <w:rPr>
                 <w:b/>
@@ -7308,7 +6241,6 @@
               </w:rPr>
               <w:t>Error</w:t>
             </w:r>
-            <w:proofErr w:type="spellEnd"/>
             <w:r>
               <w:t xml:space="preserve">: "Password attuale errata" </w:t>
             </w:r>
@@ -7399,7 +6331,6 @@
             <w:pPr>
               <w:spacing w:after="160" w:line="259" w:lineRule="auto"/>
             </w:pPr>
-            <w:proofErr w:type="spellStart"/>
             <w:r>
               <w:rPr>
                 <w:b/>
@@ -7407,7 +6338,6 @@
               </w:rPr>
               <w:t>Error</w:t>
             </w:r>
-            <w:proofErr w:type="spellEnd"/>
             <w:r>
               <w:t>: "Le nuova password inserite non coincidono"</w:t>
             </w:r>
@@ -7498,7 +6428,6 @@
             <w:pPr>
               <w:spacing w:after="160" w:line="259" w:lineRule="auto"/>
             </w:pPr>
-            <w:proofErr w:type="spellStart"/>
             <w:r>
               <w:rPr>
                 <w:b/>
@@ -7506,7 +6435,6 @@
               </w:rPr>
               <w:t>Error</w:t>
             </w:r>
-            <w:proofErr w:type="spellEnd"/>
             <w:r>
               <w:t xml:space="preserve">: "La nuova password non è sufficientemente sicura" </w:t>
             </w:r>
@@ -7590,7 +6518,6 @@
             <w:pPr>
               <w:spacing w:after="160" w:line="259" w:lineRule="auto"/>
             </w:pPr>
-            <w:proofErr w:type="spellStart"/>
             <w:r>
               <w:rPr>
                 <w:b/>
@@ -7598,7 +6525,6 @@
               </w:rPr>
               <w:t>Error</w:t>
             </w:r>
-            <w:proofErr w:type="spellEnd"/>
             <w:r>
               <w:t>: "Il campo 'password attuale' è obbligatorio"</w:t>
             </w:r>
@@ -7616,7 +6542,6 @@
       <w:r>
         <w:t xml:space="preserve">9.3 </w:t>
       </w:r>
-      <w:proofErr w:type="spellStart"/>
       <w:r>
         <w:t>Test_</w:t>
       </w:r>
@@ -7629,7 +6554,6 @@
       <w:r>
         <w:t>Task</w:t>
       </w:r>
-      <w:proofErr w:type="spellEnd"/>
       <w:r>
         <w:t xml:space="preserve"> (TC_3)</w:t>
       </w:r>
@@ -7664,7 +6588,6 @@
                 <w:bCs/>
               </w:rPr>
             </w:pPr>
-            <w:proofErr w:type="spellStart"/>
             <w:r>
               <w:rPr>
                 <w:b/>
@@ -7672,7 +6595,6 @@
               </w:rPr>
               <w:t>Category</w:t>
             </w:r>
-            <w:proofErr w:type="spellEnd"/>
           </w:p>
         </w:tc>
         <w:tc>
@@ -7787,55 +6709,23 @@
               <w:spacing w:after="160" w:line="259" w:lineRule="auto"/>
             </w:pPr>
             <w:r>
-              <w:t>[</w:t>
-            </w:r>
-            <w:proofErr w:type="spellStart"/>
-            <w:r>
-              <w:t>property</w:t>
-            </w:r>
-            <w:proofErr w:type="spellEnd"/>
-            <w:r>
-              <w:t xml:space="preserve"> </w:t>
-            </w:r>
-            <w:proofErr w:type="spellStart"/>
-            <w:r>
-              <w:t>TitoloOK</w:t>
-            </w:r>
-            <w:proofErr w:type="spellEnd"/>
-            <w:r>
-              <w:t>]</w:t>
-            </w:r>
-          </w:p>
-          <w:p>
-            <w:pPr>
-              <w:spacing w:after="160" w:line="259" w:lineRule="auto"/>
-            </w:pPr>
-            <w:r>
-              <w:t>[</w:t>
-            </w:r>
-            <w:proofErr w:type="spellStart"/>
-            <w:r>
-              <w:t>error</w:t>
-            </w:r>
-            <w:proofErr w:type="spellEnd"/>
-            <w:r>
-              <w:t>]</w:t>
-            </w:r>
-          </w:p>
-          <w:p>
-            <w:pPr>
-              <w:spacing w:after="160" w:line="259" w:lineRule="auto"/>
-            </w:pPr>
-            <w:r>
-              <w:t>[</w:t>
-            </w:r>
-            <w:proofErr w:type="spellStart"/>
-            <w:r>
-              <w:t>error</w:t>
-            </w:r>
-            <w:proofErr w:type="spellEnd"/>
-            <w:r>
-              <w:t>]</w:t>
+              <w:t>[property TitoloOK]</w:t>
+            </w:r>
+          </w:p>
+          <w:p>
+            <w:pPr>
+              <w:spacing w:after="160" w:line="259" w:lineRule="auto"/>
+            </w:pPr>
+            <w:r>
+              <w:t>[error]</w:t>
+            </w:r>
+          </w:p>
+          <w:p>
+            <w:pPr>
+              <w:spacing w:after="160" w:line="259" w:lineRule="auto"/>
+            </w:pPr>
+            <w:r>
+              <w:t>[error]</w:t>
             </w:r>
           </w:p>
         </w:tc>
@@ -7892,37 +6782,13 @@
           </w:tcPr>
           <w:p>
             <w:r>
-              <w:t>[</w:t>
-            </w:r>
-            <w:proofErr w:type="spellStart"/>
-            <w:r>
-              <w:t>property</w:t>
-            </w:r>
-            <w:proofErr w:type="spellEnd"/>
-            <w:r>
-              <w:t xml:space="preserve"> </w:t>
-            </w:r>
-            <w:proofErr w:type="spellStart"/>
-            <w:r>
-              <w:t>DipSelected</w:t>
-            </w:r>
-            <w:proofErr w:type="spellEnd"/>
-            <w:r>
-              <w:t>]</w:t>
+              <w:t>[property DipSelected]</w:t>
             </w:r>
           </w:p>
           <w:p/>
           <w:p>
             <w:r>
-              <w:t>[</w:t>
-            </w:r>
-            <w:proofErr w:type="spellStart"/>
-            <w:r>
-              <w:t>error</w:t>
-            </w:r>
-            <w:proofErr w:type="spellEnd"/>
-            <w:r>
-              <w:t>]</w:t>
+              <w:t>[error]</w:t>
             </w:r>
           </w:p>
         </w:tc>
@@ -7996,51 +6862,19 @@
           </w:tcPr>
           <w:p>
             <w:r>
-              <w:t>[</w:t>
-            </w:r>
-            <w:proofErr w:type="spellStart"/>
-            <w:r>
-              <w:t>property</w:t>
-            </w:r>
-            <w:proofErr w:type="spellEnd"/>
-            <w:r>
-              <w:t xml:space="preserve"> </w:t>
-            </w:r>
-            <w:proofErr w:type="spellStart"/>
-            <w:r>
-              <w:t>DataOK</w:t>
-            </w:r>
-            <w:proofErr w:type="spellEnd"/>
-            <w:r>
-              <w:t>]</w:t>
+              <w:t>[property DataOK]</w:t>
             </w:r>
           </w:p>
           <w:p/>
           <w:p>
             <w:r>
-              <w:t>[</w:t>
-            </w:r>
-            <w:proofErr w:type="spellStart"/>
-            <w:r>
-              <w:t>error</w:t>
-            </w:r>
-            <w:proofErr w:type="spellEnd"/>
-            <w:r>
-              <w:t>]</w:t>
+              <w:t>[error]</w:t>
             </w:r>
           </w:p>
           <w:p/>
           <w:p>
             <w:r>
-              <w:t>[</w:t>
-            </w:r>
-            <w:proofErr w:type="spellStart"/>
-            <w:r>
-              <w:t>error</w:t>
-            </w:r>
-            <w:proofErr w:type="spellEnd"/>
-            <w:r>
-              <w:t>]</w:t>
+              <w:t>[error]</w:t>
             </w:r>
           </w:p>
         </w:tc>
@@ -8097,37 +6931,13 @@
           </w:tcPr>
           <w:p>
             <w:r>
-              <w:t>[</w:t>
-            </w:r>
-            <w:proofErr w:type="spellStart"/>
-            <w:r>
-              <w:t>property</w:t>
-            </w:r>
-            <w:proofErr w:type="spellEnd"/>
-            <w:r>
-              <w:t xml:space="preserve"> </w:t>
-            </w:r>
-            <w:proofErr w:type="spellStart"/>
-            <w:r>
-              <w:t>PrioritàOK</w:t>
-            </w:r>
-            <w:proofErr w:type="spellEnd"/>
-            <w:r>
-              <w:t>]</w:t>
+              <w:t>[property PrioritàOK]</w:t>
             </w:r>
           </w:p>
           <w:p/>
           <w:p>
             <w:r>
-              <w:t>[</w:t>
-            </w:r>
-            <w:proofErr w:type="spellStart"/>
-            <w:r>
-              <w:t>error</w:t>
-            </w:r>
-            <w:proofErr w:type="spellEnd"/>
-            <w:r>
-              <w:t>]</w:t>
+              <w:t>[error]</w:t>
             </w:r>
           </w:p>
         </w:tc>
@@ -8184,37 +6994,13 @@
           </w:tcPr>
           <w:p>
             <w:r>
-              <w:t>[</w:t>
-            </w:r>
-            <w:proofErr w:type="spellStart"/>
-            <w:r>
-              <w:t>property</w:t>
-            </w:r>
-            <w:proofErr w:type="spellEnd"/>
-            <w:r>
-              <w:t xml:space="preserve"> </w:t>
-            </w:r>
-            <w:proofErr w:type="spellStart"/>
-            <w:r>
-              <w:t>IstruzioniOK</w:t>
-            </w:r>
-            <w:proofErr w:type="spellEnd"/>
-            <w:r>
-              <w:t>]</w:t>
+              <w:t>[property IstruzioniOK]</w:t>
             </w:r>
           </w:p>
           <w:p/>
           <w:p>
             <w:r>
-              <w:t>[</w:t>
-            </w:r>
-            <w:proofErr w:type="spellStart"/>
-            <w:r>
-              <w:t>error</w:t>
-            </w:r>
-            <w:proofErr w:type="spellEnd"/>
-            <w:r>
-              <w:t>]</w:t>
+              <w:t>[error]</w:t>
             </w:r>
           </w:p>
         </w:tc>
@@ -8307,52 +7093,20 @@
           <w:p>
             <w:r>
               <w:lastRenderedPageBreak/>
-              <w:t>[</w:t>
-            </w:r>
-            <w:proofErr w:type="spellStart"/>
-            <w:r>
-              <w:t>property</w:t>
-            </w:r>
-            <w:proofErr w:type="spellEnd"/>
-            <w:r>
-              <w:t xml:space="preserve"> </w:t>
-            </w:r>
-            <w:proofErr w:type="spellStart"/>
-            <w:r>
-              <w:t>FileOK</w:t>
-            </w:r>
-            <w:proofErr w:type="spellEnd"/>
-            <w:r>
-              <w:t>]</w:t>
+              <w:t>[property FileOK]</w:t>
             </w:r>
           </w:p>
           <w:p/>
           <w:p>
             <w:r>
               <w:lastRenderedPageBreak/>
-              <w:t>[</w:t>
-            </w:r>
-            <w:proofErr w:type="spellStart"/>
-            <w:r>
-              <w:t>error</w:t>
-            </w:r>
-            <w:proofErr w:type="spellEnd"/>
-            <w:r>
-              <w:t>]</w:t>
+              <w:t>[error]</w:t>
             </w:r>
           </w:p>
           <w:p/>
           <w:p>
             <w:r>
-              <w:t>[</w:t>
-            </w:r>
-            <w:proofErr w:type="spellStart"/>
-            <w:r>
-              <w:t>error</w:t>
-            </w:r>
-            <w:proofErr w:type="spellEnd"/>
-            <w:r>
-              <w:t>]</w:t>
+              <w:t>[error]</w:t>
             </w:r>
           </w:p>
           <w:p/>
@@ -8519,13 +7273,8 @@
           </w:tcPr>
           <w:p>
             <w:r>
-              <w:t>.pdf, .docx, .</w:t>
-            </w:r>
-            <w:proofErr w:type="spellStart"/>
-            <w:r>
-              <w:t>xlsx</w:t>
-            </w:r>
-            <w:proofErr w:type="spellEnd"/>
+              <w:t>.pdf, .docx, .xlsx</w:t>
+            </w:r>
             <w:r>
               <w:t>, dimensione</w:t>
             </w:r>
@@ -8831,21 +7580,7 @@
               <w:rPr>
                 <w:lang w:val="en-GB"/>
               </w:rPr>
-              <w:t xml:space="preserve"> </w:t>
-            </w:r>
-            <w:proofErr w:type="spellStart"/>
-            <w:r>
-              <w:rPr>
-                <w:lang w:val="en-GB"/>
-              </w:rPr>
-              <w:t>creato</w:t>
-            </w:r>
-            <w:proofErr w:type="spellEnd"/>
-            <w:r>
-              <w:rPr>
-                <w:lang w:val="en-GB"/>
-              </w:rPr>
-              <w:t xml:space="preserve">, </w:t>
+              <w:t xml:space="preserve"> creato, </w:t>
             </w:r>
             <w:r>
               <w:rPr>
@@ -9033,21 +7768,7 @@
               <w:rPr>
                 <w:lang w:val="en-GB"/>
               </w:rPr>
-              <w:t xml:space="preserve"> </w:t>
-            </w:r>
-            <w:proofErr w:type="spellStart"/>
-            <w:r>
-              <w:rPr>
-                <w:lang w:val="en-GB"/>
-              </w:rPr>
-              <w:t>salvati</w:t>
-            </w:r>
-            <w:proofErr w:type="spellEnd"/>
-            <w:r>
-              <w:rPr>
-                <w:lang w:val="en-GB"/>
-              </w:rPr>
-              <w:t xml:space="preserve"> </w:t>
+              <w:t xml:space="preserve"> salvati </w:t>
             </w:r>
           </w:p>
         </w:tc>
@@ -9164,7 +7885,6 @@
             <w:pPr>
               <w:spacing w:after="160" w:line="259" w:lineRule="auto"/>
             </w:pPr>
-            <w:proofErr w:type="spellStart"/>
             <w:r>
               <w:rPr>
                 <w:b/>
@@ -9172,17 +7892,8 @@
               </w:rPr>
               <w:t>Error</w:t>
             </w:r>
-            <w:proofErr w:type="spellEnd"/>
-            <w:r>
-              <w:t>: "Il campo '</w:t>
-            </w:r>
-            <w:proofErr w:type="spellStart"/>
-            <w:r>
-              <w:t>Titolo'</w:t>
-            </w:r>
-            <w:proofErr w:type="spellEnd"/>
-            <w:r>
-              <w:t xml:space="preserve"> è obbligatorio" </w:t>
+            <w:r>
+              <w:t xml:space="preserve">: "Il campo 'Titolo' è obbligatorio" </w:t>
             </w:r>
           </w:p>
         </w:tc>
@@ -9299,7 +8010,6 @@
             <w:pPr>
               <w:spacing w:after="160" w:line="259" w:lineRule="auto"/>
             </w:pPr>
-            <w:proofErr w:type="spellStart"/>
             <w:r>
               <w:rPr>
                 <w:b/>
@@ -9307,7 +8017,6 @@
               </w:rPr>
               <w:t>Error</w:t>
             </w:r>
-            <w:proofErr w:type="spellEnd"/>
             <w:r>
               <w:t xml:space="preserve">: "Per favore scegliere un dipendente" </w:t>
             </w:r>
@@ -9426,7 +8135,6 @@
             <w:pPr>
               <w:spacing w:after="160" w:line="259" w:lineRule="auto"/>
             </w:pPr>
-            <w:proofErr w:type="spellStart"/>
             <w:r>
               <w:rPr>
                 <w:b/>
@@ -9434,7 +8142,6 @@
               </w:rPr>
               <w:t>Error</w:t>
             </w:r>
-            <w:proofErr w:type="spellEnd"/>
             <w:r>
               <w:t xml:space="preserve">: "Data di scadenza obbligatoria e in formato valido" </w:t>
             </w:r>
@@ -9553,7 +8260,6 @@
             <w:pPr>
               <w:spacing w:after="160" w:line="259" w:lineRule="auto"/>
             </w:pPr>
-            <w:proofErr w:type="spellStart"/>
             <w:r>
               <w:rPr>
                 <w:b/>
@@ -9561,7 +8267,6 @@
               </w:rPr>
               <w:t>Error</w:t>
             </w:r>
-            <w:proofErr w:type="spellEnd"/>
             <w:r>
               <w:t>: "Inserire istruzioni (min. 10</w:t>
             </w:r>
@@ -9693,7 +8398,6 @@
             <w:pPr>
               <w:spacing w:after="160" w:line="259" w:lineRule="auto"/>
             </w:pPr>
-            <w:proofErr w:type="spellStart"/>
             <w:r>
               <w:rPr>
                 <w:b/>
@@ -9701,7 +8405,6 @@
               </w:rPr>
               <w:t>Error</w:t>
             </w:r>
-            <w:proofErr w:type="spellEnd"/>
             <w:r>
               <w:t xml:space="preserve">: "Inserito file non consentito" </w:t>
             </w:r>
@@ -9820,7 +8523,6 @@
             <w:pPr>
               <w:spacing w:after="160" w:line="259" w:lineRule="auto"/>
             </w:pPr>
-            <w:proofErr w:type="spellStart"/>
             <w:r>
               <w:rPr>
                 <w:b/>
@@ -9828,7 +8530,6 @@
               </w:rPr>
               <w:t>Error</w:t>
             </w:r>
-            <w:proofErr w:type="spellEnd"/>
             <w:r>
               <w:t xml:space="preserve">: "Il file supera la dimensione massima" </w:t>
             </w:r>
@@ -9845,7 +8546,6 @@
       <w:r>
         <w:t xml:space="preserve">9.4 </w:t>
       </w:r>
-      <w:proofErr w:type="spellStart"/>
       <w:r>
         <w:t>Test_</w:t>
       </w:r>
@@ -9858,7 +8558,6 @@
       <w:r>
         <w:t>task</w:t>
       </w:r>
-      <w:proofErr w:type="spellEnd"/>
       <w:r>
         <w:t xml:space="preserve"> (TC_4)</w:t>
       </w:r>
@@ -9893,7 +8592,6 @@
                 <w:bCs/>
               </w:rPr>
             </w:pPr>
-            <w:proofErr w:type="spellStart"/>
             <w:r>
               <w:rPr>
                 <w:b/>
@@ -9901,7 +8599,6 @@
               </w:rPr>
               <w:t>Category</w:t>
             </w:r>
-            <w:proofErr w:type="spellEnd"/>
           </w:p>
         </w:tc>
         <w:tc>
@@ -10012,71 +8709,31 @@
               <w:spacing w:after="160" w:line="259" w:lineRule="auto"/>
             </w:pPr>
             <w:r>
-              <w:t>[</w:t>
-            </w:r>
-            <w:proofErr w:type="spellStart"/>
-            <w:r>
-              <w:t>property</w:t>
-            </w:r>
-            <w:proofErr w:type="spellEnd"/>
-            <w:r>
-              <w:t xml:space="preserve"> </w:t>
-            </w:r>
-            <w:proofErr w:type="spellStart"/>
-            <w:r>
-              <w:t>StatoValido</w:t>
-            </w:r>
-            <w:proofErr w:type="spellEnd"/>
-            <w:r>
-              <w:t>]</w:t>
-            </w:r>
-          </w:p>
-          <w:p>
-            <w:pPr>
-              <w:spacing w:after="160" w:line="259" w:lineRule="auto"/>
-            </w:pPr>
-            <w:r>
-              <w:t>[</w:t>
-            </w:r>
-            <w:proofErr w:type="spellStart"/>
-            <w:r>
-              <w:t>error</w:t>
-            </w:r>
-            <w:proofErr w:type="spellEnd"/>
-            <w:r>
-              <w:t>]</w:t>
-            </w:r>
-          </w:p>
-          <w:p>
-            <w:pPr>
-              <w:spacing w:after="160" w:line="259" w:lineRule="auto"/>
-            </w:pPr>
-            <w:r>
-              <w:t>[</w:t>
-            </w:r>
-            <w:proofErr w:type="spellStart"/>
-            <w:r>
-              <w:t>error</w:t>
-            </w:r>
-            <w:proofErr w:type="spellEnd"/>
-            <w:r>
-              <w:t>]</w:t>
-            </w:r>
-          </w:p>
-          <w:p>
-            <w:pPr>
-              <w:spacing w:after="160" w:line="259" w:lineRule="auto"/>
-            </w:pPr>
-            <w:r>
-              <w:t>[</w:t>
-            </w:r>
-            <w:proofErr w:type="spellStart"/>
-            <w:r>
-              <w:t>error</w:t>
-            </w:r>
-            <w:proofErr w:type="spellEnd"/>
-            <w:r>
-              <w:t>]</w:t>
+              <w:t>[property StatoValido]</w:t>
+            </w:r>
+          </w:p>
+          <w:p>
+            <w:pPr>
+              <w:spacing w:after="160" w:line="259" w:lineRule="auto"/>
+            </w:pPr>
+            <w:r>
+              <w:t>[error]</w:t>
+            </w:r>
+          </w:p>
+          <w:p>
+            <w:pPr>
+              <w:spacing w:after="160" w:line="259" w:lineRule="auto"/>
+            </w:pPr>
+            <w:r>
+              <w:t>[error]</w:t>
+            </w:r>
+          </w:p>
+          <w:p>
+            <w:pPr>
+              <w:spacing w:after="160" w:line="259" w:lineRule="auto"/>
+            </w:pPr>
+            <w:r>
+              <w:t>[error]</w:t>
             </w:r>
           </w:p>
         </w:tc>
@@ -10123,51 +8780,19 @@
           </w:tcPr>
           <w:p>
             <w:r>
-              <w:t>[</w:t>
-            </w:r>
-            <w:proofErr w:type="spellStart"/>
-            <w:r>
-              <w:t>property</w:t>
-            </w:r>
-            <w:proofErr w:type="spellEnd"/>
-            <w:r>
-              <w:t xml:space="preserve"> </w:t>
-            </w:r>
-            <w:proofErr w:type="spellStart"/>
-            <w:r>
-              <w:t>MotivazioneOK</w:t>
-            </w:r>
-            <w:proofErr w:type="spellEnd"/>
-            <w:r>
-              <w:t>]</w:t>
+              <w:t>[property MotivazioneOK]</w:t>
             </w:r>
           </w:p>
           <w:p/>
           <w:p>
             <w:r>
-              <w:t>[</w:t>
-            </w:r>
-            <w:proofErr w:type="spellStart"/>
-            <w:r>
-              <w:t>error</w:t>
-            </w:r>
-            <w:proofErr w:type="spellEnd"/>
-            <w:r>
-              <w:t>]</w:t>
+              <w:t>[error]</w:t>
             </w:r>
           </w:p>
           <w:p/>
           <w:p>
             <w:r>
-              <w:t>[</w:t>
-            </w:r>
-            <w:proofErr w:type="spellStart"/>
-            <w:r>
-              <w:t>error</w:t>
-            </w:r>
-            <w:proofErr w:type="spellEnd"/>
-            <w:r>
-              <w:t>]</w:t>
+              <w:t>[error]</w:t>
             </w:r>
           </w:p>
         </w:tc>
@@ -10518,7 +9143,6 @@
             <w:pPr>
               <w:spacing w:after="160" w:line="259" w:lineRule="auto"/>
             </w:pPr>
-            <w:proofErr w:type="spellStart"/>
             <w:r>
               <w:rPr>
                 <w:b/>
@@ -10526,7 +9150,6 @@
               </w:rPr>
               <w:t>Error</w:t>
             </w:r>
-            <w:proofErr w:type="spellEnd"/>
             <w:r>
               <w:t>: "È obbligatorio inserire una motivazione... (minimo 10</w:t>
             </w:r>
@@ -10602,7 +9225,6 @@
             <w:pPr>
               <w:spacing w:after="160" w:line="259" w:lineRule="auto"/>
             </w:pPr>
-            <w:proofErr w:type="spellStart"/>
             <w:r>
               <w:rPr>
                 <w:b/>
@@ -10610,7 +9232,6 @@
               </w:rPr>
               <w:t>Error</w:t>
             </w:r>
-            <w:proofErr w:type="spellEnd"/>
             <w:r>
               <w:t>: possibilità di sospendere il task non disponibile</w:t>
             </w:r>
@@ -10639,7 +9260,14 @@
                 <w:b/>
                 <w:bCs/>
               </w:rPr>
-              <w:t>4.5</w:t>
+              <w:t>4.</w:t>
+            </w:r>
+            <w:r>
+              <w:rPr>
+                <w:b/>
+                <w:bCs/>
+              </w:rPr>
+              <w:t>4</w:t>
             </w:r>
           </w:p>
         </w:tc>
@@ -10680,7 +9308,6 @@
             <w:pPr>
               <w:spacing w:after="160" w:line="259" w:lineRule="auto"/>
             </w:pPr>
-            <w:proofErr w:type="spellStart"/>
             <w:r>
               <w:rPr>
                 <w:b/>
@@ -10688,7 +9315,6 @@
               </w:rPr>
               <w:t>Error</w:t>
             </w:r>
-            <w:proofErr w:type="spellEnd"/>
             <w:r>
               <w:rPr>
                 <w:b/>
@@ -10730,7 +9356,14 @@
                 <w:b/>
                 <w:bCs/>
               </w:rPr>
-              <w:t>4.6</w:t>
+              <w:t>4.</w:t>
+            </w:r>
+            <w:r>
+              <w:rPr>
+                <w:b/>
+                <w:bCs/>
+              </w:rPr>
+              <w:t>5</w:t>
             </w:r>
           </w:p>
         </w:tc>
@@ -10771,7 +9404,6 @@
             <w:pPr>
               <w:spacing w:after="160" w:line="259" w:lineRule="auto"/>
             </w:pPr>
-            <w:proofErr w:type="spellStart"/>
             <w:r>
               <w:rPr>
                 <w:b/>
@@ -10779,7 +9411,6 @@
               </w:rPr>
               <w:t>Error</w:t>
             </w:r>
-            <w:proofErr w:type="spellEnd"/>
             <w:r>
               <w:t>:</w:t>
             </w:r>
@@ -10814,7 +9445,14 @@
                 <w:b/>
                 <w:bCs/>
               </w:rPr>
-              <w:t>4.7</w:t>
+              <w:t>4.</w:t>
+            </w:r>
+            <w:r>
+              <w:rPr>
+                <w:b/>
+                <w:bCs/>
+              </w:rPr>
+              <w:t>6</w:t>
             </w:r>
           </w:p>
         </w:tc>
@@ -10859,7 +9497,6 @@
             <w:pPr>
               <w:spacing w:after="160" w:line="259" w:lineRule="auto"/>
             </w:pPr>
-            <w:proofErr w:type="spellStart"/>
             <w:r>
               <w:rPr>
                 <w:b/>
@@ -10867,7 +9504,6 @@
               </w:rPr>
               <w:t>Error</w:t>
             </w:r>
-            <w:proofErr w:type="spellEnd"/>
             <w:r>
               <w:t xml:space="preserve">: Motivazione obbligatoria </w:t>
             </w:r>
@@ -10885,7 +9521,6 @@
       <w:r>
         <w:t xml:space="preserve">9.5 </w:t>
       </w:r>
-      <w:proofErr w:type="spellStart"/>
       <w:r>
         <w:t>Test_</w:t>
       </w:r>
@@ -10898,7 +9533,6 @@
       <w:r>
         <w:t>account</w:t>
       </w:r>
-      <w:proofErr w:type="spellEnd"/>
       <w:r>
         <w:t xml:space="preserve"> (TC_5)</w:t>
       </w:r>
@@ -10933,7 +9567,6 @@
                 <w:bCs/>
               </w:rPr>
             </w:pPr>
-            <w:proofErr w:type="spellStart"/>
             <w:r>
               <w:rPr>
                 <w:b/>
@@ -10941,7 +9574,6 @@
               </w:rPr>
               <w:t>Category</w:t>
             </w:r>
-            <w:proofErr w:type="spellEnd"/>
           </w:p>
         </w:tc>
         <w:tc>
@@ -11031,51 +9663,19 @@
           </w:tcPr>
           <w:p>
             <w:r>
-              <w:t>[</w:t>
-            </w:r>
-            <w:proofErr w:type="spellStart"/>
-            <w:r>
-              <w:t>property</w:t>
-            </w:r>
-            <w:proofErr w:type="spellEnd"/>
-            <w:r>
-              <w:t xml:space="preserve"> </w:t>
-            </w:r>
-            <w:proofErr w:type="spellStart"/>
-            <w:r>
-              <w:t>NomeOK</w:t>
-            </w:r>
-            <w:proofErr w:type="spellEnd"/>
-            <w:r>
-              <w:t>]</w:t>
+              <w:t>[property NomeOK]</w:t>
             </w:r>
           </w:p>
           <w:p/>
           <w:p>
             <w:r>
-              <w:t>[</w:t>
-            </w:r>
-            <w:proofErr w:type="spellStart"/>
-            <w:r>
-              <w:t>error</w:t>
-            </w:r>
-            <w:proofErr w:type="spellEnd"/>
-            <w:r>
-              <w:t>]</w:t>
+              <w:t>[error]</w:t>
             </w:r>
           </w:p>
           <w:p/>
           <w:p>
             <w:r>
-              <w:t>[</w:t>
-            </w:r>
-            <w:proofErr w:type="spellStart"/>
-            <w:r>
-              <w:t>error</w:t>
-            </w:r>
-            <w:proofErr w:type="spellEnd"/>
-            <w:r>
-              <w:t>]</w:t>
+              <w:t>[error]</w:t>
             </w:r>
           </w:p>
         </w:tc>
@@ -11122,51 +9722,19 @@
           </w:tcPr>
           <w:p>
             <w:r>
-              <w:t>[</w:t>
-            </w:r>
-            <w:proofErr w:type="spellStart"/>
-            <w:r>
-              <w:t>property</w:t>
-            </w:r>
-            <w:proofErr w:type="spellEnd"/>
-            <w:r>
-              <w:t xml:space="preserve"> </w:t>
-            </w:r>
-            <w:proofErr w:type="spellStart"/>
-            <w:r>
-              <w:t>CognomeOK</w:t>
-            </w:r>
-            <w:proofErr w:type="spellEnd"/>
-            <w:r>
-              <w:t>]</w:t>
+              <w:t>[property CognomeOK]</w:t>
             </w:r>
           </w:p>
           <w:p/>
           <w:p>
             <w:r>
-              <w:t>[</w:t>
-            </w:r>
-            <w:proofErr w:type="spellStart"/>
-            <w:r>
-              <w:t>error</w:t>
-            </w:r>
-            <w:proofErr w:type="spellEnd"/>
-            <w:r>
-              <w:t>]</w:t>
+              <w:t>[error]</w:t>
             </w:r>
           </w:p>
           <w:p/>
           <w:p>
             <w:r>
-              <w:t>[</w:t>
-            </w:r>
-            <w:proofErr w:type="spellStart"/>
-            <w:r>
-              <w:t>error</w:t>
-            </w:r>
-            <w:proofErr w:type="spellEnd"/>
-            <w:r>
-              <w:t>]</w:t>
+              <w:t>[error]</w:t>
             </w:r>
           </w:p>
         </w:tc>
@@ -11180,11 +9748,9 @@
             <w:tcW w:w="2263" w:type="dxa"/>
           </w:tcPr>
           <w:p>
-            <w:proofErr w:type="gramStart"/>
             <w:r>
               <w:t>Email</w:t>
             </w:r>
-            <w:proofErr w:type="gramEnd"/>
           </w:p>
         </w:tc>
         <w:tc>
@@ -11229,21 +9795,7 @@
               <w:rPr>
                 <w:lang w:val="en-GB"/>
               </w:rPr>
-              <w:t xml:space="preserve">[property </w:t>
-            </w:r>
-            <w:proofErr w:type="spellStart"/>
-            <w:r>
-              <w:rPr>
-                <w:lang w:val="en-GB"/>
-              </w:rPr>
-              <w:t>EmailOK</w:t>
-            </w:r>
-            <w:proofErr w:type="spellEnd"/>
-            <w:r>
-              <w:rPr>
-                <w:lang w:val="en-GB"/>
-              </w:rPr>
-              <w:t>]</w:t>
+              <w:t>[property EmailOK]</w:t>
             </w:r>
           </w:p>
           <w:p>
@@ -11350,51 +9902,19 @@
           </w:tcPr>
           <w:p>
             <w:r>
-              <w:t>[</w:t>
-            </w:r>
-            <w:proofErr w:type="spellStart"/>
-            <w:r>
-              <w:t>property</w:t>
-            </w:r>
-            <w:proofErr w:type="spellEnd"/>
-            <w:r>
-              <w:t xml:space="preserve"> </w:t>
-            </w:r>
-            <w:proofErr w:type="spellStart"/>
-            <w:r>
-              <w:t>DataOK</w:t>
-            </w:r>
-            <w:proofErr w:type="spellEnd"/>
-            <w:r>
-              <w:t>]</w:t>
+              <w:t>[property DataOK]</w:t>
             </w:r>
           </w:p>
           <w:p/>
           <w:p>
             <w:r>
-              <w:t>[</w:t>
-            </w:r>
-            <w:proofErr w:type="spellStart"/>
-            <w:r>
-              <w:t>error</w:t>
-            </w:r>
-            <w:proofErr w:type="spellEnd"/>
-            <w:r>
-              <w:t>]</w:t>
+              <w:t>[error]</w:t>
             </w:r>
           </w:p>
           <w:p/>
           <w:p>
             <w:r>
-              <w:t>[</w:t>
-            </w:r>
-            <w:proofErr w:type="spellStart"/>
-            <w:r>
-              <w:t>error</w:t>
-            </w:r>
-            <w:proofErr w:type="spellEnd"/>
-            <w:r>
-              <w:t>]</w:t>
+              <w:t>[error]</w:t>
             </w:r>
           </w:p>
         </w:tc>
@@ -11437,15 +9957,7 @@
           <w:p/>
           <w:p>
             <w:r>
-              <w:t>[</w:t>
-            </w:r>
-            <w:proofErr w:type="spellStart"/>
-            <w:r>
-              <w:t>error</w:t>
-            </w:r>
-            <w:proofErr w:type="spellEnd"/>
-            <w:r>
-              <w:t>]</w:t>
+              <w:t>[error]</w:t>
             </w:r>
           </w:p>
         </w:tc>
@@ -11481,23 +9993,7 @@
           </w:tcPr>
           <w:p>
             <w:r>
-              <w:t>[</w:t>
-            </w:r>
-            <w:proofErr w:type="spellStart"/>
-            <w:r>
-              <w:t>property</w:t>
-            </w:r>
-            <w:proofErr w:type="spellEnd"/>
-            <w:r>
-              <w:t xml:space="preserve"> </w:t>
-            </w:r>
-            <w:proofErr w:type="spellStart"/>
-            <w:r>
-              <w:t>MatGenOK</w:t>
-            </w:r>
-            <w:proofErr w:type="spellEnd"/>
-            <w:r>
-              <w:t>]</w:t>
+              <w:t>[property MatGenOK]</w:t>
             </w:r>
           </w:p>
         </w:tc>
@@ -11538,37 +10034,13 @@
           </w:tcPr>
           <w:p>
             <w:r>
-              <w:t>[</w:t>
-            </w:r>
-            <w:proofErr w:type="spellStart"/>
-            <w:r>
-              <w:t>property</w:t>
-            </w:r>
-            <w:proofErr w:type="spellEnd"/>
-            <w:r>
-              <w:t xml:space="preserve"> </w:t>
-            </w:r>
-            <w:proofErr w:type="spellStart"/>
-            <w:r>
-              <w:t>passgenOK</w:t>
-            </w:r>
-            <w:proofErr w:type="spellEnd"/>
-            <w:r>
-              <w:t>]</w:t>
+              <w:t>[property passgenOK]</w:t>
             </w:r>
           </w:p>
           <w:p/>
           <w:p>
             <w:r>
-              <w:t>[</w:t>
-            </w:r>
-            <w:proofErr w:type="spellStart"/>
-            <w:r>
-              <w:t>error</w:t>
-            </w:r>
-            <w:proofErr w:type="spellEnd"/>
-            <w:r>
-              <w:t>]</w:t>
+              <w:t>[error]</w:t>
             </w:r>
           </w:p>
         </w:tc>
@@ -11658,15 +10130,7 @@
           </w:tcPr>
           <w:p>
             <w:r>
-              <w:t>^[a-</w:t>
-            </w:r>
-            <w:proofErr w:type="spellStart"/>
-            <w:r>
-              <w:t>zA</w:t>
-            </w:r>
-            <w:proofErr w:type="spellEnd"/>
-            <w:r>
-              <w:t>-Z]{1,50}$</w:t>
+              <w:t>^[a-zA-Z]{1,50}$</w:t>
             </w:r>
           </w:p>
         </w:tc>
@@ -11691,15 +10155,7 @@
           </w:tcPr>
           <w:p>
             <w:r>
-              <w:t>^[a-</w:t>
-            </w:r>
-            <w:proofErr w:type="spellStart"/>
-            <w:r>
-              <w:t>zA</w:t>
-            </w:r>
-            <w:proofErr w:type="spellEnd"/>
-            <w:r>
-              <w:t>-Z]{1,50}$</w:t>
+              <w:t>^[a-zA-Z]{1,50}$</w:t>
             </w:r>
           </w:p>
         </w:tc>
@@ -11713,11 +10169,9 @@
             <w:tcW w:w="1696" w:type="dxa"/>
           </w:tcPr>
           <w:p>
-            <w:proofErr w:type="gramStart"/>
             <w:r>
               <w:t>Email</w:t>
             </w:r>
-            <w:proofErr w:type="gramEnd"/>
           </w:p>
         </w:tc>
         <w:tc>
@@ -12207,7 +10661,6 @@
             <w:pPr>
               <w:spacing w:after="160" w:line="259" w:lineRule="auto"/>
             </w:pPr>
-            <w:proofErr w:type="spellStart"/>
             <w:r>
               <w:rPr>
                 <w:b/>
@@ -12215,7 +10668,6 @@
               </w:rPr>
               <w:t>Error</w:t>
             </w:r>
-            <w:proofErr w:type="spellEnd"/>
             <w:r>
               <w:t xml:space="preserve">: "Indirizzo e-mail già utilizzato" </w:t>
             </w:r>
@@ -12337,7 +10789,6 @@
             <w:pPr>
               <w:spacing w:after="160" w:line="259" w:lineRule="auto"/>
             </w:pPr>
-            <w:proofErr w:type="spellStart"/>
             <w:r>
               <w:rPr>
                 <w:b/>
@@ -12345,7 +10796,6 @@
               </w:rPr>
               <w:t>Error</w:t>
             </w:r>
-            <w:proofErr w:type="spellEnd"/>
             <w:r>
               <w:t>: "Il campo 'nome' è obbligatorio"</w:t>
             </w:r>
@@ -12467,7 +10917,6 @@
             <w:pPr>
               <w:spacing w:after="160" w:line="259" w:lineRule="auto"/>
             </w:pPr>
-            <w:proofErr w:type="spellStart"/>
             <w:r>
               <w:rPr>
                 <w:b/>
@@ -12475,7 +10924,6 @@
               </w:rPr>
               <w:t>Error</w:t>
             </w:r>
-            <w:proofErr w:type="spellEnd"/>
             <w:r>
               <w:t xml:space="preserve">: "Formato data non valido" </w:t>
             </w:r>
@@ -12597,7 +11045,6 @@
             <w:pPr>
               <w:spacing w:after="160" w:line="259" w:lineRule="auto"/>
             </w:pPr>
-            <w:proofErr w:type="spellStart"/>
             <w:r>
               <w:rPr>
                 <w:b/>
@@ -12605,17 +11052,8 @@
               </w:rPr>
               <w:t>Error</w:t>
             </w:r>
-            <w:proofErr w:type="spellEnd"/>
-            <w:r>
-              <w:t xml:space="preserve">: "Il campo 'data di </w:t>
-            </w:r>
-            <w:proofErr w:type="spellStart"/>
-            <w:r>
-              <w:t>nascita'</w:t>
-            </w:r>
-            <w:proofErr w:type="spellEnd"/>
-            <w:r>
-              <w:t xml:space="preserve"> è obbligatorio" </w:t>
+            <w:r>
+              <w:t xml:space="preserve">: "Il campo 'data di nascita' è obbligatorio" </w:t>
             </w:r>
           </w:p>
         </w:tc>
@@ -12735,7 +11173,6 @@
             <w:pPr>
               <w:spacing w:after="160" w:line="259" w:lineRule="auto"/>
             </w:pPr>
-            <w:proofErr w:type="spellStart"/>
             <w:r>
               <w:rPr>
                 <w:b/>
@@ -12743,7 +11180,6 @@
               </w:rPr>
               <w:t>Error</w:t>
             </w:r>
-            <w:proofErr w:type="spellEnd"/>
             <w:r>
               <w:t xml:space="preserve">: "Il formato e-mail non </w:t>
             </w:r>
@@ -12869,7 +11305,6 @@
             <w:pPr>
               <w:spacing w:after="160" w:line="259" w:lineRule="auto"/>
             </w:pPr>
-            <w:proofErr w:type="spellStart"/>
             <w:r>
               <w:rPr>
                 <w:b/>
@@ -12877,7 +11312,6 @@
               </w:rPr>
               <w:t>Error</w:t>
             </w:r>
-            <w:proofErr w:type="spellEnd"/>
             <w:r>
               <w:t>: "</w:t>
             </w:r>
@@ -12978,21 +11412,12 @@
                 <w:bCs/>
               </w:rPr>
             </w:pPr>
-            <w:proofErr w:type="spellStart"/>
-            <w:r>
-              <w:rPr>
-                <w:b/>
-                <w:bCs/>
-              </w:rPr>
-              <w:t>Error</w:t>
-            </w:r>
-            <w:proofErr w:type="spellEnd"/>
-            <w:r>
-              <w:rPr>
-                <w:b/>
-                <w:bCs/>
-              </w:rPr>
-              <w:t xml:space="preserve">: </w:t>
+            <w:r>
+              <w:rPr>
+                <w:b/>
+                <w:bCs/>
+              </w:rPr>
+              <w:t xml:space="preserve">Error: </w:t>
             </w:r>
             <w:r>
               <w:t>“</w:t>
@@ -13085,21 +11510,12 @@
             <w:tcW w:w="2151" w:type="dxa"/>
           </w:tcPr>
           <w:p>
-            <w:proofErr w:type="spellStart"/>
-            <w:r>
-              <w:rPr>
-                <w:b/>
-                <w:bCs/>
-              </w:rPr>
-              <w:t>Error</w:t>
-            </w:r>
-            <w:proofErr w:type="spellEnd"/>
-            <w:r>
-              <w:rPr>
-                <w:b/>
-                <w:bCs/>
-              </w:rPr>
-              <w:t xml:space="preserve">: </w:t>
+            <w:r>
+              <w:rPr>
+                <w:b/>
+                <w:bCs/>
+              </w:rPr>
+              <w:t xml:space="preserve">Error: </w:t>
             </w:r>
             <w:r>
               <w:t>“Campo ‘cognome’ obbligatorio”</w:t>
@@ -13133,15 +11549,7 @@
     <w:p/>
     <w:p>
       <w:r>
-        <w:t xml:space="preserve">Le attività di testing per il sistema E.W.M.S. non sono concepite come una fase isolata al termine dello sviluppo, ma sono integrate nell'intero ciclo di vita del software engineering. Il processo prevede che lo </w:t>
-      </w:r>
-      <w:proofErr w:type="spellStart"/>
-      <w:r>
-        <w:t>unit</w:t>
-      </w:r>
-      <w:proofErr w:type="spellEnd"/>
-      <w:r>
-        <w:t xml:space="preserve"> testing venga eseguito non appena le singole unità logiche risultano pront</w:t>
+        <w:t>Le attività di testing per il sistema E.W.M.S. non sono concepite come una fase isolata al termine dello sviluppo, ma sono integrate nell'intero ciclo di vita del software engineering. Il processo prevede che lo unit testing venga eseguito non appena le singole unità logiche risultano pront</w:t>
       </w:r>
       <w:r>
         <w:t>e</w:t>
@@ -13152,83 +11560,19 @@
     </w:p>
     <w:p>
       <w:r>
-        <w:t xml:space="preserve">Inoltre, la suite di test è considerata un'entità dinamica. Durante lo sviluppo, </w:t>
-      </w:r>
-      <w:proofErr w:type="gramStart"/>
-      <w:r>
-        <w:t>il team</w:t>
-      </w:r>
-      <w:proofErr w:type="gramEnd"/>
-      <w:r>
-        <w:t xml:space="preserve"> </w:t>
+        <w:t xml:space="preserve">Inoltre, la suite di test è considerata un'entità dinamica. Durante lo sviluppo, il team </w:t>
       </w:r>
       <w:r>
         <w:t>aggiungerà</w:t>
       </w:r>
       <w:r>
-        <w:t xml:space="preserve"> nuovi test </w:t>
-      </w:r>
-      <w:proofErr w:type="spellStart"/>
-      <w:r>
-        <w:t>cases</w:t>
-      </w:r>
-      <w:proofErr w:type="spellEnd"/>
-      <w:r>
-        <w:t xml:space="preserve"> </w:t>
+        <w:t xml:space="preserve"> nuovi test cases </w:t>
       </w:r>
       <w:r>
         <w:t xml:space="preserve">man mano che lo sviluppo porta ad un miglior comprensione del sistema e dei suoi requisiti o </w:t>
       </w:r>
       <w:r>
-        <w:t xml:space="preserve">qualora emergano scenari d'uso non previsti inizialmente o nel caso in cui la scomposizione gerarchica delle nuove funzionalità riveli ulteriori </w:t>
-      </w:r>
-      <w:proofErr w:type="spellStart"/>
-      <w:r>
-        <w:t>boundary</w:t>
-      </w:r>
-      <w:proofErr w:type="spellEnd"/>
-      <w:r>
-        <w:t xml:space="preserve"> </w:t>
-      </w:r>
-      <w:proofErr w:type="spellStart"/>
-      <w:r>
-        <w:t>values</w:t>
-      </w:r>
-      <w:proofErr w:type="spellEnd"/>
-      <w:r>
-        <w:t xml:space="preserve"> critici. Questo garantisce che la copertura dei </w:t>
-      </w:r>
-      <w:proofErr w:type="spellStart"/>
-      <w:r>
-        <w:t>functional</w:t>
-      </w:r>
-      <w:proofErr w:type="spellEnd"/>
-      <w:r>
-        <w:t xml:space="preserve"> </w:t>
-      </w:r>
-      <w:proofErr w:type="spellStart"/>
-      <w:r>
-        <w:t>requirements</w:t>
-      </w:r>
-      <w:proofErr w:type="spellEnd"/>
-      <w:r>
-        <w:t xml:space="preserve"> rimanga completa e aggiornata rispetto all'evoluzione della business </w:t>
-      </w:r>
-      <w:proofErr w:type="spellStart"/>
-      <w:r>
-        <w:t>logic</w:t>
-      </w:r>
-      <w:proofErr w:type="spellEnd"/>
-      <w:r>
-        <w:t xml:space="preserve"> e delle interfacce definite nell'Object Design </w:t>
-      </w:r>
-      <w:proofErr w:type="spellStart"/>
-      <w:r>
-        <w:t>Document</w:t>
-      </w:r>
-      <w:proofErr w:type="spellEnd"/>
-      <w:r>
-        <w:t>.</w:t>
+        <w:t>qualora emergano scenari d'uso non previsti inizialmente o nel caso in cui la scomposizione gerarchica delle nuove funzionalità riveli ulteriori boundary values critici. Questo garantisce che la copertura dei functional requirements rimanga completa e aggiornata rispetto all'evoluzione della business logic e delle interfacce definite nell'Object Design Document.</w:t>
       </w:r>
     </w:p>
     <w:p/>

</xml_diff>

<commit_message>
Mod: modificati e aggiunti in execution tutte le esecuzioni fatte
</commit_message>
<xml_diff>
--- a/Workspace/Testing/Test plan/TestPlan_EWMS.docx
+++ b/Workspace/Testing/Test plan/TestPlan_EWMS.docx
@@ -1913,7 +1913,7 @@
       <w:r>
         <w:fldChar w:fldCharType="separate"/>
       </w:r>
-      <w:hyperlink w:anchor="_Toc217148111" w:history="1">
+      <w:hyperlink w:anchor="_Toc221350306" w:history="1">
         <w:r>
           <w:rPr>
             <w:rStyle w:val="Collegamentoipertestuale"/>
@@ -1957,7 +1957,7 @@
             <w:noProof/>
             <w:webHidden/>
           </w:rPr>
-          <w:instrText xml:space="preserve"> PAGEREF _Toc217148111 \h </w:instrText>
+          <w:instrText xml:space="preserve"> PAGEREF _Toc221350306 \h </w:instrText>
         </w:r>
         <w:r>
           <w:rPr>
@@ -2002,7 +2002,7 @@
           <w14:ligatures w14:val="standardContextual"/>
         </w:rPr>
       </w:pPr>
-      <w:hyperlink w:anchor="_Toc217148112" w:history="1">
+      <w:hyperlink w:anchor="_Toc221350307" w:history="1">
         <w:r>
           <w:rPr>
             <w:rStyle w:val="Collegamentoipertestuale"/>
@@ -2046,7 +2046,7 @@
             <w:noProof/>
             <w:webHidden/>
           </w:rPr>
-          <w:instrText xml:space="preserve"> PAGEREF _Toc217148112 \h </w:instrText>
+          <w:instrText xml:space="preserve"> PAGEREF _Toc221350307 \h </w:instrText>
         </w:r>
         <w:r>
           <w:rPr>
@@ -2091,7 +2091,7 @@
           <w14:ligatures w14:val="standardContextual"/>
         </w:rPr>
       </w:pPr>
-      <w:hyperlink w:anchor="_Toc217148113" w:history="1">
+      <w:hyperlink w:anchor="_Toc221350308" w:history="1">
         <w:r>
           <w:rPr>
             <w:rStyle w:val="Collegamentoipertestuale"/>
@@ -2135,7 +2135,7 @@
             <w:noProof/>
             <w:webHidden/>
           </w:rPr>
-          <w:instrText xml:space="preserve"> PAGEREF _Toc217148113 \h </w:instrText>
+          <w:instrText xml:space="preserve"> PAGEREF _Toc221350308 \h </w:instrText>
         </w:r>
         <w:r>
           <w:rPr>
@@ -2180,7 +2180,7 @@
           <w14:ligatures w14:val="standardContextual"/>
         </w:rPr>
       </w:pPr>
-      <w:hyperlink w:anchor="_Toc217148114" w:history="1">
+      <w:hyperlink w:anchor="_Toc221350309" w:history="1">
         <w:r>
           <w:rPr>
             <w:rStyle w:val="Collegamentoipertestuale"/>
@@ -2224,7 +2224,7 @@
             <w:noProof/>
             <w:webHidden/>
           </w:rPr>
-          <w:instrText xml:space="preserve"> PAGEREF _Toc217148114 \h </w:instrText>
+          <w:instrText xml:space="preserve"> PAGEREF _Toc221350309 \h </w:instrText>
         </w:r>
         <w:r>
           <w:rPr>
@@ -2269,7 +2269,7 @@
           <w14:ligatures w14:val="standardContextual"/>
         </w:rPr>
       </w:pPr>
-      <w:hyperlink w:anchor="_Toc217148115" w:history="1">
+      <w:hyperlink w:anchor="_Toc221350310" w:history="1">
         <w:r>
           <w:rPr>
             <w:rStyle w:val="Collegamentoipertestuale"/>
@@ -2313,7 +2313,7 @@
             <w:noProof/>
             <w:webHidden/>
           </w:rPr>
-          <w:instrText xml:space="preserve"> PAGEREF _Toc217148115 \h </w:instrText>
+          <w:instrText xml:space="preserve"> PAGEREF _Toc221350310 \h </w:instrText>
         </w:r>
         <w:r>
           <w:rPr>
@@ -2358,7 +2358,7 @@
           <w14:ligatures w14:val="standardContextual"/>
         </w:rPr>
       </w:pPr>
-      <w:hyperlink w:anchor="_Toc217148116" w:history="1">
+      <w:hyperlink w:anchor="_Toc221350311" w:history="1">
         <w:r>
           <w:rPr>
             <w:rStyle w:val="Collegamentoipertestuale"/>
@@ -2402,7 +2402,7 @@
             <w:noProof/>
             <w:webHidden/>
           </w:rPr>
-          <w:instrText xml:space="preserve"> PAGEREF _Toc217148116 \h </w:instrText>
+          <w:instrText xml:space="preserve"> PAGEREF _Toc221350311 \h </w:instrText>
         </w:r>
         <w:r>
           <w:rPr>
@@ -2447,7 +2447,7 @@
           <w14:ligatures w14:val="standardContextual"/>
         </w:rPr>
       </w:pPr>
-      <w:hyperlink w:anchor="_Toc217148117" w:history="1">
+      <w:hyperlink w:anchor="_Toc221350312" w:history="1">
         <w:r>
           <w:rPr>
             <w:rStyle w:val="Collegamentoipertestuale"/>
@@ -2491,7 +2491,7 @@
             <w:noProof/>
             <w:webHidden/>
           </w:rPr>
-          <w:instrText xml:space="preserve"> PAGEREF _Toc217148117 \h </w:instrText>
+          <w:instrText xml:space="preserve"> PAGEREF _Toc221350312 \h </w:instrText>
         </w:r>
         <w:r>
           <w:rPr>
@@ -2536,7 +2536,7 @@
           <w14:ligatures w14:val="standardContextual"/>
         </w:rPr>
       </w:pPr>
-      <w:hyperlink w:anchor="_Toc217148118" w:history="1">
+      <w:hyperlink w:anchor="_Toc221350313" w:history="1">
         <w:r>
           <w:rPr>
             <w:rStyle w:val="Collegamentoipertestuale"/>
@@ -2580,7 +2580,7 @@
             <w:noProof/>
             <w:webHidden/>
           </w:rPr>
-          <w:instrText xml:space="preserve"> PAGEREF _Toc217148118 \h </w:instrText>
+          <w:instrText xml:space="preserve"> PAGEREF _Toc221350313 \h </w:instrText>
         </w:r>
         <w:r>
           <w:rPr>
@@ -2625,7 +2625,7 @@
           <w14:ligatures w14:val="standardContextual"/>
         </w:rPr>
       </w:pPr>
-      <w:hyperlink w:anchor="_Toc217148119" w:history="1">
+      <w:hyperlink w:anchor="_Toc221350314" w:history="1">
         <w:r>
           <w:rPr>
             <w:rStyle w:val="Collegamentoipertestuale"/>
@@ -2669,7 +2669,7 @@
             <w:noProof/>
             <w:webHidden/>
           </w:rPr>
-          <w:instrText xml:space="preserve"> PAGEREF _Toc217148119 \h </w:instrText>
+          <w:instrText xml:space="preserve"> PAGEREF _Toc221350314 \h </w:instrText>
         </w:r>
         <w:r>
           <w:rPr>
@@ -2703,6 +2703,9 @@
     <w:p>
       <w:pPr>
         <w:pStyle w:val="Sommario2"/>
+        <w:tabs>
+          <w:tab w:val="left" w:pos="1132"/>
+        </w:tabs>
         <w:rPr>
           <w:rFonts w:asciiTheme="minorHAnsi" w:eastAsiaTheme="minorEastAsia" w:hAnsiTheme="minorHAnsi" w:cstheme="minorBidi"/>
           <w:noProof/>
@@ -2711,13 +2714,30 @@
           <w14:ligatures w14:val="standardContextual"/>
         </w:rPr>
       </w:pPr>
-      <w:hyperlink w:anchor="_Toc217148120" w:history="1">
+      <w:hyperlink w:anchor="_Toc221350315" w:history="1">
         <w:r>
           <w:rPr>
             <w:rStyle w:val="Collegamentoipertestuale"/>
             <w:noProof/>
           </w:rPr>
-          <w:t>9.1 Test_Login  (TC_1)</w:t>
+          <w:t>9.1</w:t>
+        </w:r>
+        <w:r>
+          <w:rPr>
+            <w:rFonts w:asciiTheme="minorHAnsi" w:eastAsiaTheme="minorEastAsia" w:hAnsiTheme="minorHAnsi" w:cstheme="minorBidi"/>
+            <w:noProof/>
+            <w:kern w:val="2"/>
+            <w:lang w:eastAsia="it-IT"/>
+            <w14:ligatures w14:val="standardContextual"/>
+          </w:rPr>
+          <w:tab/>
+        </w:r>
+        <w:r>
+          <w:rPr>
+            <w:rStyle w:val="Collegamentoipertestuale"/>
+            <w:noProof/>
+          </w:rPr>
+          <w:t>Unit Testing</w:t>
         </w:r>
         <w:r>
           <w:rPr>
@@ -2738,7 +2758,537 @@
             <w:noProof/>
             <w:webHidden/>
           </w:rPr>
-          <w:instrText xml:space="preserve"> PAGEREF _Toc217148120 \h </w:instrText>
+          <w:instrText xml:space="preserve"> PAGEREF _Toc221350315 \h </w:instrText>
+        </w:r>
+        <w:r>
+          <w:rPr>
+            <w:noProof/>
+            <w:webHidden/>
+          </w:rPr>
+        </w:r>
+        <w:r>
+          <w:rPr>
+            <w:noProof/>
+            <w:webHidden/>
+          </w:rPr>
+          <w:fldChar w:fldCharType="separate"/>
+        </w:r>
+        <w:r>
+          <w:rPr>
+            <w:noProof/>
+            <w:webHidden/>
+          </w:rPr>
+          <w:t>11</w:t>
+        </w:r>
+        <w:r>
+          <w:rPr>
+            <w:noProof/>
+            <w:webHidden/>
+          </w:rPr>
+          <w:fldChar w:fldCharType="end"/>
+        </w:r>
+      </w:hyperlink>
+    </w:p>
+    <w:p>
+      <w:pPr>
+        <w:pStyle w:val="Sommario2"/>
+        <w:tabs>
+          <w:tab w:val="left" w:pos="1132"/>
+        </w:tabs>
+        <w:rPr>
+          <w:rFonts w:asciiTheme="minorHAnsi" w:eastAsiaTheme="minorEastAsia" w:hAnsiTheme="minorHAnsi" w:cstheme="minorBidi"/>
+          <w:noProof/>
+          <w:kern w:val="2"/>
+          <w:lang w:eastAsia="it-IT"/>
+          <w14:ligatures w14:val="standardContextual"/>
+        </w:rPr>
+      </w:pPr>
+      <w:hyperlink w:anchor="_Toc221350316" w:history="1">
+        <w:r>
+          <w:rPr>
+            <w:rStyle w:val="Collegamentoipertestuale"/>
+            <w:noProof/>
+          </w:rPr>
+          <w:t>9.2</w:t>
+        </w:r>
+        <w:r>
+          <w:rPr>
+            <w:rFonts w:asciiTheme="minorHAnsi" w:eastAsiaTheme="minorEastAsia" w:hAnsiTheme="minorHAnsi" w:cstheme="minorBidi"/>
+            <w:noProof/>
+            <w:kern w:val="2"/>
+            <w:lang w:eastAsia="it-IT"/>
+            <w14:ligatures w14:val="standardContextual"/>
+          </w:rPr>
+          <w:tab/>
+        </w:r>
+        <w:r>
+          <w:rPr>
+            <w:rStyle w:val="Collegamentoipertestuale"/>
+            <w:noProof/>
+          </w:rPr>
+          <w:t>Integration testing</w:t>
+        </w:r>
+        <w:r>
+          <w:rPr>
+            <w:noProof/>
+            <w:webHidden/>
+          </w:rPr>
+          <w:tab/>
+        </w:r>
+        <w:r>
+          <w:rPr>
+            <w:noProof/>
+            <w:webHidden/>
+          </w:rPr>
+          <w:fldChar w:fldCharType="begin"/>
+        </w:r>
+        <w:r>
+          <w:rPr>
+            <w:noProof/>
+            <w:webHidden/>
+          </w:rPr>
+          <w:instrText xml:space="preserve"> PAGEREF _Toc221350316 \h </w:instrText>
+        </w:r>
+        <w:r>
+          <w:rPr>
+            <w:noProof/>
+            <w:webHidden/>
+          </w:rPr>
+        </w:r>
+        <w:r>
+          <w:rPr>
+            <w:noProof/>
+            <w:webHidden/>
+          </w:rPr>
+          <w:fldChar w:fldCharType="separate"/>
+        </w:r>
+        <w:r>
+          <w:rPr>
+            <w:noProof/>
+            <w:webHidden/>
+          </w:rPr>
+          <w:t>11</w:t>
+        </w:r>
+        <w:r>
+          <w:rPr>
+            <w:noProof/>
+            <w:webHidden/>
+          </w:rPr>
+          <w:fldChar w:fldCharType="end"/>
+        </w:r>
+      </w:hyperlink>
+    </w:p>
+    <w:p>
+      <w:pPr>
+        <w:pStyle w:val="Sommario3"/>
+        <w:tabs>
+          <w:tab w:val="left" w:pos="1440"/>
+          <w:tab w:val="right" w:leader="dot" w:pos="9627"/>
+        </w:tabs>
+        <w:rPr>
+          <w:rFonts w:asciiTheme="minorHAnsi" w:eastAsiaTheme="minorEastAsia" w:hAnsiTheme="minorHAnsi"/>
+          <w:noProof/>
+          <w:szCs w:val="24"/>
+          <w:lang w:eastAsia="it-IT"/>
+        </w:rPr>
+      </w:pPr>
+      <w:hyperlink w:anchor="_Toc221350317" w:history="1">
+        <w:r>
+          <w:rPr>
+            <w:rStyle w:val="Collegamentoipertestuale"/>
+            <w:noProof/>
+          </w:rPr>
+          <w:t>9.2.1</w:t>
+        </w:r>
+        <w:r>
+          <w:rPr>
+            <w:rFonts w:asciiTheme="minorHAnsi" w:eastAsiaTheme="minorEastAsia" w:hAnsiTheme="minorHAnsi"/>
+            <w:noProof/>
+            <w:szCs w:val="24"/>
+            <w:lang w:eastAsia="it-IT"/>
+          </w:rPr>
+          <w:tab/>
+        </w:r>
+        <w:r>
+          <w:rPr>
+            <w:rStyle w:val="Collegamentoipertestuale"/>
+            <w:noProof/>
+          </w:rPr>
+          <w:t>PersistenceManagemet</w:t>
+        </w:r>
+        <w:r>
+          <w:rPr>
+            <w:noProof/>
+            <w:webHidden/>
+          </w:rPr>
+          <w:tab/>
+        </w:r>
+        <w:r>
+          <w:rPr>
+            <w:noProof/>
+            <w:webHidden/>
+          </w:rPr>
+          <w:fldChar w:fldCharType="begin"/>
+        </w:r>
+        <w:r>
+          <w:rPr>
+            <w:noProof/>
+            <w:webHidden/>
+          </w:rPr>
+          <w:instrText xml:space="preserve"> PAGEREF _Toc221350317 \h </w:instrText>
+        </w:r>
+        <w:r>
+          <w:rPr>
+            <w:noProof/>
+            <w:webHidden/>
+          </w:rPr>
+        </w:r>
+        <w:r>
+          <w:rPr>
+            <w:noProof/>
+            <w:webHidden/>
+          </w:rPr>
+          <w:fldChar w:fldCharType="separate"/>
+        </w:r>
+        <w:r>
+          <w:rPr>
+            <w:noProof/>
+            <w:webHidden/>
+          </w:rPr>
+          <w:t>11</w:t>
+        </w:r>
+        <w:r>
+          <w:rPr>
+            <w:noProof/>
+            <w:webHidden/>
+          </w:rPr>
+          <w:fldChar w:fldCharType="end"/>
+        </w:r>
+      </w:hyperlink>
+    </w:p>
+    <w:p>
+      <w:pPr>
+        <w:pStyle w:val="Sommario3"/>
+        <w:tabs>
+          <w:tab w:val="left" w:pos="1440"/>
+          <w:tab w:val="right" w:leader="dot" w:pos="9627"/>
+        </w:tabs>
+        <w:rPr>
+          <w:rFonts w:asciiTheme="minorHAnsi" w:eastAsiaTheme="minorEastAsia" w:hAnsiTheme="minorHAnsi"/>
+          <w:noProof/>
+          <w:szCs w:val="24"/>
+          <w:lang w:eastAsia="it-IT"/>
+        </w:rPr>
+      </w:pPr>
+      <w:hyperlink w:anchor="_Toc221350318" w:history="1">
+        <w:r>
+          <w:rPr>
+            <w:rStyle w:val="Collegamentoipertestuale"/>
+            <w:noProof/>
+          </w:rPr>
+          <w:t>9.2.2</w:t>
+        </w:r>
+        <w:r>
+          <w:rPr>
+            <w:rFonts w:asciiTheme="minorHAnsi" w:eastAsiaTheme="minorEastAsia" w:hAnsiTheme="minorHAnsi"/>
+            <w:noProof/>
+            <w:szCs w:val="24"/>
+            <w:lang w:eastAsia="it-IT"/>
+          </w:rPr>
+          <w:tab/>
+        </w:r>
+        <w:r>
+          <w:rPr>
+            <w:rStyle w:val="Collegamentoipertestuale"/>
+            <w:noProof/>
+          </w:rPr>
+          <w:t>Integration AccountManagement + PersistenceManagement</w:t>
+        </w:r>
+        <w:r>
+          <w:rPr>
+            <w:noProof/>
+            <w:webHidden/>
+          </w:rPr>
+          <w:tab/>
+        </w:r>
+        <w:r>
+          <w:rPr>
+            <w:noProof/>
+            <w:webHidden/>
+          </w:rPr>
+          <w:fldChar w:fldCharType="begin"/>
+        </w:r>
+        <w:r>
+          <w:rPr>
+            <w:noProof/>
+            <w:webHidden/>
+          </w:rPr>
+          <w:instrText xml:space="preserve"> PAGEREF _Toc221350318 \h </w:instrText>
+        </w:r>
+        <w:r>
+          <w:rPr>
+            <w:noProof/>
+            <w:webHidden/>
+          </w:rPr>
+        </w:r>
+        <w:r>
+          <w:rPr>
+            <w:noProof/>
+            <w:webHidden/>
+          </w:rPr>
+          <w:fldChar w:fldCharType="separate"/>
+        </w:r>
+        <w:r>
+          <w:rPr>
+            <w:noProof/>
+            <w:webHidden/>
+          </w:rPr>
+          <w:t>12</w:t>
+        </w:r>
+        <w:r>
+          <w:rPr>
+            <w:noProof/>
+            <w:webHidden/>
+          </w:rPr>
+          <w:fldChar w:fldCharType="end"/>
+        </w:r>
+      </w:hyperlink>
+    </w:p>
+    <w:p>
+      <w:pPr>
+        <w:pStyle w:val="Sommario3"/>
+        <w:tabs>
+          <w:tab w:val="left" w:pos="1440"/>
+          <w:tab w:val="right" w:leader="dot" w:pos="9627"/>
+        </w:tabs>
+        <w:rPr>
+          <w:rFonts w:asciiTheme="minorHAnsi" w:eastAsiaTheme="minorEastAsia" w:hAnsiTheme="minorHAnsi"/>
+          <w:noProof/>
+          <w:szCs w:val="24"/>
+          <w:lang w:eastAsia="it-IT"/>
+        </w:rPr>
+      </w:pPr>
+      <w:hyperlink w:anchor="_Toc221350319" w:history="1">
+        <w:r>
+          <w:rPr>
+            <w:rStyle w:val="Collegamentoipertestuale"/>
+            <w:noProof/>
+          </w:rPr>
+          <w:t>9.2.3</w:t>
+        </w:r>
+        <w:r>
+          <w:rPr>
+            <w:rFonts w:asciiTheme="minorHAnsi" w:eastAsiaTheme="minorEastAsia" w:hAnsiTheme="minorHAnsi"/>
+            <w:noProof/>
+            <w:szCs w:val="24"/>
+            <w:lang w:eastAsia="it-IT"/>
+          </w:rPr>
+          <w:tab/>
+        </w:r>
+        <w:r>
+          <w:rPr>
+            <w:rStyle w:val="Collegamentoipertestuale"/>
+            <w:noProof/>
+          </w:rPr>
+          <w:t>Integration AccessManagement + PersistenceManagement</w:t>
+        </w:r>
+        <w:r>
+          <w:rPr>
+            <w:noProof/>
+            <w:webHidden/>
+          </w:rPr>
+          <w:tab/>
+        </w:r>
+        <w:r>
+          <w:rPr>
+            <w:noProof/>
+            <w:webHidden/>
+          </w:rPr>
+          <w:fldChar w:fldCharType="begin"/>
+        </w:r>
+        <w:r>
+          <w:rPr>
+            <w:noProof/>
+            <w:webHidden/>
+          </w:rPr>
+          <w:instrText xml:space="preserve"> PAGEREF _Toc221350319 \h </w:instrText>
+        </w:r>
+        <w:r>
+          <w:rPr>
+            <w:noProof/>
+            <w:webHidden/>
+          </w:rPr>
+        </w:r>
+        <w:r>
+          <w:rPr>
+            <w:noProof/>
+            <w:webHidden/>
+          </w:rPr>
+          <w:fldChar w:fldCharType="separate"/>
+        </w:r>
+        <w:r>
+          <w:rPr>
+            <w:noProof/>
+            <w:webHidden/>
+          </w:rPr>
+          <w:t>14</w:t>
+        </w:r>
+        <w:r>
+          <w:rPr>
+            <w:noProof/>
+            <w:webHidden/>
+          </w:rPr>
+          <w:fldChar w:fldCharType="end"/>
+        </w:r>
+      </w:hyperlink>
+    </w:p>
+    <w:p>
+      <w:pPr>
+        <w:pStyle w:val="Sommario3"/>
+        <w:tabs>
+          <w:tab w:val="left" w:pos="1440"/>
+          <w:tab w:val="right" w:leader="dot" w:pos="9627"/>
+        </w:tabs>
+        <w:rPr>
+          <w:rFonts w:asciiTheme="minorHAnsi" w:eastAsiaTheme="minorEastAsia" w:hAnsiTheme="minorHAnsi"/>
+          <w:noProof/>
+          <w:szCs w:val="24"/>
+          <w:lang w:eastAsia="it-IT"/>
+        </w:rPr>
+      </w:pPr>
+      <w:hyperlink w:anchor="_Toc221350320" w:history="1">
+        <w:r>
+          <w:rPr>
+            <w:rStyle w:val="Collegamentoipertestuale"/>
+            <w:noProof/>
+          </w:rPr>
+          <w:t>9.2.4</w:t>
+        </w:r>
+        <w:r>
+          <w:rPr>
+            <w:rFonts w:asciiTheme="minorHAnsi" w:eastAsiaTheme="minorEastAsia" w:hAnsiTheme="minorHAnsi"/>
+            <w:noProof/>
+            <w:szCs w:val="24"/>
+            <w:lang w:eastAsia="it-IT"/>
+          </w:rPr>
+          <w:tab/>
+        </w:r>
+        <w:r>
+          <w:rPr>
+            <w:rStyle w:val="Collegamentoipertestuale"/>
+            <w:noProof/>
+          </w:rPr>
+          <w:t>Integration TaskManagement + PersistenceManagement</w:t>
+        </w:r>
+        <w:r>
+          <w:rPr>
+            <w:noProof/>
+            <w:webHidden/>
+          </w:rPr>
+          <w:tab/>
+        </w:r>
+        <w:r>
+          <w:rPr>
+            <w:noProof/>
+            <w:webHidden/>
+          </w:rPr>
+          <w:fldChar w:fldCharType="begin"/>
+        </w:r>
+        <w:r>
+          <w:rPr>
+            <w:noProof/>
+            <w:webHidden/>
+          </w:rPr>
+          <w:instrText xml:space="preserve"> PAGEREF _Toc221350320 \h </w:instrText>
+        </w:r>
+        <w:r>
+          <w:rPr>
+            <w:noProof/>
+            <w:webHidden/>
+          </w:rPr>
+        </w:r>
+        <w:r>
+          <w:rPr>
+            <w:noProof/>
+            <w:webHidden/>
+          </w:rPr>
+          <w:fldChar w:fldCharType="separate"/>
+        </w:r>
+        <w:r>
+          <w:rPr>
+            <w:noProof/>
+            <w:webHidden/>
+          </w:rPr>
+          <w:t>15</w:t>
+        </w:r>
+        <w:r>
+          <w:rPr>
+            <w:noProof/>
+            <w:webHidden/>
+          </w:rPr>
+          <w:fldChar w:fldCharType="end"/>
+        </w:r>
+      </w:hyperlink>
+    </w:p>
+    <w:p>
+      <w:pPr>
+        <w:pStyle w:val="Sommario2"/>
+        <w:tabs>
+          <w:tab w:val="left" w:pos="1132"/>
+        </w:tabs>
+        <w:rPr>
+          <w:rFonts w:asciiTheme="minorHAnsi" w:eastAsiaTheme="minorEastAsia" w:hAnsiTheme="minorHAnsi" w:cstheme="minorBidi"/>
+          <w:noProof/>
+          <w:kern w:val="2"/>
+          <w:lang w:eastAsia="it-IT"/>
+          <w14:ligatures w14:val="standardContextual"/>
+        </w:rPr>
+      </w:pPr>
+      <w:hyperlink w:anchor="_Toc221350321" w:history="1">
+        <w:r>
+          <w:rPr>
+            <w:rStyle w:val="Collegamentoipertestuale"/>
+            <w:noProof/>
+          </w:rPr>
+          <w:t>9.3</w:t>
+        </w:r>
+        <w:r>
+          <w:rPr>
+            <w:rFonts w:asciiTheme="minorHAnsi" w:eastAsiaTheme="minorEastAsia" w:hAnsiTheme="minorHAnsi" w:cstheme="minorBidi"/>
+            <w:noProof/>
+            <w:kern w:val="2"/>
+            <w:lang w:eastAsia="it-IT"/>
+            <w14:ligatures w14:val="standardContextual"/>
+          </w:rPr>
+          <w:tab/>
+        </w:r>
+        <w:r>
+          <w:rPr>
+            <w:rStyle w:val="Collegamentoipertestuale"/>
+            <w:noProof/>
+          </w:rPr>
+          <w:t>System testing</w:t>
+        </w:r>
+        <w:r>
+          <w:rPr>
+            <w:noProof/>
+            <w:webHidden/>
+          </w:rPr>
+          <w:tab/>
+        </w:r>
+        <w:r>
+          <w:rPr>
+            <w:noProof/>
+            <w:webHidden/>
+          </w:rPr>
+          <w:fldChar w:fldCharType="begin"/>
+        </w:r>
+        <w:r>
+          <w:rPr>
+            <w:noProof/>
+            <w:webHidden/>
+          </w:rPr>
+          <w:instrText xml:space="preserve"> PAGEREF _Toc221350321 \h </w:instrText>
         </w:r>
         <w:r>
           <w:rPr>
@@ -2771,22 +3321,41 @@
     </w:p>
     <w:p>
       <w:pPr>
-        <w:pStyle w:val="Sommario2"/>
+        <w:pStyle w:val="Sommario3"/>
+        <w:tabs>
+          <w:tab w:val="left" w:pos="1440"/>
+          <w:tab w:val="right" w:leader="dot" w:pos="9627"/>
+        </w:tabs>
         <w:rPr>
-          <w:rFonts w:asciiTheme="minorHAnsi" w:eastAsiaTheme="minorEastAsia" w:hAnsiTheme="minorHAnsi" w:cstheme="minorBidi"/>
+          <w:rFonts w:asciiTheme="minorHAnsi" w:eastAsiaTheme="minorEastAsia" w:hAnsiTheme="minorHAnsi"/>
           <w:noProof/>
-          <w:kern w:val="2"/>
+          <w:szCs w:val="24"/>
           <w:lang w:eastAsia="it-IT"/>
-          <w14:ligatures w14:val="standardContextual"/>
         </w:rPr>
       </w:pPr>
-      <w:hyperlink w:anchor="_Toc217148121" w:history="1">
+      <w:hyperlink w:anchor="_Toc221350322" w:history="1">
         <w:r>
           <w:rPr>
             <w:rStyle w:val="Collegamentoipertestuale"/>
             <w:noProof/>
           </w:rPr>
-          <w:t>9.2 Test_Modifica_password (TC_2)</w:t>
+          <w:t>9.3.1</w:t>
+        </w:r>
+        <w:r>
+          <w:rPr>
+            <w:rFonts w:asciiTheme="minorHAnsi" w:eastAsiaTheme="minorEastAsia" w:hAnsiTheme="minorHAnsi"/>
+            <w:noProof/>
+            <w:szCs w:val="24"/>
+            <w:lang w:eastAsia="it-IT"/>
+          </w:rPr>
+          <w:tab/>
+        </w:r>
+        <w:r>
+          <w:rPr>
+            <w:rStyle w:val="Collegamentoipertestuale"/>
+            <w:noProof/>
+          </w:rPr>
+          <w:t>Test_Login  (TC_1)</w:t>
         </w:r>
         <w:r>
           <w:rPr>
@@ -2807,7 +3376,13 @@
             <w:noProof/>
             <w:webHidden/>
           </w:rPr>
-          <w:instrText xml:space="preserve"> PAGEREF _Toc217148121 \h </w:instrText>
+          <w:instrText xml:space="preserve"> PAGEREF _Toc221350322 \h </w:instrText>
+        </w:r>
+        <w:r>
+          <w:rPr>
+            <w:noProof/>
+            <w:webHidden/>
+          </w:rPr>
         </w:r>
         <w:r>
           <w:rPr>
@@ -2818,12 +3393,10 @@
         </w:r>
         <w:r>
           <w:rPr>
-            <w:b/>
-            <w:bCs/>
             <w:noProof/>
             <w:webHidden/>
           </w:rPr>
-          <w:t>Errore. Il segnalibro non è definito.</w:t>
+          <w:t>18</w:t>
         </w:r>
         <w:r>
           <w:rPr>
@@ -2836,22 +3409,41 @@
     </w:p>
     <w:p>
       <w:pPr>
-        <w:pStyle w:val="Sommario2"/>
+        <w:pStyle w:val="Sommario3"/>
+        <w:tabs>
+          <w:tab w:val="left" w:pos="1440"/>
+          <w:tab w:val="right" w:leader="dot" w:pos="9627"/>
+        </w:tabs>
         <w:rPr>
-          <w:rFonts w:asciiTheme="minorHAnsi" w:eastAsiaTheme="minorEastAsia" w:hAnsiTheme="minorHAnsi" w:cstheme="minorBidi"/>
+          <w:rFonts w:asciiTheme="minorHAnsi" w:eastAsiaTheme="minorEastAsia" w:hAnsiTheme="minorHAnsi"/>
           <w:noProof/>
-          <w:kern w:val="2"/>
+          <w:szCs w:val="24"/>
           <w:lang w:eastAsia="it-IT"/>
-          <w14:ligatures w14:val="standardContextual"/>
         </w:rPr>
       </w:pPr>
-      <w:hyperlink w:anchor="_Toc217148122" w:history="1">
+      <w:hyperlink w:anchor="_Toc221350323" w:history="1">
         <w:r>
           <w:rPr>
             <w:rStyle w:val="Collegamentoipertestuale"/>
             <w:noProof/>
           </w:rPr>
-          <w:t>9.3 Test_Creazione_Task (TC_3)</w:t>
+          <w:t>9.3.2</w:t>
+        </w:r>
+        <w:r>
+          <w:rPr>
+            <w:rFonts w:asciiTheme="minorHAnsi" w:eastAsiaTheme="minorEastAsia" w:hAnsiTheme="minorHAnsi"/>
+            <w:noProof/>
+            <w:szCs w:val="24"/>
+            <w:lang w:eastAsia="it-IT"/>
+          </w:rPr>
+          <w:tab/>
+        </w:r>
+        <w:r>
+          <w:rPr>
+            <w:rStyle w:val="Collegamentoipertestuale"/>
+            <w:noProof/>
+          </w:rPr>
+          <w:t>Test_Creazione_Task (TC_2)</w:t>
         </w:r>
         <w:r>
           <w:rPr>
@@ -2872,7 +3464,7 @@
             <w:noProof/>
             <w:webHidden/>
           </w:rPr>
-          <w:instrText xml:space="preserve"> PAGEREF _Toc217148122 \h </w:instrText>
+          <w:instrText xml:space="preserve"> PAGEREF _Toc221350323 \h </w:instrText>
         </w:r>
         <w:r>
           <w:rPr>
@@ -2905,22 +3497,41 @@
     </w:p>
     <w:p>
       <w:pPr>
-        <w:pStyle w:val="Sommario2"/>
+        <w:pStyle w:val="Sommario3"/>
+        <w:tabs>
+          <w:tab w:val="left" w:pos="1440"/>
+          <w:tab w:val="right" w:leader="dot" w:pos="9627"/>
+        </w:tabs>
         <w:rPr>
-          <w:rFonts w:asciiTheme="minorHAnsi" w:eastAsiaTheme="minorEastAsia" w:hAnsiTheme="minorHAnsi" w:cstheme="minorBidi"/>
+          <w:rFonts w:asciiTheme="minorHAnsi" w:eastAsiaTheme="minorEastAsia" w:hAnsiTheme="minorHAnsi"/>
           <w:noProof/>
-          <w:kern w:val="2"/>
+          <w:szCs w:val="24"/>
           <w:lang w:eastAsia="it-IT"/>
-          <w14:ligatures w14:val="standardContextual"/>
         </w:rPr>
       </w:pPr>
-      <w:hyperlink w:anchor="_Toc217148123" w:history="1">
+      <w:hyperlink w:anchor="_Toc221350324" w:history="1">
         <w:r>
           <w:rPr>
             <w:rStyle w:val="Collegamentoipertestuale"/>
             <w:noProof/>
           </w:rPr>
-          <w:t>9.4 Test_Sospensione_task (TC_4)</w:t>
+          <w:t>9.3.3</w:t>
+        </w:r>
+        <w:r>
+          <w:rPr>
+            <w:rFonts w:asciiTheme="minorHAnsi" w:eastAsiaTheme="minorEastAsia" w:hAnsiTheme="minorHAnsi"/>
+            <w:noProof/>
+            <w:szCs w:val="24"/>
+            <w:lang w:eastAsia="it-IT"/>
+          </w:rPr>
+          <w:tab/>
+        </w:r>
+        <w:r>
+          <w:rPr>
+            <w:rStyle w:val="Collegamentoipertestuale"/>
+            <w:noProof/>
+          </w:rPr>
+          <w:t>Test_Inserimento_account (TC_3)</w:t>
         </w:r>
         <w:r>
           <w:rPr>
@@ -2941,72 +3552,7 @@
             <w:noProof/>
             <w:webHidden/>
           </w:rPr>
-          <w:instrText xml:space="preserve"> PAGEREF _Toc217148123 \h </w:instrText>
-        </w:r>
-        <w:r>
-          <w:rPr>
-            <w:noProof/>
-            <w:webHidden/>
-          </w:rPr>
-          <w:fldChar w:fldCharType="separate"/>
-        </w:r>
-        <w:r>
-          <w:rPr>
-            <w:b/>
-            <w:bCs/>
-            <w:noProof/>
-            <w:webHidden/>
-          </w:rPr>
-          <w:t>Errore. Il segnalibro non è definito.</w:t>
-        </w:r>
-        <w:r>
-          <w:rPr>
-            <w:noProof/>
-            <w:webHidden/>
-          </w:rPr>
-          <w:fldChar w:fldCharType="end"/>
-        </w:r>
-      </w:hyperlink>
-    </w:p>
-    <w:p>
-      <w:pPr>
-        <w:pStyle w:val="Sommario2"/>
-        <w:rPr>
-          <w:rFonts w:asciiTheme="minorHAnsi" w:eastAsiaTheme="minorEastAsia" w:hAnsiTheme="minorHAnsi" w:cstheme="minorBidi"/>
-          <w:noProof/>
-          <w:kern w:val="2"/>
-          <w:lang w:eastAsia="it-IT"/>
-          <w14:ligatures w14:val="standardContextual"/>
-        </w:rPr>
-      </w:pPr>
-      <w:hyperlink w:anchor="_Toc217148124" w:history="1">
-        <w:r>
-          <w:rPr>
-            <w:rStyle w:val="Collegamentoipertestuale"/>
-            <w:noProof/>
-          </w:rPr>
-          <w:t>9.5 Test_Inserimento_account (TC_5)</w:t>
-        </w:r>
-        <w:r>
-          <w:rPr>
-            <w:noProof/>
-            <w:webHidden/>
-          </w:rPr>
-          <w:tab/>
-        </w:r>
-        <w:r>
-          <w:rPr>
-            <w:noProof/>
-            <w:webHidden/>
-          </w:rPr>
-          <w:fldChar w:fldCharType="begin"/>
-        </w:r>
-        <w:r>
-          <w:rPr>
-            <w:noProof/>
-            <w:webHidden/>
-          </w:rPr>
-          <w:instrText xml:space="preserve"> PAGEREF _Toc217148124 \h </w:instrText>
+          <w:instrText xml:space="preserve"> PAGEREF _Toc221350324 \h </w:instrText>
         </w:r>
         <w:r>
           <w:rPr>
@@ -3051,13 +3597,13 @@
           <w14:ligatures w14:val="standardContextual"/>
         </w:rPr>
       </w:pPr>
-      <w:hyperlink w:anchor="_Toc217148125" w:history="1">
+      <w:hyperlink w:anchor="_Toc221350325" w:history="1">
         <w:r>
           <w:rPr>
             <w:rStyle w:val="Collegamentoipertestuale"/>
             <w:noProof/>
           </w:rPr>
-          <w:t>10.</w:t>
+          <w:t>10</w:t>
         </w:r>
         <w:r>
           <w:rPr>
@@ -3074,7 +3620,7 @@
             <w:rStyle w:val="Collegamentoipertestuale"/>
             <w:noProof/>
           </w:rPr>
-          <w:t>Testing Schedule</w:t>
+          <w:t>. Testing Schedule</w:t>
         </w:r>
         <w:r>
           <w:rPr>
@@ -3095,7 +3641,7 @@
             <w:noProof/>
             <w:webHidden/>
           </w:rPr>
-          <w:instrText xml:space="preserve"> PAGEREF _Toc217148125 \h </w:instrText>
+          <w:instrText xml:space="preserve"> PAGEREF _Toc221350325 \h </w:instrText>
         </w:r>
         <w:r>
           <w:rPr>
@@ -3166,7 +3712,7 @@
         </w:numPr>
         <w:ind w:left="0"/>
       </w:pPr>
-      <w:bookmarkStart w:id="0" w:name="_Toc217148111"/>
+      <w:bookmarkStart w:id="0" w:name="_Toc221350306"/>
       <w:r>
         <w:lastRenderedPageBreak/>
         <w:t>Introduzione</w:t>
@@ -3228,7 +3774,7 @@
         </w:numPr>
         <w:ind w:left="0"/>
       </w:pPr>
-      <w:bookmarkStart w:id="1" w:name="_Toc217148112"/>
+      <w:bookmarkStart w:id="1" w:name="_Toc221350307"/>
       <w:r>
         <w:t>Relazione con gli altri documenti</w:t>
       </w:r>
@@ -3355,7 +3901,7 @@
         </w:numPr>
         <w:ind w:left="0"/>
       </w:pPr>
-      <w:bookmarkStart w:id="2" w:name="_Toc217148113"/>
+      <w:bookmarkStart w:id="2" w:name="_Toc221350308"/>
       <w:r>
         <w:t xml:space="preserve">System </w:t>
       </w:r>
@@ -3489,7 +4035,7 @@
         </w:numPr>
         <w:ind w:left="0"/>
       </w:pPr>
-      <w:bookmarkStart w:id="3" w:name="_Toc217148114"/>
+      <w:bookmarkStart w:id="3" w:name="_Toc221350309"/>
       <w:r>
         <w:t>Funzionalità da testare/da non testare</w:t>
       </w:r>
@@ -3652,7 +4198,7 @@
         </w:numPr>
         <w:ind w:left="0"/>
       </w:pPr>
-      <w:bookmarkStart w:id="4" w:name="_Toc217148115"/>
+      <w:bookmarkStart w:id="4" w:name="_Toc221350310"/>
       <w:r>
         <w:lastRenderedPageBreak/>
         <w:t xml:space="preserve">Pass/Fail </w:t>
@@ -3762,26 +4308,7 @@
         <w:t>Integrità della Logica</w:t>
       </w:r>
       <w:r>
-        <w:t xml:space="preserve">: L’output prodotto </w:t>
-      </w:r>
-      <w:proofErr w:type="spellStart"/>
-      <w:r>
-        <w:t>dal</w:t>
-      </w:r>
-      <w:r>
-        <w:t>l’application</w:t>
-      </w:r>
-      <w:proofErr w:type="spellEnd"/>
-      <w:r>
-        <w:t xml:space="preserve"> </w:t>
-      </w:r>
-      <w:proofErr w:type="spellStart"/>
-      <w:r>
-        <w:t>layer</w:t>
-      </w:r>
-      <w:proofErr w:type="spellEnd"/>
-      <w:r>
-        <w:t xml:space="preserve"> corrisponde esattamente ai risultati attesi definiti ne</w:t>
+        <w:t>: L’output prodotto corrisponde esattamente ai risultati attesi definiti ne</w:t>
       </w:r>
       <w:r>
         <w:t>ll’oracolo del caso di test</w:t>
@@ -3812,18 +4339,21 @@
         <w:t>(</w:t>
       </w:r>
       <w:r>
-        <w:t xml:space="preserve">Ad esempio, la creazione di un task deve generare un nuovo record e il relativo </w:t>
+        <w:t xml:space="preserve">Ad esempio, la creazione di un </w:t>
+      </w:r>
+      <w:r>
+        <w:t xml:space="preserve">dipendente deve generare portare anche alla generazione di </w:t>
       </w:r>
       <w:proofErr w:type="spellStart"/>
       <w:r>
-        <w:t>path</w:t>
+        <w:t>un’entry</w:t>
       </w:r>
       <w:proofErr w:type="spellEnd"/>
       <w:r>
-        <w:t xml:space="preserve"> dell'allegato</w:t>
-      </w:r>
-      <w:r>
-        <w:t xml:space="preserve"> se presente)</w:t>
+        <w:t xml:space="preserve"> all’interno della tabella Dipendente</w:t>
+      </w:r>
+      <w:r>
+        <w:t>)</w:t>
       </w:r>
       <w:r>
         <w:t>.</w:t>
@@ -4085,7 +4615,7 @@
         </w:numPr>
         <w:ind w:left="0"/>
       </w:pPr>
-      <w:bookmarkStart w:id="5" w:name="_Toc217148116"/>
+      <w:bookmarkStart w:id="5" w:name="_Toc221350311"/>
       <w:r>
         <w:t>Approccio</w:t>
       </w:r>
@@ -4532,7 +5062,7 @@
         </w:numPr>
         <w:ind w:left="0"/>
       </w:pPr>
-      <w:bookmarkStart w:id="6" w:name="_Toc217148117"/>
+      <w:bookmarkStart w:id="6" w:name="_Toc221350312"/>
       <w:r>
         <w:t>Sospensione e ripristino</w:t>
       </w:r>
@@ -4840,7 +5370,7 @@
         </w:numPr>
         <w:ind w:left="0"/>
       </w:pPr>
-      <w:bookmarkStart w:id="7" w:name="_Toc217148118"/>
+      <w:bookmarkStart w:id="7" w:name="_Toc221350313"/>
       <w:r>
         <w:t>Materiale per i test</w:t>
       </w:r>
@@ -5186,7 +5716,7 @@
         </w:numPr>
         <w:ind w:left="0"/>
       </w:pPr>
-      <w:bookmarkStart w:id="8" w:name="_Toc217148119"/>
+      <w:bookmarkStart w:id="8" w:name="_Toc221350314"/>
       <w:r>
         <w:lastRenderedPageBreak/>
         <w:t xml:space="preserve">Test </w:t>
@@ -5207,9 +5737,11 @@
           <w:numId w:val="23"/>
         </w:numPr>
       </w:pPr>
+      <w:bookmarkStart w:id="9" w:name="_Toc221350315"/>
       <w:r>
         <w:t>Unit Testing</w:t>
       </w:r>
+      <w:bookmarkEnd w:id="9"/>
     </w:p>
     <w:p/>
     <w:p>
@@ -5368,9 +5900,11 @@
           <w:numId w:val="23"/>
         </w:numPr>
       </w:pPr>
+      <w:bookmarkStart w:id="10" w:name="_Toc221350316"/>
       <w:r>
         <w:t>Integration testing</w:t>
       </w:r>
+      <w:bookmarkEnd w:id="10"/>
     </w:p>
     <w:p/>
     <w:p>
@@ -5441,10 +5975,12 @@
           <w:numId w:val="23"/>
         </w:numPr>
       </w:pPr>
+      <w:bookmarkStart w:id="11" w:name="_Toc221350317"/>
       <w:proofErr w:type="spellStart"/>
       <w:r>
         <w:t>PersistenceManagemet</w:t>
       </w:r>
+      <w:bookmarkEnd w:id="11"/>
       <w:proofErr w:type="spellEnd"/>
       <w:r>
         <w:br/>
@@ -5497,6 +6033,7 @@
           <w:numId w:val="23"/>
         </w:numPr>
       </w:pPr>
+      <w:bookmarkStart w:id="12" w:name="_Toc221350318"/>
       <w:r>
         <w:lastRenderedPageBreak/>
         <w:t xml:space="preserve">Integration </w:t>
@@ -5509,6 +6046,7 @@
       <w:r>
         <w:t xml:space="preserve"> + PersistenceManagement</w:t>
       </w:r>
+      <w:bookmarkEnd w:id="12"/>
     </w:p>
     <w:p/>
     <w:p>
@@ -6285,15 +6823,7 @@
               <w:spacing w:after="160" w:line="259" w:lineRule="auto"/>
             </w:pPr>
             <w:r>
-              <w:t xml:space="preserve">Un utente con </w:t>
-            </w:r>
-            <w:proofErr w:type="gramStart"/>
-            <w:r>
-              <w:t>email</w:t>
-            </w:r>
-            <w:proofErr w:type="gramEnd"/>
-            <w:r>
-              <w:t xml:space="preserve"> </w:t>
+              <w:t xml:space="preserve">Un utente con email </w:t>
             </w:r>
             <w:proofErr w:type="spellStart"/>
             <w:r>
@@ -6315,26 +6845,16 @@
               <w:spacing w:after="160" w:line="259" w:lineRule="auto"/>
             </w:pPr>
             <w:r>
-              <w:t xml:space="preserve">Nuovo utente con la stessa </w:t>
-            </w:r>
-            <w:proofErr w:type="gramStart"/>
-            <w:r>
-              <w:t>email</w:t>
-            </w:r>
-            <w:proofErr w:type="gramEnd"/>
-            <w:r>
-              <w:t xml:space="preserve"> </w:t>
+              <w:t xml:space="preserve">Nuovo utente con la stessa email </w:t>
             </w:r>
             <w:proofErr w:type="spellStart"/>
             <w:r>
               <w:t>mario.rossi</w:t>
             </w:r>
             <w:proofErr w:type="spellEnd"/>
-            <w:proofErr w:type="gramStart"/>
             <w:r>
               <w:t>@....</w:t>
             </w:r>
-            <w:proofErr w:type="gramEnd"/>
           </w:p>
         </w:tc>
         <w:tc>
@@ -6711,6 +7231,7 @@
           <w:numId w:val="23"/>
         </w:numPr>
       </w:pPr>
+      <w:bookmarkStart w:id="13" w:name="_Toc221350319"/>
       <w:r>
         <w:lastRenderedPageBreak/>
         <w:t xml:space="preserve">Integration </w:t>
@@ -6723,6 +7244,7 @@
       <w:r>
         <w:t xml:space="preserve"> + PersistenceManagement</w:t>
       </w:r>
+      <w:bookmarkEnd w:id="13"/>
     </w:p>
     <w:p/>
     <w:tbl>
@@ -7266,13 +7788,8 @@
             <w:pPr>
               <w:spacing w:after="160" w:line="259" w:lineRule="auto"/>
             </w:pPr>
-            <w:proofErr w:type="gramStart"/>
-            <w:r>
-              <w:t>Email</w:t>
-            </w:r>
-            <w:proofErr w:type="gramEnd"/>
-            <w:r>
-              <w:t>: mario.rossi@azienda.it</w:t>
+            <w:r>
+              <w:t>Email: mario.rossi@azienda.it</w:t>
             </w:r>
           </w:p>
           <w:p>
@@ -7364,15 +7881,7 @@
               <w:spacing w:after="160" w:line="259" w:lineRule="auto"/>
             </w:pPr>
             <w:r>
-              <w:t xml:space="preserve">Verifica il comportamento con </w:t>
-            </w:r>
-            <w:proofErr w:type="gramStart"/>
-            <w:r>
-              <w:t>email</w:t>
-            </w:r>
-            <w:proofErr w:type="gramEnd"/>
-            <w:r>
-              <w:t xml:space="preserve"> non presente nel sistema.</w:t>
+              <w:t>Verifica il comportamento con email non presente nel sistema.</w:t>
             </w:r>
           </w:p>
         </w:tc>
@@ -7386,15 +7895,7 @@
               <w:spacing w:after="160" w:line="259" w:lineRule="auto"/>
             </w:pPr>
             <w:r>
-              <w:t xml:space="preserve">Database popolato, ma </w:t>
-            </w:r>
-            <w:proofErr w:type="gramStart"/>
-            <w:r>
-              <w:t>l'email</w:t>
-            </w:r>
-            <w:proofErr w:type="gramEnd"/>
-            <w:r>
-              <w:t xml:space="preserve"> di test non esiste.</w:t>
+              <w:t>Database popolato, ma l'email di test non esiste.</w:t>
             </w:r>
           </w:p>
         </w:tc>
@@ -7407,13 +7908,8 @@
             <w:pPr>
               <w:spacing w:after="160" w:line="259" w:lineRule="auto"/>
             </w:pPr>
-            <w:proofErr w:type="gramStart"/>
-            <w:r>
-              <w:t>Email</w:t>
-            </w:r>
-            <w:proofErr w:type="gramEnd"/>
-            <w:r>
-              <w:t>: email.inesistente@ghost.com</w:t>
+            <w:r>
+              <w:t>Email: email.inesistente@ghost.com</w:t>
             </w:r>
           </w:p>
           <w:p>
@@ -7755,6 +8251,7 @@
           <w:numId w:val="23"/>
         </w:numPr>
       </w:pPr>
+      <w:bookmarkStart w:id="14" w:name="_Toc221350320"/>
       <w:r>
         <w:t xml:space="preserve">Integration </w:t>
       </w:r>
@@ -7766,6 +8263,7 @@
       <w:r>
         <w:t xml:space="preserve"> + PersistenceManagement</w:t>
       </w:r>
+      <w:bookmarkEnd w:id="14"/>
     </w:p>
     <w:p/>
     <w:p>
@@ -8914,21 +9412,12 @@
             <w:r>
               <w:t xml:space="preserve">La lista contiene esattamente </w:t>
             </w:r>
-            <w:proofErr w:type="gramStart"/>
-            <w:r>
-              <w:rPr>
-                <w:b/>
-                <w:bCs/>
-              </w:rPr>
-              <w:t>2</w:t>
-            </w:r>
-            <w:proofErr w:type="gramEnd"/>
-            <w:r>
-              <w:rPr>
-                <w:b/>
-                <w:bCs/>
-              </w:rPr>
-              <w:t xml:space="preserve"> task</w:t>
+            <w:r>
+              <w:rPr>
+                <w:b/>
+                <w:bCs/>
+              </w:rPr>
+              <w:t>2 task</w:t>
             </w:r>
             <w:r>
               <w:t>. Il task dell'altro supervisore è escluso.</w:t>
@@ -9182,12 +9671,14 @@
       </w:tr>
     </w:tbl>
     <w:p/>
+    <w:p/>
     <w:p>
       <w:pPr>
         <w:pStyle w:val="Titolo4"/>
       </w:pPr>
       <w:proofErr w:type="spellStart"/>
       <w:r>
+        <w:lastRenderedPageBreak/>
         <w:t>TaskDipendenteService</w:t>
       </w:r>
       <w:proofErr w:type="spellEnd"/>
@@ -9224,7 +9715,6 @@
                 <w:b/>
                 <w:bCs/>
               </w:rPr>
-              <w:lastRenderedPageBreak/>
               <w:t>ID Test Case</w:t>
             </w:r>
           </w:p>
@@ -10064,10 +10554,12 @@
           <w:numId w:val="23"/>
         </w:numPr>
       </w:pPr>
+      <w:bookmarkStart w:id="15" w:name="_Toc221350321"/>
       <w:r>
         <w:lastRenderedPageBreak/>
         <w:t>System testing</w:t>
       </w:r>
+      <w:bookmarkEnd w:id="15"/>
     </w:p>
     <w:p>
       <w:r>
@@ -10130,7 +10622,7 @@
           <w:numId w:val="23"/>
         </w:numPr>
       </w:pPr>
-      <w:bookmarkStart w:id="9" w:name="_Toc217148120"/>
+      <w:bookmarkStart w:id="16" w:name="_Toc221350322"/>
       <w:proofErr w:type="spellStart"/>
       <w:r>
         <w:t>Test_</w:t>
@@ -10148,7 +10640,7 @@
       <w:r>
         <w:t>(TC_1)</w:t>
       </w:r>
-      <w:bookmarkEnd w:id="9"/>
+      <w:bookmarkEnd w:id="16"/>
     </w:p>
     <w:p/>
     <w:tbl>
@@ -11274,7 +11766,7 @@
           <w:numId w:val="23"/>
         </w:numPr>
       </w:pPr>
-      <w:bookmarkStart w:id="10" w:name="_Toc217148122"/>
+      <w:bookmarkStart w:id="17" w:name="_Toc221350323"/>
       <w:proofErr w:type="spellStart"/>
       <w:r>
         <w:t>Test_</w:t>
@@ -11298,7 +11790,7 @@
       <w:r>
         <w:t>)</w:t>
       </w:r>
-      <w:bookmarkEnd w:id="10"/>
+      <w:bookmarkEnd w:id="17"/>
     </w:p>
     <w:p/>
     <w:tbl>
@@ -13499,7 +13991,7 @@
           <w:numId w:val="23"/>
         </w:numPr>
       </w:pPr>
-      <w:bookmarkStart w:id="11" w:name="_Toc217148124"/>
+      <w:bookmarkStart w:id="18" w:name="_Toc221350324"/>
       <w:proofErr w:type="spellStart"/>
       <w:r>
         <w:t>Test_</w:t>
@@ -13523,7 +14015,7 @@
       <w:r>
         <w:t>)</w:t>
       </w:r>
-      <w:bookmarkEnd w:id="11"/>
+      <w:bookmarkEnd w:id="18"/>
     </w:p>
     <w:p/>
     <w:tbl>
@@ -15703,27 +16195,21 @@
     </w:tbl>
     <w:p/>
     <w:p/>
-    <w:p>
-      <w:pPr>
-        <w:pStyle w:val="Titolo1"/>
-      </w:pPr>
-    </w:p>
+    <w:p/>
     <w:p>
       <w:pPr>
         <w:pStyle w:val="Titolo1"/>
         <w:numPr>
           <w:ilvl w:val="0"/>
-          <w:numId w:val="23"/>
+          <w:numId w:val="8"/>
         </w:numPr>
-      </w:pPr>
-      <w:bookmarkStart w:id="12" w:name="_Toc217148125"/>
-      <w:r>
-        <w:t xml:space="preserve">. </w:t>
-      </w:r>
+        <w:ind w:left="-284"/>
+      </w:pPr>
+      <w:bookmarkStart w:id="19" w:name="_Toc221350325"/>
       <w:r>
         <w:t>Testing Schedule</w:t>
       </w:r>
-      <w:bookmarkEnd w:id="12"/>
+      <w:bookmarkEnd w:id="19"/>
     </w:p>
     <w:p/>
     <w:p>
@@ -18472,7 +18958,7 @@
   <w:abstractNum w:abstractNumId="17" w15:restartNumberingAfterBreak="0">
     <w:nsid w:val="65506B4F"/>
     <w:multiLevelType w:val="hybridMultilevel"/>
-    <w:tmpl w:val="ACC46000"/>
+    <w:tmpl w:val="A8BCAB38"/>
     <w:lvl w:ilvl="0" w:tplc="0410000F">
       <w:start w:val="1"/>
       <w:numFmt w:val="decimal"/>
@@ -19995,6 +20481,7 @@
   <w:style w:type="character" w:default="1" w:styleId="Carpredefinitoparagrafo">
     <w:name w:val="Default Paragraph Font"/>
     <w:uiPriority w:val="1"/>
+    <w:semiHidden/>
     <w:unhideWhenUsed/>
   </w:style>
   <w:style w:type="table" w:default="1" w:styleId="Tabellanormale">

</xml_diff>

<commit_message>
Add: aggiunto file test selenium
Mod: modificato test plan e specification
</commit_message>
<xml_diff>
--- a/Workspace/Testing/Test plan/TestPlan_EWMS.docx
+++ b/Workspace/Testing/Test plan/TestPlan_EWMS.docx
@@ -12711,13 +12711,13 @@
         <w:tblLook w:val="04A0" w:firstRow="1" w:lastRow="0" w:firstColumn="1" w:lastColumn="0" w:noHBand="0" w:noVBand="1"/>
       </w:tblPr>
       <w:tblGrid>
-        <w:gridCol w:w="1004"/>
+        <w:gridCol w:w="1029"/>
         <w:gridCol w:w="843"/>
-        <w:gridCol w:w="1472"/>
+        <w:gridCol w:w="1507"/>
         <w:gridCol w:w="843"/>
-        <w:gridCol w:w="1409"/>
-        <w:gridCol w:w="1623"/>
-        <w:gridCol w:w="2433"/>
+        <w:gridCol w:w="1493"/>
+        <w:gridCol w:w="1070"/>
+        <w:gridCol w:w="2842"/>
       </w:tblGrid>
       <w:tr>
         <w:tc>
@@ -12869,7 +12869,14 @@
                 <w:b/>
                 <w:bCs/>
               </w:rPr>
-              <w:t>3.</w:t>
+              <w:t>2</w:t>
+            </w:r>
+            <w:r>
+              <w:rPr>
+                <w:b/>
+                <w:bCs/>
+              </w:rPr>
+              <w:t>.</w:t>
             </w:r>
             <w:r>
               <w:rPr>
@@ -13057,15 +13064,22 @@
                 <w:b/>
                 <w:bCs/>
               </w:rPr>
-              <w:t>3.</w:t>
-            </w:r>
-            <w:r>
-              <w:rPr>
-                <w:b/>
-                <w:bCs/>
-              </w:rPr>
               <w:t>2</w:t>
             </w:r>
+            <w:r>
+              <w:rPr>
+                <w:b/>
+                <w:bCs/>
+              </w:rPr>
+              <w:t>.</w:t>
+            </w:r>
+            <w:r>
+              <w:rPr>
+                <w:b/>
+                <w:bCs/>
+              </w:rPr>
+              <w:t>2</w:t>
+            </w:r>
           </w:p>
         </w:tc>
         <w:tc>
@@ -13078,7 +13092,7 @@
               <w:spacing w:after="160" w:line="259" w:lineRule="auto"/>
             </w:pPr>
             <w:r>
-              <w:t>Valido</w:t>
+              <w:t>Vuoto</w:t>
             </w:r>
           </w:p>
         </w:tc>
@@ -13134,7 +13148,7 @@
               <w:spacing w:after="160" w:line="259" w:lineRule="auto"/>
             </w:pPr>
             <w:r>
-              <w:t>Valido</w:t>
+              <w:t>N/A</w:t>
             </w:r>
           </w:p>
         </w:tc>
@@ -13146,65 +13160,24 @@
           <w:p>
             <w:pPr>
               <w:spacing w:after="160" w:line="259" w:lineRule="auto"/>
-              <w:rPr>
-                <w:lang w:val="en-GB"/>
-              </w:rPr>
-            </w:pPr>
-            <w:r>
-              <w:rPr>
-                <w:b/>
-                <w:bCs/>
-                <w:lang w:val="en-GB"/>
-              </w:rPr>
-              <w:t>Success</w:t>
-            </w:r>
-            <w:r>
-              <w:rPr>
-                <w:lang w:val="en-GB"/>
-              </w:rPr>
-              <w:t xml:space="preserve">: </w:t>
-            </w:r>
-            <w:r>
-              <w:rPr>
-                <w:b/>
-                <w:bCs/>
-                <w:lang w:val="en-GB"/>
-              </w:rPr>
-              <w:t>Task</w:t>
-            </w:r>
-            <w:r>
-              <w:rPr>
-                <w:lang w:val="en-GB"/>
-              </w:rPr>
-              <w:t xml:space="preserve"> e </w:t>
-            </w:r>
-            <w:r>
-              <w:rPr>
-                <w:b/>
-                <w:bCs/>
-                <w:lang w:val="en-GB"/>
-              </w:rPr>
-              <w:t>attachment</w:t>
-            </w:r>
-            <w:r>
-              <w:rPr>
-                <w:lang w:val="en-GB"/>
-              </w:rPr>
-              <w:t xml:space="preserve"> </w:t>
+            </w:pPr>
+            <w:r>
+              <w:rPr>
+                <w:b/>
+                <w:bCs/>
+              </w:rPr>
+              <w:t>Error</w:t>
+            </w:r>
+            <w:r>
+              <w:t>: "Il campo '</w:t>
             </w:r>
             <w:proofErr w:type="spellStart"/>
             <w:r>
-              <w:rPr>
-                <w:lang w:val="en-GB"/>
-              </w:rPr>
-              <w:t>salvati</w:t>
+              <w:t>Titolo'</w:t>
             </w:r>
             <w:proofErr w:type="spellEnd"/>
             <w:r>
-              <w:rPr>
-                <w:lang w:val="en-GB"/>
-              </w:rPr>
-              <w:t xml:space="preserve"> </w:t>
+              <w:t xml:space="preserve"> è obbligatorio" </w:t>
             </w:r>
           </w:p>
         </w:tc>
@@ -13231,7 +13204,14 @@
                 <w:b/>
                 <w:bCs/>
               </w:rPr>
-              <w:t>3.</w:t>
+              <w:t>2</w:t>
+            </w:r>
+            <w:r>
+              <w:rPr>
+                <w:b/>
+                <w:bCs/>
+              </w:rPr>
+              <w:t>.</w:t>
             </w:r>
             <w:r>
               <w:rPr>
@@ -13252,7 +13232,7 @@
               <w:spacing w:after="160" w:line="259" w:lineRule="auto"/>
             </w:pPr>
             <w:r>
-              <w:t>Vuoto</w:t>
+              <w:t>Valido</w:t>
             </w:r>
           </w:p>
         </w:tc>
@@ -13266,7 +13246,7 @@
               <w:spacing w:after="160" w:line="259" w:lineRule="auto"/>
             </w:pPr>
             <w:r>
-              <w:t>Selezionato</w:t>
+              <w:t>Non selezionato</w:t>
             </w:r>
           </w:p>
         </w:tc>
@@ -13329,15 +13309,7 @@
               <w:t>Error</w:t>
             </w:r>
             <w:r>
-              <w:t>: "Il campo '</w:t>
-            </w:r>
-            <w:proofErr w:type="spellStart"/>
-            <w:r>
-              <w:t>Titolo'</w:t>
-            </w:r>
-            <w:proofErr w:type="spellEnd"/>
-            <w:r>
-              <w:t xml:space="preserve"> è obbligatorio" </w:t>
+              <w:t xml:space="preserve">: "Per favore scegliere un dipendente" </w:t>
             </w:r>
           </w:p>
         </w:tc>
@@ -13364,7 +13336,14 @@
                 <w:b/>
                 <w:bCs/>
               </w:rPr>
-              <w:t>3.</w:t>
+              <w:t>2</w:t>
+            </w:r>
+            <w:r>
+              <w:rPr>
+                <w:b/>
+                <w:bCs/>
+              </w:rPr>
+              <w:t>.</w:t>
             </w:r>
             <w:r>
               <w:rPr>
@@ -13399,7 +13378,7 @@
               <w:spacing w:after="160" w:line="259" w:lineRule="auto"/>
             </w:pPr>
             <w:r>
-              <w:t>Non selezionato</w:t>
+              <w:t>Selezionato</w:t>
             </w:r>
           </w:p>
         </w:tc>
@@ -13413,7 +13392,7 @@
               <w:spacing w:after="160" w:line="259" w:lineRule="auto"/>
             </w:pPr>
             <w:r>
-              <w:t>Futura</w:t>
+              <w:t>Errata</w:t>
             </w:r>
           </w:p>
         </w:tc>
@@ -13462,7 +13441,7 @@
               <w:t>Error</w:t>
             </w:r>
             <w:r>
-              <w:t xml:space="preserve">: "Per favore scegliere un dipendente" </w:t>
+              <w:t xml:space="preserve">: "Data di scadenza obbligatoria e in formato valido" </w:t>
             </w:r>
           </w:p>
         </w:tc>
@@ -13489,7 +13468,14 @@
                 <w:b/>
                 <w:bCs/>
               </w:rPr>
-              <w:t>3.</w:t>
+              <w:t>2</w:t>
+            </w:r>
+            <w:r>
+              <w:rPr>
+                <w:b/>
+                <w:bCs/>
+              </w:rPr>
+              <w:t>.</w:t>
             </w:r>
             <w:r>
               <w:rPr>
@@ -13538,7 +13524,7 @@
               <w:spacing w:after="160" w:line="259" w:lineRule="auto"/>
             </w:pPr>
             <w:r>
-              <w:t>Errata</w:t>
+              <w:t>Futura</w:t>
             </w:r>
           </w:p>
         </w:tc>
@@ -13552,7 +13538,7 @@
               <w:spacing w:after="160" w:line="259" w:lineRule="auto"/>
             </w:pPr>
             <w:r>
-              <w:t>Valida</w:t>
+              <w:t>Formato non valido</w:t>
             </w:r>
           </w:p>
         </w:tc>
@@ -13587,131 +13573,6 @@
               <w:t>Error</w:t>
             </w:r>
             <w:r>
-              <w:t xml:space="preserve">: "Data di scadenza obbligatoria e in formato valido" </w:t>
-            </w:r>
-          </w:p>
-        </w:tc>
-      </w:tr>
-      <w:tr>
-        <w:tc>
-          <w:tcPr>
-            <w:tcW w:w="0" w:type="auto"/>
-            <w:hideMark/>
-          </w:tcPr>
-          <w:p>
-            <w:pPr>
-              <w:spacing w:after="160" w:line="259" w:lineRule="auto"/>
-            </w:pPr>
-            <w:r>
-              <w:rPr>
-                <w:b/>
-                <w:bCs/>
-              </w:rPr>
-              <w:t>TF_</w:t>
-            </w:r>
-            <w:r>
-              <w:rPr>
-                <w:b/>
-                <w:bCs/>
-              </w:rPr>
-              <w:t>3.</w:t>
-            </w:r>
-            <w:r>
-              <w:rPr>
-                <w:b/>
-                <w:bCs/>
-              </w:rPr>
-              <w:t>6</w:t>
-            </w:r>
-          </w:p>
-        </w:tc>
-        <w:tc>
-          <w:tcPr>
-            <w:tcW w:w="0" w:type="auto"/>
-            <w:hideMark/>
-          </w:tcPr>
-          <w:p>
-            <w:pPr>
-              <w:spacing w:after="160" w:line="259" w:lineRule="auto"/>
-            </w:pPr>
-            <w:r>
-              <w:t>Valido</w:t>
-            </w:r>
-          </w:p>
-        </w:tc>
-        <w:tc>
-          <w:tcPr>
-            <w:tcW w:w="0" w:type="auto"/>
-            <w:hideMark/>
-          </w:tcPr>
-          <w:p>
-            <w:pPr>
-              <w:spacing w:after="160" w:line="259" w:lineRule="auto"/>
-            </w:pPr>
-            <w:r>
-              <w:t>Selezionato</w:t>
-            </w:r>
-          </w:p>
-        </w:tc>
-        <w:tc>
-          <w:tcPr>
-            <w:tcW w:w="0" w:type="auto"/>
-            <w:hideMark/>
-          </w:tcPr>
-          <w:p>
-            <w:pPr>
-              <w:spacing w:after="160" w:line="259" w:lineRule="auto"/>
-            </w:pPr>
-            <w:r>
-              <w:t>Futura</w:t>
-            </w:r>
-          </w:p>
-        </w:tc>
-        <w:tc>
-          <w:tcPr>
-            <w:tcW w:w="0" w:type="auto"/>
-            <w:hideMark/>
-          </w:tcPr>
-          <w:p>
-            <w:pPr>
-              <w:spacing w:after="160" w:line="259" w:lineRule="auto"/>
-            </w:pPr>
-            <w:r>
-              <w:t>Formato non valido</w:t>
-            </w:r>
-          </w:p>
-        </w:tc>
-        <w:tc>
-          <w:tcPr>
-            <w:tcW w:w="0" w:type="auto"/>
-            <w:hideMark/>
-          </w:tcPr>
-          <w:p>
-            <w:pPr>
-              <w:spacing w:after="160" w:line="259" w:lineRule="auto"/>
-            </w:pPr>
-            <w:r>
-              <w:t>N/A</w:t>
-            </w:r>
-          </w:p>
-        </w:tc>
-        <w:tc>
-          <w:tcPr>
-            <w:tcW w:w="0" w:type="auto"/>
-            <w:hideMark/>
-          </w:tcPr>
-          <w:p>
-            <w:pPr>
-              <w:spacing w:after="160" w:line="259" w:lineRule="auto"/>
-            </w:pPr>
-            <w:r>
-              <w:rPr>
-                <w:b/>
-                <w:bCs/>
-              </w:rPr>
-              <w:t>Error</w:t>
-            </w:r>
-            <w:r>
               <w:t>: "Inserire istruzioni (min. 10</w:t>
             </w:r>
             <w:r>
@@ -13725,262 +13586,13 @@
             </w:r>
             <w:r>
               <w:t xml:space="preserve"> caratteri)" </w:t>
-            </w:r>
-          </w:p>
-        </w:tc>
-      </w:tr>
-      <w:tr>
-        <w:tc>
-          <w:tcPr>
-            <w:tcW w:w="0" w:type="auto"/>
-            <w:hideMark/>
-          </w:tcPr>
-          <w:p>
-            <w:pPr>
-              <w:spacing w:after="160" w:line="259" w:lineRule="auto"/>
-            </w:pPr>
-            <w:r>
-              <w:rPr>
-                <w:b/>
-                <w:bCs/>
-              </w:rPr>
-              <w:t>TF_</w:t>
-            </w:r>
-            <w:r>
-              <w:rPr>
-                <w:b/>
-                <w:bCs/>
-              </w:rPr>
-              <w:t>3.</w:t>
-            </w:r>
-            <w:r>
-              <w:rPr>
-                <w:b/>
-                <w:bCs/>
-              </w:rPr>
-              <w:t>7</w:t>
-            </w:r>
-          </w:p>
-        </w:tc>
-        <w:tc>
-          <w:tcPr>
-            <w:tcW w:w="0" w:type="auto"/>
-            <w:hideMark/>
-          </w:tcPr>
-          <w:p>
-            <w:pPr>
-              <w:spacing w:after="160" w:line="259" w:lineRule="auto"/>
-            </w:pPr>
-            <w:r>
-              <w:t>Valido</w:t>
-            </w:r>
-          </w:p>
-        </w:tc>
-        <w:tc>
-          <w:tcPr>
-            <w:tcW w:w="0" w:type="auto"/>
-            <w:hideMark/>
-          </w:tcPr>
-          <w:p>
-            <w:pPr>
-              <w:spacing w:after="160" w:line="259" w:lineRule="auto"/>
-            </w:pPr>
-            <w:r>
-              <w:t>Selezionato</w:t>
-            </w:r>
-          </w:p>
-        </w:tc>
-        <w:tc>
-          <w:tcPr>
-            <w:tcW w:w="0" w:type="auto"/>
-            <w:hideMark/>
-          </w:tcPr>
-          <w:p>
-            <w:pPr>
-              <w:spacing w:after="160" w:line="259" w:lineRule="auto"/>
-            </w:pPr>
-            <w:r>
-              <w:t>Futura</w:t>
-            </w:r>
-          </w:p>
-        </w:tc>
-        <w:tc>
-          <w:tcPr>
-            <w:tcW w:w="0" w:type="auto"/>
-            <w:hideMark/>
-          </w:tcPr>
-          <w:p>
-            <w:pPr>
-              <w:spacing w:after="160" w:line="259" w:lineRule="auto"/>
-            </w:pPr>
-            <w:r>
-              <w:t>Valida</w:t>
-            </w:r>
-          </w:p>
-        </w:tc>
-        <w:tc>
-          <w:tcPr>
-            <w:tcW w:w="0" w:type="auto"/>
-            <w:hideMark/>
-          </w:tcPr>
-          <w:p>
-            <w:pPr>
-              <w:spacing w:after="160" w:line="259" w:lineRule="auto"/>
-            </w:pPr>
-            <w:r>
-              <w:t>Formato non supportato</w:t>
-            </w:r>
-          </w:p>
-        </w:tc>
-        <w:tc>
-          <w:tcPr>
-            <w:tcW w:w="0" w:type="auto"/>
-            <w:hideMark/>
-          </w:tcPr>
-          <w:p>
-            <w:pPr>
-              <w:spacing w:after="160" w:line="259" w:lineRule="auto"/>
-            </w:pPr>
-            <w:r>
-              <w:rPr>
-                <w:b/>
-                <w:bCs/>
-              </w:rPr>
-              <w:t>Error</w:t>
-            </w:r>
-            <w:r>
-              <w:t xml:space="preserve">: "Inserito file non consentito" </w:t>
-            </w:r>
-          </w:p>
-        </w:tc>
-      </w:tr>
-      <w:tr>
-        <w:tc>
-          <w:tcPr>
-            <w:tcW w:w="0" w:type="auto"/>
-            <w:hideMark/>
-          </w:tcPr>
-          <w:p>
-            <w:pPr>
-              <w:spacing w:after="160" w:line="259" w:lineRule="auto"/>
-            </w:pPr>
-            <w:r>
-              <w:rPr>
-                <w:b/>
-                <w:bCs/>
-              </w:rPr>
-              <w:lastRenderedPageBreak/>
-              <w:t>TF_</w:t>
-            </w:r>
-            <w:r>
-              <w:rPr>
-                <w:b/>
-                <w:bCs/>
-              </w:rPr>
-              <w:t>3.</w:t>
-            </w:r>
-            <w:r>
-              <w:rPr>
-                <w:b/>
-                <w:bCs/>
-              </w:rPr>
-              <w:t>8</w:t>
-            </w:r>
-          </w:p>
-        </w:tc>
-        <w:tc>
-          <w:tcPr>
-            <w:tcW w:w="0" w:type="auto"/>
-            <w:hideMark/>
-          </w:tcPr>
-          <w:p>
-            <w:pPr>
-              <w:spacing w:after="160" w:line="259" w:lineRule="auto"/>
-            </w:pPr>
-            <w:r>
-              <w:t>Valido</w:t>
-            </w:r>
-          </w:p>
-        </w:tc>
-        <w:tc>
-          <w:tcPr>
-            <w:tcW w:w="0" w:type="auto"/>
-            <w:hideMark/>
-          </w:tcPr>
-          <w:p>
-            <w:pPr>
-              <w:spacing w:after="160" w:line="259" w:lineRule="auto"/>
-            </w:pPr>
-            <w:r>
-              <w:t>Selezionato</w:t>
-            </w:r>
-          </w:p>
-        </w:tc>
-        <w:tc>
-          <w:tcPr>
-            <w:tcW w:w="0" w:type="auto"/>
-            <w:hideMark/>
-          </w:tcPr>
-          <w:p>
-            <w:pPr>
-              <w:spacing w:after="160" w:line="259" w:lineRule="auto"/>
-            </w:pPr>
-            <w:r>
-              <w:t>Futura</w:t>
-            </w:r>
-          </w:p>
-        </w:tc>
-        <w:tc>
-          <w:tcPr>
-            <w:tcW w:w="0" w:type="auto"/>
-            <w:hideMark/>
-          </w:tcPr>
-          <w:p>
-            <w:pPr>
-              <w:spacing w:after="160" w:line="259" w:lineRule="auto"/>
-            </w:pPr>
-            <w:r>
-              <w:t>Valida</w:t>
-            </w:r>
-          </w:p>
-        </w:tc>
-        <w:tc>
-          <w:tcPr>
-            <w:tcW w:w="0" w:type="auto"/>
-            <w:hideMark/>
-          </w:tcPr>
-          <w:p>
-            <w:pPr>
-              <w:spacing w:after="160" w:line="259" w:lineRule="auto"/>
-            </w:pPr>
-            <w:r>
-              <w:t>Dimensione eccessiva</w:t>
-            </w:r>
-          </w:p>
-        </w:tc>
-        <w:tc>
-          <w:tcPr>
-            <w:tcW w:w="0" w:type="auto"/>
-            <w:hideMark/>
-          </w:tcPr>
-          <w:p>
-            <w:pPr>
-              <w:spacing w:after="160" w:line="259" w:lineRule="auto"/>
-            </w:pPr>
-            <w:r>
-              <w:rPr>
-                <w:b/>
-                <w:bCs/>
-              </w:rPr>
-              <w:t>Error</w:t>
-            </w:r>
-            <w:r>
-              <w:t xml:space="preserve">: "Il file supera la dimensione massima" </w:t>
             </w:r>
           </w:p>
         </w:tc>
       </w:tr>
     </w:tbl>
+    <w:p/>
+    <w:p/>
     <w:p/>
     <w:p/>
     <w:p>
@@ -13994,6 +13606,7 @@
       <w:bookmarkStart w:id="18" w:name="_Toc221350324"/>
       <w:proofErr w:type="spellStart"/>
       <w:r>
+        <w:lastRenderedPageBreak/>
         <w:t>Test_</w:t>
       </w:r>
       <w:r>
@@ -14694,7 +14307,6 @@
         <w:pStyle w:val="Titolo4"/>
       </w:pPr>
       <w:r>
-        <w:lastRenderedPageBreak/>
         <w:t>Tabella formati</w:t>
       </w:r>
     </w:p>
@@ -14830,6 +14442,7 @@
           <w:p>
             <w:proofErr w:type="gramStart"/>
             <w:r>
+              <w:lastRenderedPageBreak/>
               <w:t>Email</w:t>
             </w:r>
             <w:proofErr w:type="gramEnd"/>
@@ -14920,24 +14533,25 @@
     <w:tbl>
       <w:tblPr>
         <w:tblStyle w:val="Grigliatabella"/>
-        <w:tblW w:w="0" w:type="auto"/>
+        <w:tblW w:w="10348" w:type="dxa"/>
         <w:tblInd w:w="-147" w:type="dxa"/>
         <w:tblLayout w:type="fixed"/>
         <w:tblLook w:val="04A0" w:firstRow="1" w:lastRow="0" w:firstColumn="1" w:lastColumn="0" w:noHBand="0" w:noVBand="1"/>
       </w:tblPr>
       <w:tblGrid>
-        <w:gridCol w:w="993"/>
-        <w:gridCol w:w="1134"/>
-        <w:gridCol w:w="1276"/>
-        <w:gridCol w:w="1134"/>
-        <w:gridCol w:w="1299"/>
-        <w:gridCol w:w="1788"/>
-        <w:gridCol w:w="2151"/>
+        <w:gridCol w:w="1233"/>
+        <w:gridCol w:w="1233"/>
+        <w:gridCol w:w="1234"/>
+        <w:gridCol w:w="1233"/>
+        <w:gridCol w:w="1233"/>
+        <w:gridCol w:w="1234"/>
+        <w:gridCol w:w="1233"/>
+        <w:gridCol w:w="1715"/>
       </w:tblGrid>
       <w:tr>
         <w:tc>
           <w:tcPr>
-            <w:tcW w:w="993" w:type="dxa"/>
+            <w:tcW w:w="1233" w:type="dxa"/>
             <w:hideMark/>
           </w:tcPr>
           <w:p>
@@ -14955,7 +14569,7 @@
         </w:tc>
         <w:tc>
           <w:tcPr>
-            <w:tcW w:w="1134" w:type="dxa"/>
+            <w:tcW w:w="1233" w:type="dxa"/>
             <w:hideMark/>
           </w:tcPr>
           <w:p>
@@ -14973,7 +14587,7 @@
         </w:tc>
         <w:tc>
           <w:tcPr>
-            <w:tcW w:w="1276" w:type="dxa"/>
+            <w:tcW w:w="1234" w:type="dxa"/>
             <w:hideMark/>
           </w:tcPr>
           <w:p>
@@ -14991,7 +14605,7 @@
         </w:tc>
         <w:tc>
           <w:tcPr>
-            <w:tcW w:w="1134" w:type="dxa"/>
+            <w:tcW w:w="1233" w:type="dxa"/>
             <w:hideMark/>
           </w:tcPr>
           <w:p>
@@ -15009,7 +14623,7 @@
         </w:tc>
         <w:tc>
           <w:tcPr>
-            <w:tcW w:w="1299" w:type="dxa"/>
+            <w:tcW w:w="1233" w:type="dxa"/>
             <w:hideMark/>
           </w:tcPr>
           <w:p>
@@ -15027,7 +14641,27 @@
         </w:tc>
         <w:tc>
           <w:tcPr>
-            <w:tcW w:w="1788" w:type="dxa"/>
+            <w:tcW w:w="1234" w:type="dxa"/>
+          </w:tcPr>
+          <w:p>
+            <w:pPr>
+              <w:rPr>
+                <w:b/>
+                <w:bCs/>
+              </w:rPr>
+            </w:pPr>
+            <w:r>
+              <w:rPr>
+                <w:b/>
+                <w:bCs/>
+              </w:rPr>
+              <w:t>Ruolo</w:t>
+            </w:r>
+          </w:p>
+        </w:tc>
+        <w:tc>
+          <w:tcPr>
+            <w:tcW w:w="1233" w:type="dxa"/>
             <w:hideMark/>
           </w:tcPr>
           <w:p>
@@ -15052,7 +14686,7 @@
         </w:tc>
         <w:tc>
           <w:tcPr>
-            <w:tcW w:w="2151" w:type="dxa"/>
+            <w:tcW w:w="1715" w:type="dxa"/>
             <w:hideMark/>
           </w:tcPr>
           <w:p>
@@ -15072,7 +14706,7 @@
       <w:tr>
         <w:tc>
           <w:tcPr>
-            <w:tcW w:w="993" w:type="dxa"/>
+            <w:tcW w:w="1233" w:type="dxa"/>
             <w:hideMark/>
           </w:tcPr>
           <w:p>
@@ -15091,7 +14725,7 @@
                 <w:b/>
                 <w:bCs/>
               </w:rPr>
-              <w:t>5.</w:t>
+              <w:t>3.</w:t>
             </w:r>
             <w:r>
               <w:rPr>
@@ -15104,7 +14738,7 @@
         </w:tc>
         <w:tc>
           <w:tcPr>
-            <w:tcW w:w="1134" w:type="dxa"/>
+            <w:tcW w:w="1233" w:type="dxa"/>
             <w:hideMark/>
           </w:tcPr>
           <w:p>
@@ -15118,7 +14752,7 @@
         </w:tc>
         <w:tc>
           <w:tcPr>
-            <w:tcW w:w="1276" w:type="dxa"/>
+            <w:tcW w:w="1234" w:type="dxa"/>
             <w:hideMark/>
           </w:tcPr>
           <w:p>
@@ -15132,7 +14766,7 @@
         </w:tc>
         <w:tc>
           <w:tcPr>
-            <w:tcW w:w="1134" w:type="dxa"/>
+            <w:tcW w:w="1233" w:type="dxa"/>
             <w:hideMark/>
           </w:tcPr>
           <w:p>
@@ -15146,7 +14780,7 @@
         </w:tc>
         <w:tc>
           <w:tcPr>
-            <w:tcW w:w="1299" w:type="dxa"/>
+            <w:tcW w:w="1233" w:type="dxa"/>
             <w:hideMark/>
           </w:tcPr>
           <w:p>
@@ -15160,7 +14794,17 @@
         </w:tc>
         <w:tc>
           <w:tcPr>
-            <w:tcW w:w="1788" w:type="dxa"/>
+            <w:tcW w:w="1234" w:type="dxa"/>
+          </w:tcPr>
+          <w:p>
+            <w:r>
+              <w:t>SUPERVISORE</w:t>
+            </w:r>
+          </w:p>
+        </w:tc>
+        <w:tc>
+          <w:tcPr>
+            <w:tcW w:w="1233" w:type="dxa"/>
             <w:hideMark/>
           </w:tcPr>
           <w:p>
@@ -15177,7 +14821,7 @@
         </w:tc>
         <w:tc>
           <w:tcPr>
-            <w:tcW w:w="2151" w:type="dxa"/>
+            <w:tcW w:w="1715" w:type="dxa"/>
             <w:hideMark/>
           </w:tcPr>
           <w:p>
@@ -15210,7 +14854,7 @@
       <w:tr>
         <w:tc>
           <w:tcPr>
-            <w:tcW w:w="993" w:type="dxa"/>
+            <w:tcW w:w="1233" w:type="dxa"/>
             <w:hideMark/>
           </w:tcPr>
           <w:p>
@@ -15229,7 +14873,7 @@
                 <w:b/>
                 <w:bCs/>
               </w:rPr>
-              <w:t>5.</w:t>
+              <w:t>3.</w:t>
             </w:r>
             <w:r>
               <w:rPr>
@@ -15242,7 +14886,7 @@
         </w:tc>
         <w:tc>
           <w:tcPr>
-            <w:tcW w:w="1134" w:type="dxa"/>
+            <w:tcW w:w="1233" w:type="dxa"/>
             <w:hideMark/>
           </w:tcPr>
           <w:p>
@@ -15256,7 +14900,7 @@
         </w:tc>
         <w:tc>
           <w:tcPr>
-            <w:tcW w:w="1276" w:type="dxa"/>
+            <w:tcW w:w="1234" w:type="dxa"/>
             <w:hideMark/>
           </w:tcPr>
           <w:p>
@@ -15270,7 +14914,7 @@
         </w:tc>
         <w:tc>
           <w:tcPr>
-            <w:tcW w:w="1134" w:type="dxa"/>
+            <w:tcW w:w="1233" w:type="dxa"/>
             <w:hideMark/>
           </w:tcPr>
           <w:p>
@@ -15284,7 +14928,7 @@
         </w:tc>
         <w:tc>
           <w:tcPr>
-            <w:tcW w:w="1299" w:type="dxa"/>
+            <w:tcW w:w="1233" w:type="dxa"/>
             <w:hideMark/>
           </w:tcPr>
           <w:p>
@@ -15298,7 +14942,17 @@
         </w:tc>
         <w:tc>
           <w:tcPr>
-            <w:tcW w:w="1788" w:type="dxa"/>
+            <w:tcW w:w="1234" w:type="dxa"/>
+          </w:tcPr>
+          <w:p>
+            <w:r>
+              <w:t>SUPERVISORE</w:t>
+            </w:r>
+          </w:p>
+        </w:tc>
+        <w:tc>
+          <w:tcPr>
+            <w:tcW w:w="1233" w:type="dxa"/>
             <w:hideMark/>
           </w:tcPr>
           <w:p>
@@ -15315,7 +14969,7 @@
         </w:tc>
         <w:tc>
           <w:tcPr>
-            <w:tcW w:w="2151" w:type="dxa"/>
+            <w:tcW w:w="1715" w:type="dxa"/>
             <w:hideMark/>
           </w:tcPr>
           <w:p>
@@ -15338,7 +14992,7 @@
       <w:tr>
         <w:tc>
           <w:tcPr>
-            <w:tcW w:w="993" w:type="dxa"/>
+            <w:tcW w:w="1233" w:type="dxa"/>
             <w:hideMark/>
           </w:tcPr>
           <w:p>
@@ -15357,7 +15011,7 @@
                 <w:b/>
                 <w:bCs/>
               </w:rPr>
-              <w:t>5.</w:t>
+              <w:t>3.</w:t>
             </w:r>
             <w:r>
               <w:rPr>
@@ -15370,7 +15024,7 @@
         </w:tc>
         <w:tc>
           <w:tcPr>
-            <w:tcW w:w="1134" w:type="dxa"/>
+            <w:tcW w:w="1233" w:type="dxa"/>
             <w:hideMark/>
           </w:tcPr>
           <w:p>
@@ -15384,7 +15038,7 @@
         </w:tc>
         <w:tc>
           <w:tcPr>
-            <w:tcW w:w="1276" w:type="dxa"/>
+            <w:tcW w:w="1234" w:type="dxa"/>
             <w:hideMark/>
           </w:tcPr>
           <w:p>
@@ -15398,7 +15052,7 @@
         </w:tc>
         <w:tc>
           <w:tcPr>
-            <w:tcW w:w="1134" w:type="dxa"/>
+            <w:tcW w:w="1233" w:type="dxa"/>
             <w:hideMark/>
           </w:tcPr>
           <w:p>
@@ -15412,7 +15066,7 @@
         </w:tc>
         <w:tc>
           <w:tcPr>
-            <w:tcW w:w="1299" w:type="dxa"/>
+            <w:tcW w:w="1233" w:type="dxa"/>
             <w:hideMark/>
           </w:tcPr>
           <w:p>
@@ -15426,7 +15080,17 @@
         </w:tc>
         <w:tc>
           <w:tcPr>
-            <w:tcW w:w="1788" w:type="dxa"/>
+            <w:tcW w:w="1234" w:type="dxa"/>
+          </w:tcPr>
+          <w:p>
+            <w:r>
+              <w:t>SUPERVISORE</w:t>
+            </w:r>
+          </w:p>
+        </w:tc>
+        <w:tc>
+          <w:tcPr>
+            <w:tcW w:w="1233" w:type="dxa"/>
             <w:hideMark/>
           </w:tcPr>
           <w:p>
@@ -15443,7 +15107,7 @@
         </w:tc>
         <w:tc>
           <w:tcPr>
-            <w:tcW w:w="2151" w:type="dxa"/>
+            <w:tcW w:w="1715" w:type="dxa"/>
             <w:hideMark/>
           </w:tcPr>
           <w:p>
@@ -15466,7 +15130,7 @@
       <w:tr>
         <w:tc>
           <w:tcPr>
-            <w:tcW w:w="993" w:type="dxa"/>
+            <w:tcW w:w="1233" w:type="dxa"/>
             <w:hideMark/>
           </w:tcPr>
           <w:p>
@@ -15485,7 +15149,7 @@
                 <w:b/>
                 <w:bCs/>
               </w:rPr>
-              <w:t>5.</w:t>
+              <w:t>3.</w:t>
             </w:r>
             <w:r>
               <w:rPr>
@@ -15498,7 +15162,7 @@
         </w:tc>
         <w:tc>
           <w:tcPr>
-            <w:tcW w:w="1134" w:type="dxa"/>
+            <w:tcW w:w="1233" w:type="dxa"/>
             <w:hideMark/>
           </w:tcPr>
           <w:p>
@@ -15512,7 +15176,7 @@
         </w:tc>
         <w:tc>
           <w:tcPr>
-            <w:tcW w:w="1276" w:type="dxa"/>
+            <w:tcW w:w="1234" w:type="dxa"/>
             <w:hideMark/>
           </w:tcPr>
           <w:p>
@@ -15526,7 +15190,7 @@
         </w:tc>
         <w:tc>
           <w:tcPr>
-            <w:tcW w:w="1134" w:type="dxa"/>
+            <w:tcW w:w="1233" w:type="dxa"/>
             <w:hideMark/>
           </w:tcPr>
           <w:p>
@@ -15540,7 +15204,7 @@
         </w:tc>
         <w:tc>
           <w:tcPr>
-            <w:tcW w:w="1299" w:type="dxa"/>
+            <w:tcW w:w="1233" w:type="dxa"/>
             <w:hideMark/>
           </w:tcPr>
           <w:p>
@@ -15554,7 +15218,17 @@
         </w:tc>
         <w:tc>
           <w:tcPr>
-            <w:tcW w:w="1788" w:type="dxa"/>
+            <w:tcW w:w="1234" w:type="dxa"/>
+          </w:tcPr>
+          <w:p>
+            <w:r>
+              <w:t>SUPERVISORE</w:t>
+            </w:r>
+          </w:p>
+        </w:tc>
+        <w:tc>
+          <w:tcPr>
+            <w:tcW w:w="1233" w:type="dxa"/>
             <w:hideMark/>
           </w:tcPr>
           <w:p>
@@ -15571,7 +15245,7 @@
         </w:tc>
         <w:tc>
           <w:tcPr>
-            <w:tcW w:w="2151" w:type="dxa"/>
+            <w:tcW w:w="1715" w:type="dxa"/>
             <w:hideMark/>
           </w:tcPr>
           <w:p>
@@ -15594,7 +15268,7 @@
       <w:tr>
         <w:tc>
           <w:tcPr>
-            <w:tcW w:w="993" w:type="dxa"/>
+            <w:tcW w:w="1233" w:type="dxa"/>
             <w:hideMark/>
           </w:tcPr>
           <w:p>
@@ -15613,7 +15287,7 @@
                 <w:b/>
                 <w:bCs/>
               </w:rPr>
-              <w:t>5.</w:t>
+              <w:t>3.</w:t>
             </w:r>
             <w:r>
               <w:rPr>
@@ -15626,7 +15300,7 @@
         </w:tc>
         <w:tc>
           <w:tcPr>
-            <w:tcW w:w="1134" w:type="dxa"/>
+            <w:tcW w:w="1233" w:type="dxa"/>
             <w:hideMark/>
           </w:tcPr>
           <w:p>
@@ -15640,7 +15314,7 @@
         </w:tc>
         <w:tc>
           <w:tcPr>
-            <w:tcW w:w="1276" w:type="dxa"/>
+            <w:tcW w:w="1234" w:type="dxa"/>
             <w:hideMark/>
           </w:tcPr>
           <w:p>
@@ -15654,7 +15328,7 @@
         </w:tc>
         <w:tc>
           <w:tcPr>
-            <w:tcW w:w="1134" w:type="dxa"/>
+            <w:tcW w:w="1233" w:type="dxa"/>
             <w:hideMark/>
           </w:tcPr>
           <w:p>
@@ -15668,7 +15342,7 @@
         </w:tc>
         <w:tc>
           <w:tcPr>
-            <w:tcW w:w="1299" w:type="dxa"/>
+            <w:tcW w:w="1233" w:type="dxa"/>
             <w:hideMark/>
           </w:tcPr>
           <w:p>
@@ -15682,7 +15356,17 @@
         </w:tc>
         <w:tc>
           <w:tcPr>
-            <w:tcW w:w="1788" w:type="dxa"/>
+            <w:tcW w:w="1234" w:type="dxa"/>
+          </w:tcPr>
+          <w:p>
+            <w:r>
+              <w:t>SUPERVISORE</w:t>
+            </w:r>
+          </w:p>
+        </w:tc>
+        <w:tc>
+          <w:tcPr>
+            <w:tcW w:w="1233" w:type="dxa"/>
             <w:hideMark/>
           </w:tcPr>
           <w:p>
@@ -15699,7 +15383,7 @@
         </w:tc>
         <w:tc>
           <w:tcPr>
-            <w:tcW w:w="2151" w:type="dxa"/>
+            <w:tcW w:w="1715" w:type="dxa"/>
             <w:hideMark/>
           </w:tcPr>
           <w:p>
@@ -15730,7 +15414,7 @@
       <w:tr>
         <w:tc>
           <w:tcPr>
-            <w:tcW w:w="993" w:type="dxa"/>
+            <w:tcW w:w="1233" w:type="dxa"/>
             <w:hideMark/>
           </w:tcPr>
           <w:p>
@@ -15749,7 +15433,7 @@
                 <w:b/>
                 <w:bCs/>
               </w:rPr>
-              <w:t>5.</w:t>
+              <w:t>3.</w:t>
             </w:r>
             <w:r>
               <w:rPr>
@@ -15762,7 +15446,7 @@
         </w:tc>
         <w:tc>
           <w:tcPr>
-            <w:tcW w:w="1134" w:type="dxa"/>
+            <w:tcW w:w="1233" w:type="dxa"/>
             <w:hideMark/>
           </w:tcPr>
           <w:p>
@@ -15776,7 +15460,7 @@
         </w:tc>
         <w:tc>
           <w:tcPr>
-            <w:tcW w:w="1276" w:type="dxa"/>
+            <w:tcW w:w="1234" w:type="dxa"/>
             <w:hideMark/>
           </w:tcPr>
           <w:p>
@@ -15790,7 +15474,7 @@
         </w:tc>
         <w:tc>
           <w:tcPr>
-            <w:tcW w:w="1134" w:type="dxa"/>
+            <w:tcW w:w="1233" w:type="dxa"/>
             <w:hideMark/>
           </w:tcPr>
           <w:p>
@@ -15804,7 +15488,7 @@
         </w:tc>
         <w:tc>
           <w:tcPr>
-            <w:tcW w:w="1299" w:type="dxa"/>
+            <w:tcW w:w="1233" w:type="dxa"/>
             <w:hideMark/>
           </w:tcPr>
           <w:p>
@@ -15818,7 +15502,17 @@
         </w:tc>
         <w:tc>
           <w:tcPr>
-            <w:tcW w:w="1788" w:type="dxa"/>
+            <w:tcW w:w="1234" w:type="dxa"/>
+          </w:tcPr>
+          <w:p>
+            <w:r>
+              <w:t>SUPERVISORE</w:t>
+            </w:r>
+          </w:p>
+        </w:tc>
+        <w:tc>
+          <w:tcPr>
+            <w:tcW w:w="1233" w:type="dxa"/>
             <w:hideMark/>
           </w:tcPr>
           <w:p>
@@ -15835,7 +15529,7 @@
         </w:tc>
         <w:tc>
           <w:tcPr>
-            <w:tcW w:w="2151" w:type="dxa"/>
+            <w:tcW w:w="1715" w:type="dxa"/>
             <w:hideMark/>
           </w:tcPr>
           <w:p>
@@ -15864,7 +15558,7 @@
       <w:tr>
         <w:tc>
           <w:tcPr>
-            <w:tcW w:w="993" w:type="dxa"/>
+            <w:tcW w:w="1233" w:type="dxa"/>
             <w:hideMark/>
           </w:tcPr>
           <w:p>
@@ -15883,7 +15577,7 @@
                 <w:b/>
                 <w:bCs/>
               </w:rPr>
-              <w:t>5.</w:t>
+              <w:t>3.</w:t>
             </w:r>
             <w:r>
               <w:rPr>
@@ -15896,7 +15590,7 @@
         </w:tc>
         <w:tc>
           <w:tcPr>
-            <w:tcW w:w="1134" w:type="dxa"/>
+            <w:tcW w:w="1233" w:type="dxa"/>
             <w:hideMark/>
           </w:tcPr>
           <w:p>
@@ -15910,7 +15604,7 @@
         </w:tc>
         <w:tc>
           <w:tcPr>
-            <w:tcW w:w="1276" w:type="dxa"/>
+            <w:tcW w:w="1234" w:type="dxa"/>
             <w:hideMark/>
           </w:tcPr>
           <w:p>
@@ -15924,7 +15618,7 @@
         </w:tc>
         <w:tc>
           <w:tcPr>
-            <w:tcW w:w="1134" w:type="dxa"/>
+            <w:tcW w:w="1233" w:type="dxa"/>
             <w:hideMark/>
           </w:tcPr>
           <w:p>
@@ -15938,7 +15632,7 @@
         </w:tc>
         <w:tc>
           <w:tcPr>
-            <w:tcW w:w="1299" w:type="dxa"/>
+            <w:tcW w:w="1233" w:type="dxa"/>
             <w:hideMark/>
           </w:tcPr>
           <w:p>
@@ -15952,7 +15646,17 @@
         </w:tc>
         <w:tc>
           <w:tcPr>
-            <w:tcW w:w="1788" w:type="dxa"/>
+            <w:tcW w:w="1234" w:type="dxa"/>
+          </w:tcPr>
+          <w:p>
+            <w:r>
+              <w:t>SUPERVISORE</w:t>
+            </w:r>
+          </w:p>
+        </w:tc>
+        <w:tc>
+          <w:tcPr>
+            <w:tcW w:w="1233" w:type="dxa"/>
             <w:hideMark/>
           </w:tcPr>
           <w:p>
@@ -15966,7 +15670,7 @@
         </w:tc>
         <w:tc>
           <w:tcPr>
-            <w:tcW w:w="2151" w:type="dxa"/>
+            <w:tcW w:w="1715" w:type="dxa"/>
             <w:hideMark/>
           </w:tcPr>
           <w:p>
@@ -15995,27 +15699,27 @@
       <w:tr>
         <w:tc>
           <w:tcPr>
-            <w:tcW w:w="993" w:type="dxa"/>
-          </w:tcPr>
-          <w:p>
-            <w:pPr>
-              <w:rPr>
-                <w:b/>
-                <w:bCs/>
-              </w:rPr>
-            </w:pPr>
-            <w:r>
-              <w:rPr>
-                <w:b/>
-                <w:bCs/>
-              </w:rPr>
-              <w:t>TF_5.8</w:t>
-            </w:r>
-          </w:p>
-        </w:tc>
-        <w:tc>
-          <w:tcPr>
-            <w:tcW w:w="1134" w:type="dxa"/>
+            <w:tcW w:w="1233" w:type="dxa"/>
+          </w:tcPr>
+          <w:p>
+            <w:pPr>
+              <w:rPr>
+                <w:b/>
+                <w:bCs/>
+              </w:rPr>
+            </w:pPr>
+            <w:r>
+              <w:rPr>
+                <w:b/>
+                <w:bCs/>
+              </w:rPr>
+              <w:t>TF_3.8</w:t>
+            </w:r>
+          </w:p>
+        </w:tc>
+        <w:tc>
+          <w:tcPr>
+            <w:tcW w:w="1233" w:type="dxa"/>
           </w:tcPr>
           <w:p>
             <w:r>
@@ -16025,7 +15729,7 @@
         </w:tc>
         <w:tc>
           <w:tcPr>
-            <w:tcW w:w="1276" w:type="dxa"/>
+            <w:tcW w:w="1234" w:type="dxa"/>
           </w:tcPr>
           <w:p>
             <w:r>
@@ -16035,7 +15739,7 @@
         </w:tc>
         <w:tc>
           <w:tcPr>
-            <w:tcW w:w="1134" w:type="dxa"/>
+            <w:tcW w:w="1233" w:type="dxa"/>
           </w:tcPr>
           <w:p>
             <w:r>
@@ -16045,7 +15749,7 @@
         </w:tc>
         <w:tc>
           <w:tcPr>
-            <w:tcW w:w="1299" w:type="dxa"/>
+            <w:tcW w:w="1233" w:type="dxa"/>
           </w:tcPr>
           <w:p>
             <w:r>
@@ -16055,7 +15759,17 @@
         </w:tc>
         <w:tc>
           <w:tcPr>
-            <w:tcW w:w="1788" w:type="dxa"/>
+            <w:tcW w:w="1234" w:type="dxa"/>
+          </w:tcPr>
+          <w:p>
+            <w:r>
+              <w:t>SUPERVISORE</w:t>
+            </w:r>
+          </w:p>
+        </w:tc>
+        <w:tc>
+          <w:tcPr>
+            <w:tcW w:w="1233" w:type="dxa"/>
           </w:tcPr>
           <w:p>
             <w:r>
@@ -16071,7 +15785,7 @@
         </w:tc>
         <w:tc>
           <w:tcPr>
-            <w:tcW w:w="2151" w:type="dxa"/>
+            <w:tcW w:w="1715" w:type="dxa"/>
           </w:tcPr>
           <w:p>
             <w:pPr>
@@ -16099,7 +15813,7 @@
       <w:tr>
         <w:tc>
           <w:tcPr>
-            <w:tcW w:w="993" w:type="dxa"/>
+            <w:tcW w:w="1233" w:type="dxa"/>
           </w:tcPr>
           <w:p>
             <w:pPr>
@@ -16114,13 +15828,13 @@
                 <w:bCs/>
               </w:rPr>
               <w:lastRenderedPageBreak/>
-              <w:t>TF_5.9</w:t>
-            </w:r>
-          </w:p>
-        </w:tc>
-        <w:tc>
-          <w:tcPr>
-            <w:tcW w:w="1134" w:type="dxa"/>
+              <w:t>TF_3.9</w:t>
+            </w:r>
+          </w:p>
+        </w:tc>
+        <w:tc>
+          <w:tcPr>
+            <w:tcW w:w="1233" w:type="dxa"/>
           </w:tcPr>
           <w:p>
             <w:r>
@@ -16130,7 +15844,7 @@
         </w:tc>
         <w:tc>
           <w:tcPr>
-            <w:tcW w:w="1276" w:type="dxa"/>
+            <w:tcW w:w="1234" w:type="dxa"/>
           </w:tcPr>
           <w:p>
             <w:r>
@@ -16140,7 +15854,7 @@
         </w:tc>
         <w:tc>
           <w:tcPr>
-            <w:tcW w:w="1134" w:type="dxa"/>
+            <w:tcW w:w="1233" w:type="dxa"/>
           </w:tcPr>
           <w:p>
             <w:r>
@@ -16150,7 +15864,7 @@
         </w:tc>
         <w:tc>
           <w:tcPr>
-            <w:tcW w:w="1299" w:type="dxa"/>
+            <w:tcW w:w="1233" w:type="dxa"/>
           </w:tcPr>
           <w:p>
             <w:r>
@@ -16160,7 +15874,17 @@
         </w:tc>
         <w:tc>
           <w:tcPr>
-            <w:tcW w:w="1788" w:type="dxa"/>
+            <w:tcW w:w="1234" w:type="dxa"/>
+          </w:tcPr>
+          <w:p>
+            <w:r>
+              <w:t>SUPERVISORE</w:t>
+            </w:r>
+          </w:p>
+        </w:tc>
+        <w:tc>
+          <w:tcPr>
+            <w:tcW w:w="1233" w:type="dxa"/>
           </w:tcPr>
           <w:p>
             <w:r>
@@ -16176,7 +15900,7 @@
         </w:tc>
         <w:tc>
           <w:tcPr>
-            <w:tcW w:w="2151" w:type="dxa"/>
+            <w:tcW w:w="1715" w:type="dxa"/>
           </w:tcPr>
           <w:p>
             <w:r>
@@ -16188,6 +15912,231 @@
             </w:r>
             <w:r>
               <w:t>“Campo ‘cognome’ obbligatorio”</w:t>
+            </w:r>
+          </w:p>
+        </w:tc>
+      </w:tr>
+      <w:tr>
+        <w:tc>
+          <w:tcPr>
+            <w:tcW w:w="1233" w:type="dxa"/>
+          </w:tcPr>
+          <w:p>
+            <w:pPr>
+              <w:rPr>
+                <w:b/>
+                <w:bCs/>
+              </w:rPr>
+            </w:pPr>
+            <w:r>
+              <w:rPr>
+                <w:b/>
+                <w:bCs/>
+              </w:rPr>
+              <w:t>TF_3.10</w:t>
+            </w:r>
+          </w:p>
+        </w:tc>
+        <w:tc>
+          <w:tcPr>
+            <w:tcW w:w="1233" w:type="dxa"/>
+          </w:tcPr>
+          <w:p>
+            <w:r>
+              <w:t>Valido</w:t>
+            </w:r>
+          </w:p>
+        </w:tc>
+        <w:tc>
+          <w:tcPr>
+            <w:tcW w:w="1234" w:type="dxa"/>
+          </w:tcPr>
+          <w:p>
+            <w:r>
+              <w:t>Formato non valido</w:t>
+            </w:r>
+          </w:p>
+        </w:tc>
+        <w:tc>
+          <w:tcPr>
+            <w:tcW w:w="1233" w:type="dxa"/>
+          </w:tcPr>
+          <w:p>
+            <w:r>
+              <w:t>Valido</w:t>
+            </w:r>
+          </w:p>
+        </w:tc>
+        <w:tc>
+          <w:tcPr>
+            <w:tcW w:w="1233" w:type="dxa"/>
+          </w:tcPr>
+          <w:p>
+            <w:r>
+              <w:t>Valida</w:t>
+            </w:r>
+          </w:p>
+        </w:tc>
+        <w:tc>
+          <w:tcPr>
+            <w:tcW w:w="1234" w:type="dxa"/>
+          </w:tcPr>
+          <w:p>
+            <w:r>
+              <w:t>SUPERVISORE</w:t>
+            </w:r>
+          </w:p>
+        </w:tc>
+        <w:tc>
+          <w:tcPr>
+            <w:tcW w:w="1233" w:type="dxa"/>
+          </w:tcPr>
+          <w:p>
+            <w:r>
+              <w:t>G</w:t>
+            </w:r>
+            <w:r>
+              <w:t>enerat</w:t>
+            </w:r>
+            <w:r>
+              <w:t>a</w:t>
+            </w:r>
+          </w:p>
+        </w:tc>
+        <w:tc>
+          <w:tcPr>
+            <w:tcW w:w="1715" w:type="dxa"/>
+          </w:tcPr>
+          <w:p>
+            <w:pPr>
+              <w:rPr>
+                <w:b/>
+                <w:bCs/>
+              </w:rPr>
+            </w:pPr>
+            <w:r>
+              <w:rPr>
+                <w:b/>
+                <w:bCs/>
+              </w:rPr>
+              <w:t>Error: “</w:t>
+            </w:r>
+            <w:r>
+              <w:t>Il cognome è troppo lungo (max 50).</w:t>
+            </w:r>
+            <w:r>
+              <w:t>”</w:t>
+            </w:r>
+          </w:p>
+        </w:tc>
+      </w:tr>
+      <w:tr>
+        <w:tc>
+          <w:tcPr>
+            <w:tcW w:w="1233" w:type="dxa"/>
+          </w:tcPr>
+          <w:p>
+            <w:pPr>
+              <w:rPr>
+                <w:b/>
+                <w:bCs/>
+              </w:rPr>
+            </w:pPr>
+            <w:r>
+              <w:rPr>
+                <w:b/>
+                <w:bCs/>
+              </w:rPr>
+              <w:t>TF_3.11</w:t>
+            </w:r>
+          </w:p>
+        </w:tc>
+        <w:tc>
+          <w:tcPr>
+            <w:tcW w:w="1233" w:type="dxa"/>
+          </w:tcPr>
+          <w:p>
+            <w:r>
+              <w:t>Valido</w:t>
+            </w:r>
+          </w:p>
+        </w:tc>
+        <w:tc>
+          <w:tcPr>
+            <w:tcW w:w="1234" w:type="dxa"/>
+          </w:tcPr>
+          <w:p>
+            <w:r>
+              <w:t>Valido</w:t>
+            </w:r>
+          </w:p>
+        </w:tc>
+        <w:tc>
+          <w:tcPr>
+            <w:tcW w:w="1233" w:type="dxa"/>
+          </w:tcPr>
+          <w:p>
+            <w:r>
+              <w:t>Valido</w:t>
+            </w:r>
+          </w:p>
+        </w:tc>
+        <w:tc>
+          <w:tcPr>
+            <w:tcW w:w="1233" w:type="dxa"/>
+          </w:tcPr>
+          <w:p>
+            <w:r>
+              <w:t>Valida</w:t>
+            </w:r>
+          </w:p>
+        </w:tc>
+        <w:tc>
+          <w:tcPr>
+            <w:tcW w:w="1234" w:type="dxa"/>
+          </w:tcPr>
+          <w:p>
+            <w:r>
+              <w:t>Dipendente(Supervisore non selezionato)</w:t>
+            </w:r>
+          </w:p>
+        </w:tc>
+        <w:tc>
+          <w:tcPr>
+            <w:tcW w:w="1233" w:type="dxa"/>
+          </w:tcPr>
+          <w:p>
+            <w:r>
+              <w:t>Generata</w:t>
+            </w:r>
+          </w:p>
+        </w:tc>
+        <w:tc>
+          <w:tcPr>
+            <w:tcW w:w="1715" w:type="dxa"/>
+          </w:tcPr>
+          <w:p>
+            <w:pPr>
+              <w:rPr>
+                <w:b/>
+                <w:bCs/>
+              </w:rPr>
+            </w:pPr>
+            <w:r>
+              <w:rPr>
+                <w:b/>
+                <w:bCs/>
+              </w:rPr>
+              <w:t xml:space="preserve">Error: </w:t>
+            </w:r>
+            <w:r>
+              <w:t>“</w:t>
+            </w:r>
+            <w:r>
+              <w:t>Seleziona un supervisore.</w:t>
+            </w:r>
+            <w:r>
+              <w:t>”</w:t>
             </w:r>
           </w:p>
         </w:tc>
@@ -20481,7 +20430,6 @@
   <w:style w:type="character" w:default="1" w:styleId="Carpredefinitoparagrafo">
     <w:name w:val="Default Paragraph Font"/>
     <w:uiPriority w:val="1"/>
-    <w:semiHidden/>
     <w:unhideWhenUsed/>
   </w:style>
   <w:style w:type="table" w:default="1" w:styleId="Tabellanormale">

</xml_diff>